<commit_message>
Afstudeerproject: Testing documenten (alleen fotos nog toevoegen)
</commit_message>
<xml_diff>
--- a/Afstudeerproject/Documentatie/Dossier Guillaume de Oliveira Andrezo.docx
+++ b/Afstudeerproject/Documentatie/Dossier Guillaume de Oliveira Andrezo.docx
@@ -10,9 +10,13 @@
           <w:docPartUnique/>
         </w:docPartObj>
       </w:sdtPr>
+      <w:sdtEndPr/>
       <w:sdtContent>
         <w:p>
           <w:r>
+            <w:rPr>
+              <w:noProof/>
+            </w:rPr>
             <mc:AlternateContent>
               <mc:Choice Requires="wpg">
                 <w:drawing>
@@ -625,6 +629,7 @@
                                     <w:dataBinding w:prefixMappings="xmlns:ns0='http://purl.org/dc/elements/1.1/' xmlns:ns1='http://schemas.openxmlformats.org/package/2006/metadata/core-properties' " w:xpath="/ns1:coreProperties[1]/ns0:title[1]" w:storeItemID="{6C3C8BC8-F283-45AE-878A-BAB7291924A1}"/>
                                     <w:text/>
                                   </w:sdtPr>
+                                  <w:sdtEndPr/>
                                   <w:sdtContent>
                                     <w:p>
                                       <w:pPr>
@@ -677,6 +682,7 @@
                                     <w:dataBinding w:prefixMappings="xmlns:ns0='http://purl.org/dc/elements/1.1/' xmlns:ns1='http://schemas.openxmlformats.org/package/2006/metadata/core-properties' " w:xpath="/ns1:coreProperties[1]/ns0:subject[1]" w:storeItemID="{6C3C8BC8-F283-45AE-878A-BAB7291924A1}"/>
                                     <w:text/>
                                   </w:sdtPr>
+                                  <w:sdtEndPr/>
                                   <w:sdtContent>
                                     <w:p>
                                       <w:pPr>
@@ -724,7 +730,7 @@
               </mc:Choice>
               <mc:Fallback>
                 <w:pict>
-                  <v:group w14:anchorId="3164992C" id="Group 14" o:spid="_x0000_s1026" style="position:absolute;left:0;text-align:left;margin-left:0;margin-top:0;width:540pt;height:10in;z-index:-251657216;mso-width-percent:882;mso-height-percent:909;mso-position-horizontal:center;mso-position-horizontal-relative:page;mso-position-vertical:center;mso-position-vertical-relative:page;mso-width-percent:882;mso-height-percent:909" coordsize="68580,91440" o:gfxdata="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">
+                  <v:group w14:anchorId="3164992C" id="Group 14" o:spid="_x0000_s1026" style="position:absolute;margin-left:0;margin-top:0;width:540pt;height:10in;z-index:-251657216;mso-width-percent:882;mso-height-percent:909;mso-position-horizontal:center;mso-position-horizontal-relative:page;mso-position-vertical:center;mso-position-vertical-relative:page;mso-width-percent:882;mso-height-percent:909" coordsize="68580,91440" o:gfxdata="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">
                     <v:group id="Group 49" o:spid="_x0000_s1027" style="position:absolute;width:68580;height:91440" coordsize="68580,91440" o:gfxdata="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">
                       <v:rect id="Rectangle 54" o:spid="_x0000_s1028" style="position:absolute;width:68580;height:91440;visibility:visible;mso-wrap-style:square;v-text-anchor:top" o:gfxdata="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" fillcolor="#15669d [3122]" stroked="f" strokeweight="1.25pt">
                         <v:fill color2="#125684 [2882]" rotate="t" angle="348" colors="0 #64d4ef;6554f #64d4ef" focus="100%" type="gradient"/>
@@ -786,6 +792,7 @@
                               <w:dataBinding w:prefixMappings="xmlns:ns0='http://purl.org/dc/elements/1.1/' xmlns:ns1='http://schemas.openxmlformats.org/package/2006/metadata/core-properties' " w:xpath="/ns1:coreProperties[1]/ns0:title[1]" w:storeItemID="{6C3C8BC8-F283-45AE-878A-BAB7291924A1}"/>
                               <w:text/>
                             </w:sdtPr>
+                            <w:sdtEndPr/>
                             <w:sdtContent>
                               <w:p>
                                 <w:pPr>
@@ -838,6 +845,7 @@
                               <w:dataBinding w:prefixMappings="xmlns:ns0='http://purl.org/dc/elements/1.1/' xmlns:ns1='http://schemas.openxmlformats.org/package/2006/metadata/core-properties' " w:xpath="/ns1:coreProperties[1]/ns0:subject[1]" w:storeItemID="{6C3C8BC8-F283-45AE-878A-BAB7291924A1}"/>
                               <w:text/>
                             </w:sdtPr>
+                            <w:sdtEndPr/>
                             <w:sdtContent>
                               <w:p>
                                 <w:pPr>
@@ -883,8 +891,7 @@
       <w:sdtPr>
         <w:rPr>
           <w:rFonts w:asciiTheme="minorHAnsi" w:eastAsiaTheme="minorEastAsia" w:hAnsiTheme="minorHAnsi" w:cstheme="minorBidi"/>
-          <w:caps w:val="0"/>
-          <w:spacing w:val="0"/>
+          <w:caps/>
           <w:sz w:val="21"/>
           <w:szCs w:val="21"/>
         </w:rPr>
@@ -898,6 +905,10 @@
         <w:rPr>
           <w:b/>
           <w:bCs/>
+          <w:caps w:val="0"/>
+          <w:color w:val="auto"/>
+          <w:sz w:val="20"/>
+          <w:szCs w:val="20"/>
         </w:rPr>
       </w:sdtEndPr>
       <w:sdtContent>
@@ -2659,6 +2670,10 @@
     </w:sdt>
     <w:p/>
     <w:p/>
+    <w:p/>
+    <w:p/>
+    <w:p/>
+    <w:p/>
     <w:p>
       <w:pPr>
         <w:pStyle w:val="Heading1"/>
@@ -2822,6 +2837,9 @@
         </w:numPr>
       </w:pPr>
       <w:r>
+        <w:rPr>
+          <w:noProof/>
+        </w:rPr>
         <mc:AlternateContent>
           <mc:Choice Requires="wps">
             <w:drawing>
@@ -2954,6 +2972,9 @@
         <w:pStyle w:val="ListParagraph"/>
       </w:pPr>
       <w:r>
+        <w:rPr>
+          <w:noProof/>
+        </w:rPr>
         <w:drawing>
           <wp:anchor distT="0" distB="0" distL="114300" distR="114300" simplePos="0" relativeHeight="251660288" behindDoc="0" locked="0" layoutInCell="1" allowOverlap="1" wp14:anchorId="630D90AB" wp14:editId="2E527339">
             <wp:simplePos x="0" y="0"/>
@@ -3045,6 +3066,9 @@
       </w:pPr>
       <w:bookmarkStart w:id="4" w:name="_Toc199317592"/>
       <w:r>
+        <w:rPr>
+          <w:noProof/>
+        </w:rPr>
         <w:lastRenderedPageBreak/>
         <w:drawing>
           <wp:anchor distT="0" distB="0" distL="114300" distR="114300" simplePos="0" relativeHeight="251661312" behindDoc="0" locked="0" layoutInCell="1" allowOverlap="1" wp14:anchorId="75607135" wp14:editId="26110894">
@@ -3221,21 +3245,26 @@
       </w:r>
     </w:p>
     <w:p/>
+    <w:p/>
+    <w:p/>
     <w:p>
       <w:r>
+        <w:rPr>
+          <w:noProof/>
+        </w:rPr>
         <mc:AlternateContent>
           <mc:Choice Requires="wps">
             <w:drawing>
-              <wp:anchor distT="0" distB="0" distL="114300" distR="114300" simplePos="0" relativeHeight="251718656" behindDoc="0" locked="0" layoutInCell="1" allowOverlap="1" wp14:anchorId="6E3EAEBB" wp14:editId="469D3240">
+              <wp:anchor distT="0" distB="0" distL="114300" distR="114300" simplePos="0" relativeHeight="251718656" behindDoc="0" locked="0" layoutInCell="1" allowOverlap="1" wp14:anchorId="6E3EAEBB" wp14:editId="74EC85FA">
                 <wp:simplePos x="0" y="0"/>
                 <wp:positionH relativeFrom="margin">
-                  <wp:posOffset>3223895</wp:posOffset>
+                  <wp:align>right</wp:align>
                 </wp:positionH>
                 <wp:positionV relativeFrom="paragraph">
-                  <wp:posOffset>233680</wp:posOffset>
+                  <wp:posOffset>62230</wp:posOffset>
                 </wp:positionV>
-                <wp:extent cx="2400935" cy="167640"/>
-                <wp:effectExtent l="0" t="0" r="0" b="3810"/>
+                <wp:extent cx="2581275" cy="342900"/>
+                <wp:effectExtent l="0" t="0" r="9525" b="0"/>
                 <wp:wrapSquare wrapText="bothSides"/>
                 <wp:docPr id="2109670985" name="Text Box 1"/>
                 <wp:cNvGraphicFramePr/>
@@ -3246,7 +3275,7 @@
                       <wps:spPr>
                         <a:xfrm>
                           <a:off x="0" y="0"/>
-                          <a:ext cx="2400935" cy="167640"/>
+                          <a:ext cx="2581275" cy="342900"/>
                         </a:xfrm>
                         <a:prstGeom prst="rect">
                           <a:avLst/>
@@ -3302,7 +3331,7 @@
           </mc:Choice>
           <mc:Fallback>
             <w:pict>
-              <v:shape w14:anchorId="6E3EAEBB" id="_x0000_s1037" type="#_x0000_t202" style="position:absolute;left:0;text-align:left;margin-left:253.85pt;margin-top:18.4pt;width:189.05pt;height:13.2pt;z-index:251718656;visibility:visible;mso-wrap-style:square;mso-width-percent:0;mso-height-percent:0;mso-wrap-distance-left:9pt;mso-wrap-distance-top:0;mso-wrap-distance-right:9pt;mso-wrap-distance-bottom:0;mso-position-horizontal:absolute;mso-position-horizontal-relative:margin;mso-position-vertical:absolute;mso-position-vertical-relative:text;mso-width-percent:0;mso-height-percent:0;mso-width-relative:margin;mso-height-relative:margin;v-text-anchor:top" o:gfxdata="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" stroked="f">
+              <v:shape w14:anchorId="6E3EAEBB" id="_x0000_s1037" type="#_x0000_t202" style="position:absolute;margin-left:152.05pt;margin-top:4.9pt;width:203.25pt;height:27pt;z-index:251718656;visibility:visible;mso-wrap-style:square;mso-width-percent:0;mso-height-percent:0;mso-wrap-distance-left:9pt;mso-wrap-distance-top:0;mso-wrap-distance-right:9pt;mso-wrap-distance-bottom:0;mso-position-horizontal:right;mso-position-horizontal-relative:margin;mso-position-vertical:absolute;mso-position-vertical-relative:text;mso-width-percent:0;mso-height-percent:0;mso-width-relative:margin;mso-height-relative:margin;v-text-anchor:top" o:gfxdata="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" stroked="f">
                 <v:textbox inset="0,0,0,0">
                   <w:txbxContent>
                     <w:p>
@@ -3382,16 +3411,19 @@
         </w:numPr>
       </w:pPr>
       <w:r>
+        <w:rPr>
+          <w:noProof/>
+        </w:rPr>
         <mc:AlternateContent>
           <mc:Choice Requires="wps">
             <w:drawing>
-              <wp:anchor distT="0" distB="0" distL="114300" distR="114300" simplePos="0" relativeHeight="251726848" behindDoc="0" locked="0" layoutInCell="1" allowOverlap="1" wp14:anchorId="1852167C" wp14:editId="3F371CD4">
+              <wp:anchor distT="0" distB="0" distL="114300" distR="114300" simplePos="0" relativeHeight="251726848" behindDoc="0" locked="0" layoutInCell="1" allowOverlap="1" wp14:anchorId="1852167C" wp14:editId="36DFD994">
                 <wp:simplePos x="0" y="0"/>
                 <wp:positionH relativeFrom="column">
-                  <wp:posOffset>2941320</wp:posOffset>
+                  <wp:posOffset>3065145</wp:posOffset>
                 </wp:positionH>
                 <wp:positionV relativeFrom="paragraph">
-                  <wp:posOffset>2407920</wp:posOffset>
+                  <wp:posOffset>2388870</wp:posOffset>
                 </wp:positionV>
                 <wp:extent cx="2805430" cy="635"/>
                 <wp:effectExtent l="0" t="0" r="0" b="0"/>
@@ -3458,7 +3490,7 @@
           </mc:Choice>
           <mc:Fallback>
             <w:pict>
-              <v:shape w14:anchorId="1852167C" id="_x0000_s1038" type="#_x0000_t202" style="position:absolute;left:0;text-align:left;margin-left:231.6pt;margin-top:189.6pt;width:220.9pt;height:.05pt;z-index:251726848;visibility:visible;mso-wrap-style:square;mso-wrap-distance-left:9pt;mso-wrap-distance-top:0;mso-wrap-distance-right:9pt;mso-wrap-distance-bottom:0;mso-position-horizontal:absolute;mso-position-horizontal-relative:text;mso-position-vertical:absolute;mso-position-vertical-relative:text;v-text-anchor:top" o:gfxdata="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" stroked="f">
+              <v:shape w14:anchorId="1852167C" id="_x0000_s1038" type="#_x0000_t202" style="position:absolute;left:0;text-align:left;margin-left:241.35pt;margin-top:188.1pt;width:220.9pt;height:.05pt;z-index:251726848;visibility:visible;mso-wrap-style:square;mso-wrap-distance-left:9pt;mso-wrap-distance-top:0;mso-wrap-distance-right:9pt;mso-wrap-distance-bottom:0;mso-position-horizontal:absolute;mso-position-horizontal-relative:text;mso-position-vertical:absolute;mso-position-vertical-relative:text;v-text-anchor:top" o:gfxdata="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" stroked="f">
                 <v:textbox style="mso-fit-shape-to-text:t" inset="0,0,0,0">
                   <w:txbxContent>
                     <w:p>
@@ -3493,6 +3525,9 @@
         </mc:AlternateContent>
       </w:r>
       <w:r>
+        <w:rPr>
+          <w:noProof/>
+        </w:rPr>
         <mc:AlternateContent>
           <mc:Choice Requires="wps">
             <w:drawing>
@@ -3613,6 +3648,9 @@
         </mc:AlternateContent>
       </w:r>
       <w:r>
+        <w:rPr>
+          <w:noProof/>
+        </w:rPr>
         <w:drawing>
           <wp:anchor distT="0" distB="0" distL="114300" distR="114300" simplePos="0" relativeHeight="251720704" behindDoc="0" locked="0" layoutInCell="1" allowOverlap="1" wp14:anchorId="0E804381" wp14:editId="2E9B6F34">
             <wp:simplePos x="0" y="0"/>
@@ -3703,6 +3741,9 @@
         </w:drawing>
       </w:r>
       <w:r>
+        <w:rPr>
+          <w:noProof/>
+        </w:rPr>
         <w:drawing>
           <wp:anchor distT="0" distB="0" distL="114300" distR="114300" simplePos="0" relativeHeight="251719680" behindDoc="0" locked="0" layoutInCell="1" allowOverlap="1" wp14:anchorId="11768079" wp14:editId="0164C039">
             <wp:simplePos x="0" y="0"/>
@@ -3807,17 +3848,20 @@
       </w:pPr>
       <w:bookmarkStart w:id="6" w:name="_Toc199317594"/>
       <w:r>
+        <w:rPr>
+          <w:noProof/>
+        </w:rPr>
         <w:drawing>
-          <wp:anchor distT="0" distB="0" distL="114300" distR="114300" simplePos="0" relativeHeight="251662336" behindDoc="0" locked="0" layoutInCell="1" allowOverlap="1" wp14:anchorId="380841A6" wp14:editId="67748D6E">
+          <wp:anchor distT="0" distB="0" distL="114300" distR="114300" simplePos="0" relativeHeight="251662336" behindDoc="0" locked="0" layoutInCell="1" allowOverlap="1" wp14:anchorId="380841A6" wp14:editId="0EEC86C8">
             <wp:simplePos x="0" y="0"/>
             <wp:positionH relativeFrom="margin">
-              <wp:align>left</wp:align>
+              <wp:posOffset>114300</wp:posOffset>
             </wp:positionH>
             <wp:positionV relativeFrom="paragraph">
               <wp:posOffset>8255</wp:posOffset>
             </wp:positionV>
-            <wp:extent cx="2512060" cy="1676400"/>
-            <wp:effectExtent l="114300" t="114300" r="154940" b="152400"/>
+            <wp:extent cx="2305050" cy="1675765"/>
+            <wp:effectExtent l="133350" t="114300" r="133350" b="153035"/>
             <wp:wrapSquare wrapText="bothSides"/>
             <wp:docPr id="693830572" name="Picture 4" descr="A small black circuit board with white and green buttons&#10;&#10;AI-generated content may be incorrect."/>
             <wp:cNvGraphicFramePr>
@@ -3848,7 +3892,7 @@
                   <pic:spPr bwMode="auto">
                     <a:xfrm>
                       <a:off x="0" y="0"/>
-                      <a:ext cx="2519735" cy="1681337"/>
+                      <a:ext cx="2305050" cy="1675765"/>
                     </a:xfrm>
                     <a:prstGeom prst="rect">
                       <a:avLst/>
@@ -3991,21 +4035,26 @@
         <w:t>: 300W</w:t>
       </w:r>
     </w:p>
+    <w:p/>
+    <w:p/>
     <w:p>
       <w:r>
+        <w:rPr>
+          <w:noProof/>
+        </w:rPr>
         <mc:AlternateContent>
           <mc:Choice Requires="wps">
             <w:drawing>
-              <wp:anchor distT="0" distB="0" distL="114300" distR="114300" simplePos="0" relativeHeight="251722752" behindDoc="0" locked="0" layoutInCell="1" allowOverlap="1" wp14:anchorId="54206D19" wp14:editId="63CCB5EA">
+              <wp:anchor distT="0" distB="0" distL="114300" distR="114300" simplePos="0" relativeHeight="251722752" behindDoc="0" locked="0" layoutInCell="1" allowOverlap="1" wp14:anchorId="54206D19" wp14:editId="27AE663C">
                 <wp:simplePos x="0" y="0"/>
                 <wp:positionH relativeFrom="column">
-                  <wp:posOffset>106680</wp:posOffset>
+                  <wp:posOffset>47625</wp:posOffset>
                 </wp:positionH>
                 <wp:positionV relativeFrom="paragraph">
-                  <wp:posOffset>99060</wp:posOffset>
+                  <wp:posOffset>117475</wp:posOffset>
                 </wp:positionV>
-                <wp:extent cx="2512060" cy="635"/>
-                <wp:effectExtent l="0" t="0" r="2540" b="2540"/>
+                <wp:extent cx="2686050" cy="635"/>
+                <wp:effectExtent l="0" t="0" r="0" b="0"/>
                 <wp:wrapSquare wrapText="bothSides"/>
                 <wp:docPr id="230802770" name="Text Box 1"/>
                 <wp:cNvGraphicFramePr/>
@@ -4016,7 +4065,7 @@
                       <wps:spPr>
                         <a:xfrm>
                           <a:off x="0" y="0"/>
-                          <a:ext cx="2512060" cy="635"/>
+                          <a:ext cx="2686050" cy="635"/>
                         </a:xfrm>
                         <a:prstGeom prst="rect">
                           <a:avLst/>
@@ -4060,12 +4109,15 @@
                     </wps:wsp>
                   </a:graphicData>
                 </a:graphic>
+                <wp14:sizeRelH relativeFrom="margin">
+                  <wp14:pctWidth>0</wp14:pctWidth>
+                </wp14:sizeRelH>
               </wp:anchor>
             </w:drawing>
           </mc:Choice>
           <mc:Fallback>
             <w:pict>
-              <v:shape w14:anchorId="54206D19" id="_x0000_s1040" type="#_x0000_t202" style="position:absolute;left:0;text-align:left;margin-left:8.4pt;margin-top:7.8pt;width:197.8pt;height:.05pt;z-index:251722752;visibility:visible;mso-wrap-style:square;mso-wrap-distance-left:9pt;mso-wrap-distance-top:0;mso-wrap-distance-right:9pt;mso-wrap-distance-bottom:0;mso-position-horizontal:absolute;mso-position-horizontal-relative:text;mso-position-vertical:absolute;mso-position-vertical-relative:text;v-text-anchor:top" o:gfxdata="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" stroked="f">
+              <v:shape w14:anchorId="54206D19" id="_x0000_s1040" type="#_x0000_t202" style="position:absolute;margin-left:3.75pt;margin-top:9.25pt;width:211.5pt;height:.05pt;z-index:251722752;visibility:visible;mso-wrap-style:square;mso-width-percent:0;mso-wrap-distance-left:9pt;mso-wrap-distance-top:0;mso-wrap-distance-right:9pt;mso-wrap-distance-bottom:0;mso-position-horizontal:absolute;mso-position-horizontal-relative:text;mso-position-vertical:absolute;mso-position-vertical-relative:text;mso-width-percent:0;mso-width-relative:margin;v-text-anchor:top" o:gfxdata="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" stroked="f">
                 <v:textbox style="mso-fit-shape-to-text:t" inset="0,0,0,0">
                   <w:txbxContent>
                     <w:p>
@@ -4096,35 +4148,24 @@
         </mc:AlternateContent>
       </w:r>
     </w:p>
-    <w:p/>
-    <w:p/>
     <w:p>
       <w:pPr>
         <w:pStyle w:val="Heading3"/>
       </w:pPr>
       <w:bookmarkStart w:id="7" w:name="_Toc199317595"/>
       <w:r>
+        <w:rPr>
+          <w:noProof/>
+        </w:rPr>
         <w:lastRenderedPageBreak/>
-        <w:t>Gravity: Linear</w:t>
-      </w:r>
-      <w:r>
-        <w:t xml:space="preserve">/Analog </w:t>
-      </w:r>
-      <w:r>
-        <w:t>Hall Sensor</w:t>
-      </w:r>
-      <w:bookmarkEnd w:id="7"/>
-    </w:p>
-    <w:p>
-      <w:r>
         <w:drawing>
-          <wp:anchor distT="0" distB="0" distL="114300" distR="114300" simplePos="0" relativeHeight="251663360" behindDoc="0" locked="0" layoutInCell="1" allowOverlap="1" wp14:anchorId="080EEF8F" wp14:editId="437E2F59">
+          <wp:anchor distT="0" distB="0" distL="114300" distR="114300" simplePos="0" relativeHeight="251663360" behindDoc="0" locked="0" layoutInCell="1" allowOverlap="1" wp14:anchorId="080EEF8F" wp14:editId="5F2203AA">
             <wp:simplePos x="0" y="0"/>
             <wp:positionH relativeFrom="margin">
-              <wp:posOffset>3116580</wp:posOffset>
+              <wp:align>right</wp:align>
             </wp:positionH>
             <wp:positionV relativeFrom="paragraph">
-              <wp:posOffset>208915</wp:posOffset>
+              <wp:posOffset>119380</wp:posOffset>
             </wp:positionV>
             <wp:extent cx="2192020" cy="1838960"/>
             <wp:effectExtent l="133350" t="114300" r="132080" b="161290"/>
@@ -4207,7 +4248,40 @@
         </w:drawing>
       </w:r>
       <w:r>
-        <w:t>Detecteert magneet nabijheid om de deuropening te registreren.</w:t>
+        <w:t>Gravity: Linear</w:t>
+      </w:r>
+      <w:r>
+        <w:t xml:space="preserve">/Analog </w:t>
+      </w:r>
+      <w:r>
+        <w:t>Hall Sensor</w:t>
+      </w:r>
+      <w:bookmarkEnd w:id="7"/>
+    </w:p>
+    <w:p>
+      <w:proofErr w:type="spellStart"/>
+      <w:r>
+        <w:t>Detecteert</w:t>
+      </w:r>
+      <w:proofErr w:type="spellEnd"/>
+      <w:r>
+        <w:t xml:space="preserve"> </w:t>
+      </w:r>
+      <w:proofErr w:type="spellStart"/>
+      <w:r>
+        <w:t>magneet</w:t>
+      </w:r>
+      <w:proofErr w:type="spellEnd"/>
+      <w:r>
+        <w:t xml:space="preserve"> </w:t>
+      </w:r>
+      <w:proofErr w:type="spellStart"/>
+      <w:r>
+        <w:t>nabijheid</w:t>
+      </w:r>
+      <w:proofErr w:type="spellEnd"/>
+      <w:r>
+        <w:t xml:space="preserve"> om de deuropening te registreren.</w:t>
       </w:r>
     </w:p>
     <w:p>
@@ -4306,21 +4380,25 @@
     </w:p>
     <w:p/>
     <w:p/>
+    <w:p/>
     <w:p>
       <w:r>
+        <w:rPr>
+          <w:noProof/>
+        </w:rPr>
         <mc:AlternateContent>
           <mc:Choice Requires="wps">
             <w:drawing>
-              <wp:anchor distT="0" distB="0" distL="114300" distR="114300" simplePos="0" relativeHeight="251728896" behindDoc="0" locked="0" layoutInCell="1" allowOverlap="1" wp14:anchorId="0EAFFB9E" wp14:editId="59244C06">
+              <wp:anchor distT="0" distB="0" distL="114300" distR="114300" simplePos="0" relativeHeight="251728896" behindDoc="0" locked="0" layoutInCell="1" allowOverlap="1" wp14:anchorId="0EAFFB9E" wp14:editId="436EDBA1">
                 <wp:simplePos x="0" y="0"/>
-                <wp:positionH relativeFrom="column">
-                  <wp:posOffset>3075940</wp:posOffset>
+                <wp:positionH relativeFrom="margin">
+                  <wp:align>right</wp:align>
                 </wp:positionH>
                 <wp:positionV relativeFrom="paragraph">
-                  <wp:posOffset>50165</wp:posOffset>
+                  <wp:posOffset>5080</wp:posOffset>
                 </wp:positionV>
-                <wp:extent cx="2451100" cy="635"/>
-                <wp:effectExtent l="0" t="0" r="0" b="0"/>
+                <wp:extent cx="2678430" cy="635"/>
+                <wp:effectExtent l="0" t="0" r="7620" b="0"/>
                 <wp:wrapSquare wrapText="bothSides"/>
                 <wp:docPr id="326755566" name="Text Box 1"/>
                 <wp:cNvGraphicFramePr/>
@@ -4331,7 +4409,7 @@
                       <wps:spPr>
                         <a:xfrm>
                           <a:off x="0" y="0"/>
-                          <a:ext cx="2451100" cy="635"/>
+                          <a:ext cx="2678430" cy="635"/>
                         </a:xfrm>
                         <a:prstGeom prst="rect">
                           <a:avLst/>
@@ -4376,12 +4454,15 @@
                     </wps:wsp>
                   </a:graphicData>
                 </a:graphic>
+                <wp14:sizeRelH relativeFrom="margin">
+                  <wp14:pctWidth>0</wp14:pctWidth>
+                </wp14:sizeRelH>
               </wp:anchor>
             </w:drawing>
           </mc:Choice>
           <mc:Fallback>
             <w:pict>
-              <v:shape w14:anchorId="0EAFFB9E" id="_x0000_s1041" type="#_x0000_t202" style="position:absolute;left:0;text-align:left;margin-left:242.2pt;margin-top:3.95pt;width:193pt;height:.05pt;z-index:251728896;visibility:visible;mso-wrap-style:square;mso-wrap-distance-left:9pt;mso-wrap-distance-top:0;mso-wrap-distance-right:9pt;mso-wrap-distance-bottom:0;mso-position-horizontal:absolute;mso-position-horizontal-relative:text;mso-position-vertical:absolute;mso-position-vertical-relative:text;v-text-anchor:top" o:gfxdata="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" stroked="f">
+              <v:shape w14:anchorId="0EAFFB9E" id="_x0000_s1041" type="#_x0000_t202" style="position:absolute;margin-left:159.7pt;margin-top:.4pt;width:210.9pt;height:.05pt;z-index:251728896;visibility:visible;mso-wrap-style:square;mso-width-percent:0;mso-wrap-distance-left:9pt;mso-wrap-distance-top:0;mso-wrap-distance-right:9pt;mso-wrap-distance-bottom:0;mso-position-horizontal:right;mso-position-horizontal-relative:margin;mso-position-vertical:absolute;mso-position-vertical-relative:text;mso-width-percent:0;mso-width-relative:margin;v-text-anchor:top" o:gfxdata="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" stroked="f">
                 <v:textbox style="mso-fit-shape-to-text:t" inset="0,0,0,0">
                   <w:txbxContent>
                     <w:p>
@@ -4406,7 +4487,7 @@
                     </w:p>
                   </w:txbxContent>
                 </v:textbox>
-                <w10:wrap type="square"/>
+                <w10:wrap type="square" anchorx="margin"/>
               </v:shape>
             </w:pict>
           </mc:Fallback>
@@ -4437,6 +4518,9 @@
         </w:numPr>
       </w:pPr>
       <w:r>
+        <w:rPr>
+          <w:noProof/>
+        </w:rPr>
         <w:drawing>
           <wp:anchor distT="0" distB="0" distL="114300" distR="114300" simplePos="0" relativeHeight="251664384" behindDoc="0" locked="0" layoutInCell="1" allowOverlap="1" wp14:anchorId="2D7B9435" wp14:editId="348CBDB9">
             <wp:simplePos x="0" y="0"/>
@@ -4619,21 +4703,25 @@
     </w:p>
     <w:p/>
     <w:p/>
+    <w:p/>
     <w:p>
       <w:r>
+        <w:rPr>
+          <w:noProof/>
+        </w:rPr>
         <mc:AlternateContent>
           <mc:Choice Requires="wps">
             <w:drawing>
-              <wp:anchor distT="0" distB="0" distL="114300" distR="114300" simplePos="0" relativeHeight="251714560" behindDoc="0" locked="0" layoutInCell="1" allowOverlap="1" wp14:anchorId="2A9D7D46" wp14:editId="1C85B2FF">
+              <wp:anchor distT="0" distB="0" distL="114300" distR="114300" simplePos="0" relativeHeight="251714560" behindDoc="0" locked="0" layoutInCell="1" allowOverlap="1" wp14:anchorId="2A9D7D46" wp14:editId="2E01EFC4">
                 <wp:simplePos x="0" y="0"/>
                 <wp:positionH relativeFrom="margin">
-                  <wp:posOffset>2575560</wp:posOffset>
+                  <wp:align>right</wp:align>
                 </wp:positionH>
                 <wp:positionV relativeFrom="paragraph">
-                  <wp:posOffset>42545</wp:posOffset>
+                  <wp:posOffset>13970</wp:posOffset>
                 </wp:positionV>
                 <wp:extent cx="3154680" cy="635"/>
-                <wp:effectExtent l="0" t="0" r="7620" b="2540"/>
+                <wp:effectExtent l="0" t="0" r="7620" b="0"/>
                 <wp:wrapSquare wrapText="bothSides"/>
                 <wp:docPr id="625538588" name="Text Box 1"/>
                 <wp:cNvGraphicFramePr/>
@@ -4697,7 +4785,7 @@
           </mc:Choice>
           <mc:Fallback>
             <w:pict>
-              <v:shape w14:anchorId="2A9D7D46" id="_x0000_s1042" type="#_x0000_t202" style="position:absolute;left:0;text-align:left;margin-left:202.8pt;margin-top:3.35pt;width:248.4pt;height:.05pt;z-index:251714560;visibility:visible;mso-wrap-style:square;mso-width-percent:0;mso-wrap-distance-left:9pt;mso-wrap-distance-top:0;mso-wrap-distance-right:9pt;mso-wrap-distance-bottom:0;mso-position-horizontal:absolute;mso-position-horizontal-relative:margin;mso-position-vertical:absolute;mso-position-vertical-relative:text;mso-width-percent:0;mso-width-relative:margin;v-text-anchor:top" o:gfxdata="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" stroked="f">
+              <v:shape w14:anchorId="2A9D7D46" id="_x0000_s1042" type="#_x0000_t202" style="position:absolute;margin-left:197.2pt;margin-top:1.1pt;width:248.4pt;height:.05pt;z-index:251714560;visibility:visible;mso-wrap-style:square;mso-width-percent:0;mso-wrap-distance-left:9pt;mso-wrap-distance-top:0;mso-wrap-distance-right:9pt;mso-wrap-distance-bottom:0;mso-position-horizontal:right;mso-position-horizontal-relative:margin;mso-position-vertical:absolute;mso-position-vertical-relative:text;mso-width-percent:0;mso-width-relative:margin;v-text-anchor:top" o:gfxdata="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" stroked="f">
                 <v:textbox style="mso-fit-shape-to-text:t" inset="0,0,0,0">
                   <w:txbxContent>
                     <w:p>
@@ -4759,6 +4847,9 @@
         </w:numPr>
       </w:pPr>
       <w:r>
+        <w:rPr>
+          <w:noProof/>
+        </w:rPr>
         <w:drawing>
           <wp:anchor distT="0" distB="0" distL="114300" distR="114300" simplePos="0" relativeHeight="251665408" behindDoc="0" locked="0" layoutInCell="1" allowOverlap="1" wp14:anchorId="7DD0FEC1" wp14:editId="17BF5796">
             <wp:simplePos x="0" y="0"/>
@@ -4919,17 +5010,23 @@
       <w:pPr>
         <w:pStyle w:val="ListParagraph"/>
       </w:pPr>
-      <w:r>
+    </w:p>
+    <w:p/>
+    <w:p>
+      <w:r>
+        <w:rPr>
+          <w:noProof/>
+        </w:rPr>
         <mc:AlternateContent>
           <mc:Choice Requires="wps">
             <w:drawing>
-              <wp:anchor distT="0" distB="0" distL="114300" distR="114300" simplePos="0" relativeHeight="251730944" behindDoc="0" locked="0" layoutInCell="1" allowOverlap="1" wp14:anchorId="47E2B4C2" wp14:editId="1A2C84B4">
+              <wp:anchor distT="0" distB="0" distL="114300" distR="114300" simplePos="0" relativeHeight="251730944" behindDoc="0" locked="0" layoutInCell="1" allowOverlap="1" wp14:anchorId="47E2B4C2" wp14:editId="3AACF9E7">
                 <wp:simplePos x="0" y="0"/>
                 <wp:positionH relativeFrom="column">
-                  <wp:posOffset>2401570</wp:posOffset>
+                  <wp:posOffset>2439670</wp:posOffset>
                 </wp:positionH>
                 <wp:positionV relativeFrom="paragraph">
-                  <wp:posOffset>99060</wp:posOffset>
+                  <wp:posOffset>3810</wp:posOffset>
                 </wp:positionV>
                 <wp:extent cx="3169920" cy="635"/>
                 <wp:effectExtent l="0" t="0" r="0" b="0"/>
@@ -4996,7 +5093,7 @@
           </mc:Choice>
           <mc:Fallback>
             <w:pict>
-              <v:shape w14:anchorId="47E2B4C2" id="_x0000_s1043" type="#_x0000_t202" style="position:absolute;left:0;text-align:left;margin-left:189.1pt;margin-top:7.8pt;width:249.6pt;height:.05pt;z-index:251730944;visibility:visible;mso-wrap-style:square;mso-wrap-distance-left:9pt;mso-wrap-distance-top:0;mso-wrap-distance-right:9pt;mso-wrap-distance-bottom:0;mso-position-horizontal:absolute;mso-position-horizontal-relative:text;mso-position-vertical:absolute;mso-position-vertical-relative:text;v-text-anchor:top" o:gfxdata="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" stroked="f">
+              <v:shape w14:anchorId="47E2B4C2" id="_x0000_s1043" type="#_x0000_t202" style="position:absolute;margin-left:192.1pt;margin-top:.3pt;width:249.6pt;height:.05pt;z-index:251730944;visibility:visible;mso-wrap-style:square;mso-wrap-distance-left:9pt;mso-wrap-distance-top:0;mso-wrap-distance-right:9pt;mso-wrap-distance-bottom:0;mso-position-horizontal:absolute;mso-position-horizontal-relative:text;mso-position-vertical:absolute;mso-position-vertical-relative:text;v-text-anchor:top" o:gfxdata="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" stroked="f">
                 <v:textbox style="mso-fit-shape-to-text:t" inset="0,0,0,0">
                   <w:txbxContent>
                     <w:p>
@@ -5031,17 +5128,18 @@
         </mc:AlternateContent>
       </w:r>
     </w:p>
-    <w:p/>
-    <w:p/>
     <w:p>
       <w:pPr>
         <w:pStyle w:val="Heading2"/>
       </w:pPr>
       <w:bookmarkStart w:id="10" w:name="_Toc199317598"/>
       <w:r>
+        <w:rPr>
+          <w:noProof/>
+        </w:rPr>
         <w:lastRenderedPageBreak/>
         <w:drawing>
-          <wp:anchor distT="0" distB="0" distL="114300" distR="114300" simplePos="0" relativeHeight="251742208" behindDoc="0" locked="0" layoutInCell="1" allowOverlap="1" wp14:anchorId="72D7A8B6" wp14:editId="544BDEA8">
+          <wp:anchor distT="0" distB="0" distL="114300" distR="114300" simplePos="0" relativeHeight="251742208" behindDoc="0" locked="0" layoutInCell="1" allowOverlap="1" wp14:anchorId="72D7A8B6" wp14:editId="4EF15DB3">
             <wp:simplePos x="0" y="0"/>
             <wp:positionH relativeFrom="margin">
               <wp:align>center</wp:align>
@@ -5374,13 +5472,39 @@
         <w:t>als</w:t>
       </w:r>
       <w:r>
-        <w:t xml:space="preserve"> deze validatie succesvol was.</w:t>
+        <w:t xml:space="preserve"> </w:t>
+      </w:r>
+      <w:proofErr w:type="spellStart"/>
+      <w:r>
+        <w:t>deze</w:t>
+      </w:r>
+      <w:proofErr w:type="spellEnd"/>
+      <w:r>
+        <w:t xml:space="preserve"> </w:t>
+      </w:r>
+      <w:proofErr w:type="spellStart"/>
+      <w:r>
+        <w:t>validatie</w:t>
+      </w:r>
+      <w:proofErr w:type="spellEnd"/>
+      <w:r>
+        <w:t xml:space="preserve"> </w:t>
+      </w:r>
+      <w:proofErr w:type="spellStart"/>
+      <w:r>
+        <w:t>succesvol</w:t>
+      </w:r>
+      <w:proofErr w:type="spellEnd"/>
+      <w:r>
+        <w:t xml:space="preserve"> was.</w:t>
       </w:r>
     </w:p>
     <w:p/>
     <w:p/>
     <w:p/>
     <w:p/>
+    <w:p/>
+    <w:p/>
     <w:p>
       <w:pPr>
         <w:pStyle w:val="Heading3"/>
@@ -5644,11 +5768,7 @@
         <w:t>systeem gegevens</w:t>
       </w:r>
       <w:r>
-        <w:t xml:space="preserve">. Via verschillende formulieren kunnen gebruikers acties uitvoeren zoals het aanmaken of verwijderen van gebruikers, tags of deuren. Afhankelijk van het formulier </w:t>
-      </w:r>
-      <w:r>
-        <w:lastRenderedPageBreak/>
-        <w:t>dat wordt ingediend, stelt Node-RED automatisch de juiste SQL-query op en voert deze uit op de MariaDB-database, waarmee de gewenste wijziging wordt doorgevoerd.</w:t>
+        <w:t>. Via verschillende formulieren kunnen gebruikers acties uitvoeren zoals het aanmaken of verwijderen van gebruikers, tags of deuren. Afhankelijk van het formulier dat wordt ingediend, stelt Node-RED automatisch de juiste SQL-query op en voert deze uit op de MariaDB-database, waarmee de gewenste wijziging wordt doorgevoerd.</w:t>
       </w:r>
     </w:p>
     <w:p>
@@ -5663,12 +5783,15 @@
       </w:r>
     </w:p>
     <w:p/>
+    <w:p/>
+    <w:p/>
     <w:p>
       <w:pPr>
         <w:pStyle w:val="Heading1"/>
       </w:pPr>
       <w:bookmarkStart w:id="13" w:name="_Toc199317601"/>
       <w:r>
+        <w:lastRenderedPageBreak/>
         <w:t>Programmacode</w:t>
       </w:r>
       <w:bookmarkEnd w:id="13"/>
@@ -5765,6 +5888,9 @@
         </w:numPr>
       </w:pPr>
       <w:r>
+        <w:rPr>
+          <w:noProof/>
+        </w:rPr>
         <w:drawing>
           <wp:anchor distT="0" distB="0" distL="114300" distR="114300" simplePos="0" relativeHeight="251743232" behindDoc="0" locked="0" layoutInCell="1" allowOverlap="1" wp14:anchorId="4D995CBA" wp14:editId="5F848467">
             <wp:simplePos x="0" y="0"/>
@@ -5870,6 +5996,9 @@
         </w:numPr>
       </w:pPr>
       <w:r>
+        <w:rPr>
+          <w:noProof/>
+        </w:rPr>
         <w:drawing>
           <wp:anchor distT="0" distB="0" distL="114300" distR="114300" simplePos="0" relativeHeight="251744256" behindDoc="0" locked="0" layoutInCell="1" allowOverlap="1" wp14:anchorId="46A2EB53" wp14:editId="20297B9B">
             <wp:simplePos x="0" y="0"/>
@@ -5973,6 +6102,10 @@
         </w:numPr>
       </w:pPr>
       <w:r>
+        <w:rPr>
+          <w:noProof/>
+        </w:rPr>
+        <w:lastRenderedPageBreak/>
         <w:drawing>
           <wp:anchor distT="0" distB="0" distL="114300" distR="114300" simplePos="0" relativeHeight="251745280" behindDoc="0" locked="0" layoutInCell="1" allowOverlap="1" wp14:anchorId="5C6374B6" wp14:editId="66D95609">
             <wp:simplePos x="0" y="0"/>
@@ -6523,6 +6656,11 @@
     <w:p/>
     <w:p/>
     <w:p/>
+    <w:p/>
+    <w:p/>
+    <w:p/>
+    <w:p/>
+    <w:p/>
     <w:p>
       <w:pPr>
         <w:pStyle w:val="ListParagraph"/>
@@ -6551,6 +6689,9 @@
         </w:numPr>
       </w:pPr>
       <w:r>
+        <w:rPr>
+          <w:noProof/>
+        </w:rPr>
         <w:drawing>
           <wp:anchor distT="0" distB="0" distL="114300" distR="114300" simplePos="0" relativeHeight="251746304" behindDoc="0" locked="0" layoutInCell="1" allowOverlap="1" wp14:anchorId="31CB7CCF" wp14:editId="29EF7E30">
             <wp:simplePos x="0" y="0"/>
@@ -6644,6 +6785,9 @@
         </w:numPr>
       </w:pPr>
       <w:r>
+        <w:rPr>
+          <w:noProof/>
+        </w:rPr>
         <w:drawing>
           <wp:anchor distT="0" distB="0" distL="114300" distR="114300" simplePos="0" relativeHeight="251747328" behindDoc="0" locked="0" layoutInCell="1" allowOverlap="1" wp14:anchorId="6FEF4CC7" wp14:editId="7E54F355">
             <wp:simplePos x="0" y="0"/>
@@ -6753,6 +6897,9 @@
         </w:numPr>
       </w:pPr>
       <w:r>
+        <w:rPr>
+          <w:noProof/>
+        </w:rPr>
         <w:lastRenderedPageBreak/>
         <w:drawing>
           <wp:anchor distT="0" distB="0" distL="114300" distR="114300" simplePos="0" relativeHeight="251748352" behindDoc="0" locked="0" layoutInCell="1" allowOverlap="1" wp14:anchorId="14A3220E" wp14:editId="69B2C6B5">
@@ -7485,6 +7632,9 @@
         </w:numPr>
       </w:pPr>
       <w:r>
+        <w:rPr>
+          <w:noProof/>
+        </w:rPr>
         <mc:AlternateContent>
           <mc:Choice Requires="wps">
             <w:drawing>
@@ -7593,6 +7743,9 @@
         </w:numPr>
       </w:pPr>
       <w:r>
+        <w:rPr>
+          <w:noProof/>
+        </w:rPr>
         <mc:AlternateContent>
           <mc:Choice Requires="wps">
             <w:drawing>
@@ -7959,16 +8112,60 @@
         </w:numPr>
       </w:pPr>
       <w:r>
+        <w:t>(</w:t>
+      </w:r>
+      <w:proofErr w:type="spellStart"/>
+      <w:r>
+        <w:t>Optioneel</w:t>
+      </w:r>
+      <w:proofErr w:type="spellEnd"/>
+      <w:r>
+        <w:t xml:space="preserve">) </w:t>
+      </w:r>
+      <w:proofErr w:type="spellStart"/>
+      <w:r>
+        <w:t>Gebruik</w:t>
+      </w:r>
+      <w:proofErr w:type="spellEnd"/>
+      <w:r>
+        <w:t xml:space="preserve"> Nginx </w:t>
+      </w:r>
+      <w:proofErr w:type="spellStart"/>
+      <w:r>
+        <w:t>en</w:t>
+      </w:r>
+      <w:proofErr w:type="spellEnd"/>
+      <w:r>
+        <w:t xml:space="preserve"> Let</w:t>
+      </w:r>
+      <w:r>
+        <w:t>’</w:t>
+      </w:r>
+      <w:r>
+        <w:t>s Encrypt</w:t>
+      </w:r>
+      <w:r>
+        <w:t xml:space="preserve"> voor het aanmaken van SSL certificaten voor gebruik met HTTPS en een DuckDNS Domain Name</w:t>
+      </w:r>
+    </w:p>
+    <w:p>
+      <w:pPr>
+        <w:pStyle w:val="ListParagraph"/>
+      </w:pPr>
+      <w:r>
+        <w:rPr>
+          <w:noProof/>
+        </w:rPr>
         <mc:AlternateContent>
           <mc:Choice Requires="wps">
             <w:drawing>
-              <wp:anchor distT="45720" distB="45720" distL="114300" distR="114300" simplePos="0" relativeHeight="251706368" behindDoc="0" locked="0" layoutInCell="1" allowOverlap="1" wp14:anchorId="05D67644" wp14:editId="48B37718">
+              <wp:anchor distT="45720" distB="45720" distL="114300" distR="114300" simplePos="0" relativeHeight="251706368" behindDoc="0" locked="0" layoutInCell="1" allowOverlap="1" wp14:anchorId="05D67644" wp14:editId="1A7E8839">
                 <wp:simplePos x="0" y="0"/>
                 <wp:positionH relativeFrom="column">
-                  <wp:posOffset>487680</wp:posOffset>
+                  <wp:posOffset>454025</wp:posOffset>
                 </wp:positionH>
                 <wp:positionV relativeFrom="paragraph">
-                  <wp:posOffset>1659890</wp:posOffset>
+                  <wp:posOffset>220345</wp:posOffset>
                 </wp:positionV>
                 <wp:extent cx="2360930" cy="434340"/>
                 <wp:effectExtent l="0" t="0" r="12700" b="22860"/>
@@ -8060,7 +8257,7 @@
           </mc:Choice>
           <mc:Fallback>
             <w:pict>
-              <v:shape w14:anchorId="05D67644" id="_x0000_s1046" type="#_x0000_t202" style="position:absolute;left:0;text-align:left;margin-left:38.4pt;margin-top:130.7pt;width:185.9pt;height:34.2pt;z-index:251706368;visibility:visible;mso-wrap-style:square;mso-width-percent:400;mso-height-percent:0;mso-wrap-distance-left:9pt;mso-wrap-distance-top:3.6pt;mso-wrap-distance-right:9pt;mso-wrap-distance-bottom:3.6pt;mso-position-horizontal:absolute;mso-position-horizontal-relative:text;mso-position-vertical:absolute;mso-position-vertical-relative:text;mso-width-percent:400;mso-height-percent:0;mso-width-relative:margin;mso-height-relative:margin;v-text-anchor:top" o:gfxdata="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">
+              <v:shape w14:anchorId="05D67644" id="_x0000_s1046" type="#_x0000_t202" style="position:absolute;left:0;text-align:left;margin-left:35.75pt;margin-top:17.35pt;width:185.9pt;height:34.2pt;z-index:251706368;visibility:visible;mso-wrap-style:square;mso-width-percent:400;mso-height-percent:0;mso-wrap-distance-left:9pt;mso-wrap-distance-top:3.6pt;mso-wrap-distance-right:9pt;mso-wrap-distance-bottom:3.6pt;mso-position-horizontal:absolute;mso-position-horizontal-relative:text;mso-position-vertical:absolute;mso-position-vertical-relative:text;mso-width-percent:400;mso-height-percent:0;mso-width-relative:margin;mso-height-relative:margin;v-text-anchor:top" o:gfxdata="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">
                 <v:textbox>
                   <w:txbxContent>
                     <w:p>
@@ -8107,23 +8304,6 @@
           </mc:Fallback>
         </mc:AlternateContent>
       </w:r>
-      <w:r>
-        <w:t>(Optioneel) Gebruik Nginx en Let</w:t>
-      </w:r>
-      <w:r>
-        <w:t>’</w:t>
-      </w:r>
-      <w:r>
-        <w:t>s Encrypt</w:t>
-      </w:r>
-      <w:r>
-        <w:t xml:space="preserve"> voor het aanmaken van SSL certificaten voor gebruik met HTTPS en een DuckDNS Domain Name</w:t>
-      </w:r>
-    </w:p>
-    <w:p>
-      <w:pPr>
-        <w:pStyle w:val="ListParagraph"/>
-      </w:pPr>
       <w:hyperlink r:id="rId41" w:history="1">
         <w:r>
           <w:rPr>
@@ -8135,6 +8315,16 @@
     </w:p>
     <w:p>
       <w:pPr>
+        <w:pStyle w:val="ListParagraph"/>
+      </w:pPr>
+    </w:p>
+    <w:p>
+      <w:pPr>
+        <w:pStyle w:val="ListParagraph"/>
+      </w:pPr>
+    </w:p>
+    <w:p>
+      <w:pPr>
         <w:pStyle w:val="Heading2"/>
       </w:pPr>
       <w:bookmarkStart w:id="17" w:name="_Toc199317605"/>
@@ -8153,10 +8343,13 @@
         </w:numPr>
       </w:pPr>
       <w:r>
+        <w:rPr>
+          <w:noProof/>
+        </w:rPr>
         <mc:AlternateContent>
           <mc:Choice Requires="wps">
             <w:drawing>
-              <wp:anchor distT="45720" distB="45720" distL="114300" distR="114300" simplePos="0" relativeHeight="251692032" behindDoc="0" locked="0" layoutInCell="1" allowOverlap="1" wp14:anchorId="0DDA85B3" wp14:editId="001639EB">
+              <wp:anchor distT="45720" distB="45720" distL="114300" distR="114300" simplePos="0" relativeHeight="251692032" behindDoc="0" locked="0" layoutInCell="1" allowOverlap="1" wp14:anchorId="0DDA85B3" wp14:editId="44EF1B9A">
                 <wp:simplePos x="0" y="0"/>
                 <wp:positionH relativeFrom="column">
                   <wp:posOffset>480060</wp:posOffset>
@@ -8257,8 +8450,13 @@
           </mc:Fallback>
         </mc:AlternateContent>
       </w:r>
-      <w:r>
-        <w:t>Verbind met de Ubuntu VM via SSH</w:t>
+      <w:proofErr w:type="spellStart"/>
+      <w:r>
+        <w:t>Verbind</w:t>
+      </w:r>
+      <w:proofErr w:type="spellEnd"/>
+      <w:r>
+        <w:t xml:space="preserve"> met de Ubuntu VM via SSH</w:t>
       </w:r>
     </w:p>
     <w:p>
@@ -8270,16 +8468,19 @@
         </w:numPr>
       </w:pPr>
       <w:r>
+        <w:rPr>
+          <w:noProof/>
+        </w:rPr>
         <mc:AlternateContent>
           <mc:Choice Requires="wps">
             <w:drawing>
-              <wp:anchor distT="45720" distB="45720" distL="114300" distR="114300" simplePos="0" relativeHeight="251698176" behindDoc="0" locked="0" layoutInCell="1" allowOverlap="1" wp14:anchorId="61EF00B9" wp14:editId="64413039">
+              <wp:anchor distT="45720" distB="45720" distL="114300" distR="114300" simplePos="0" relativeHeight="251698176" behindDoc="0" locked="0" layoutInCell="1" allowOverlap="1" wp14:anchorId="61EF00B9" wp14:editId="5D94996D">
                 <wp:simplePos x="0" y="0"/>
                 <wp:positionH relativeFrom="column">
-                  <wp:posOffset>457200</wp:posOffset>
+                  <wp:posOffset>485775</wp:posOffset>
                 </wp:positionH>
                 <wp:positionV relativeFrom="paragraph">
-                  <wp:posOffset>589280</wp:posOffset>
+                  <wp:posOffset>655955</wp:posOffset>
                 </wp:positionV>
                 <wp:extent cx="2278380" cy="472440"/>
                 <wp:effectExtent l="0" t="0" r="26670" b="22860"/>
@@ -8363,7 +8564,7 @@
           </mc:Choice>
           <mc:Fallback>
             <w:pict>
-              <v:shape w14:anchorId="61EF00B9" id="_x0000_s1048" type="#_x0000_t202" style="position:absolute;left:0;text-align:left;margin-left:36pt;margin-top:46.4pt;width:179.4pt;height:37.2pt;z-index:251698176;visibility:visible;mso-wrap-style:square;mso-width-percent:0;mso-height-percent:0;mso-wrap-distance-left:9pt;mso-wrap-distance-top:3.6pt;mso-wrap-distance-right:9pt;mso-wrap-distance-bottom:3.6pt;mso-position-horizontal:absolute;mso-position-horizontal-relative:text;mso-position-vertical:absolute;mso-position-vertical-relative:text;mso-width-percent:0;mso-height-percent:0;mso-width-relative:margin;mso-height-relative:margin;v-text-anchor:top" o:gfxdata="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">
+              <v:shape w14:anchorId="61EF00B9" id="_x0000_s1048" type="#_x0000_t202" style="position:absolute;left:0;text-align:left;margin-left:38.25pt;margin-top:51.65pt;width:179.4pt;height:37.2pt;z-index:251698176;visibility:visible;mso-wrap-style:square;mso-width-percent:0;mso-height-percent:0;mso-wrap-distance-left:9pt;mso-wrap-distance-top:3.6pt;mso-wrap-distance-right:9pt;mso-wrap-distance-bottom:3.6pt;mso-position-horizontal:absolute;mso-position-horizontal-relative:text;mso-position-vertical:absolute;mso-position-vertical-relative:text;mso-width-percent:0;mso-height-percent:0;mso-width-relative:margin;mso-height-relative:margin;v-text-anchor:top" o:gfxdata="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">
                 <v:textbox>
                   <w:txbxContent>
                     <w:p>
@@ -8403,8 +8604,13 @@
         </mc:AlternateContent>
       </w:r>
       <w:r>
-        <w:t>Update het systeem</w:t>
-      </w:r>
+        <w:t xml:space="preserve">Update het </w:t>
+      </w:r>
+      <w:proofErr w:type="spellStart"/>
+      <w:r>
+        <w:t>systeem</w:t>
+      </w:r>
+      <w:proofErr w:type="spellEnd"/>
     </w:p>
     <w:p>
       <w:pPr>
@@ -8415,16 +8621,19 @@
         </w:numPr>
       </w:pPr>
       <w:r>
+        <w:rPr>
+          <w:noProof/>
+        </w:rPr>
         <mc:AlternateContent>
           <mc:Choice Requires="wps">
             <w:drawing>
-              <wp:anchor distT="45720" distB="45720" distL="114300" distR="114300" simplePos="0" relativeHeight="251696128" behindDoc="0" locked="0" layoutInCell="1" allowOverlap="1" wp14:anchorId="1A6AACF1" wp14:editId="3043816C">
+              <wp:anchor distT="45720" distB="45720" distL="114300" distR="114300" simplePos="0" relativeHeight="251696128" behindDoc="0" locked="0" layoutInCell="1" allowOverlap="1" wp14:anchorId="1A6AACF1" wp14:editId="5C862CF2">
                 <wp:simplePos x="0" y="0"/>
                 <wp:positionH relativeFrom="column">
-                  <wp:posOffset>457200</wp:posOffset>
+                  <wp:posOffset>461010</wp:posOffset>
                 </wp:positionH>
                 <wp:positionV relativeFrom="paragraph">
-                  <wp:posOffset>781685</wp:posOffset>
+                  <wp:posOffset>876935</wp:posOffset>
                 </wp:positionV>
                 <wp:extent cx="2613660" cy="297180"/>
                 <wp:effectExtent l="0" t="0" r="15240" b="26670"/>
@@ -8500,7 +8709,7 @@
           </mc:Choice>
           <mc:Fallback>
             <w:pict>
-              <v:shape w14:anchorId="1A6AACF1" id="_x0000_s1049" type="#_x0000_t202" style="position:absolute;left:0;text-align:left;margin-left:36pt;margin-top:61.55pt;width:205.8pt;height:23.4pt;z-index:251696128;visibility:visible;mso-wrap-style:square;mso-width-percent:0;mso-height-percent:0;mso-wrap-distance-left:9pt;mso-wrap-distance-top:3.6pt;mso-wrap-distance-right:9pt;mso-wrap-distance-bottom:3.6pt;mso-position-horizontal:absolute;mso-position-horizontal-relative:text;mso-position-vertical:absolute;mso-position-vertical-relative:text;mso-width-percent:0;mso-height-percent:0;mso-width-relative:margin;mso-height-relative:margin;v-text-anchor:top" o:gfxdata="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">
+              <v:shape w14:anchorId="1A6AACF1" id="_x0000_s1049" type="#_x0000_t202" style="position:absolute;left:0;text-align:left;margin-left:36.3pt;margin-top:69.05pt;width:205.8pt;height:23.4pt;z-index:251696128;visibility:visible;mso-wrap-style:square;mso-width-percent:0;mso-height-percent:0;mso-wrap-distance-left:9pt;mso-wrap-distance-top:3.6pt;mso-wrap-distance-right:9pt;mso-wrap-distance-bottom:3.6pt;mso-position-horizontal:absolute;mso-position-horizontal-relative:text;mso-position-vertical:absolute;mso-position-vertical-relative:text;mso-width-percent:0;mso-height-percent:0;mso-width-relative:margin;mso-height-relative:margin;v-text-anchor:top" o:gfxdata="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">
                 <v:textbox>
                   <w:txbxContent>
                     <w:p>
@@ -8531,8 +8740,13 @@
           </mc:Fallback>
         </mc:AlternateContent>
       </w:r>
-      <w:r>
-        <w:t>Installeer MariaDB Server</w:t>
+      <w:proofErr w:type="spellStart"/>
+      <w:r>
+        <w:t>Installeer</w:t>
+      </w:r>
+      <w:proofErr w:type="spellEnd"/>
+      <w:r>
+        <w:t xml:space="preserve"> MariaDB Server</w:t>
       </w:r>
     </w:p>
     <w:p>
@@ -8544,16 +8758,19 @@
         </w:numPr>
       </w:pPr>
       <w:r>
+        <w:rPr>
+          <w:noProof/>
+        </w:rPr>
         <mc:AlternateContent>
           <mc:Choice Requires="wps">
             <w:drawing>
-              <wp:anchor distT="45720" distB="45720" distL="114300" distR="114300" simplePos="0" relativeHeight="251694080" behindDoc="0" locked="0" layoutInCell="1" allowOverlap="1" wp14:anchorId="559984F6" wp14:editId="54CC8B07">
+              <wp:anchor distT="45720" distB="45720" distL="114300" distR="114300" simplePos="0" relativeHeight="251694080" behindDoc="0" locked="0" layoutInCell="1" allowOverlap="1" wp14:anchorId="559984F6" wp14:editId="32633040">
                 <wp:simplePos x="0" y="0"/>
                 <wp:positionH relativeFrom="column">
-                  <wp:posOffset>457200</wp:posOffset>
+                  <wp:posOffset>470535</wp:posOffset>
                 </wp:positionH>
                 <wp:positionV relativeFrom="paragraph">
-                  <wp:posOffset>648335</wp:posOffset>
+                  <wp:posOffset>705485</wp:posOffset>
                 </wp:positionV>
                 <wp:extent cx="2651760" cy="678180"/>
                 <wp:effectExtent l="0" t="0" r="15240" b="26670"/>
@@ -8651,7 +8868,7 @@
           </mc:Choice>
           <mc:Fallback>
             <w:pict>
-              <v:shape w14:anchorId="559984F6" id="_x0000_s1050" type="#_x0000_t202" style="position:absolute;left:0;text-align:left;margin-left:36pt;margin-top:51.05pt;width:208.8pt;height:53.4pt;z-index:251694080;visibility:visible;mso-wrap-style:square;mso-width-percent:0;mso-height-percent:0;mso-wrap-distance-left:9pt;mso-wrap-distance-top:3.6pt;mso-wrap-distance-right:9pt;mso-wrap-distance-bottom:3.6pt;mso-position-horizontal:absolute;mso-position-horizontal-relative:text;mso-position-vertical:absolute;mso-position-vertical-relative:text;mso-width-percent:0;mso-height-percent:0;mso-width-relative:margin;mso-height-relative:margin;v-text-anchor:top" o:gfxdata="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">
+              <v:shape w14:anchorId="559984F6" id="_x0000_s1050" type="#_x0000_t202" style="position:absolute;left:0;text-align:left;margin-left:37.05pt;margin-top:55.55pt;width:208.8pt;height:53.4pt;z-index:251694080;visibility:visible;mso-wrap-style:square;mso-width-percent:0;mso-height-percent:0;mso-wrap-distance-left:9pt;mso-wrap-distance-top:3.6pt;mso-wrap-distance-right:9pt;mso-wrap-distance-bottom:3.6pt;mso-position-horizontal:absolute;mso-position-horizontal-relative:text;mso-position-vertical:absolute;mso-position-vertical-relative:text;mso-width-percent:0;mso-height-percent:0;mso-width-relative:margin;mso-height-relative:margin;v-text-anchor:top" o:gfxdata="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">
                 <v:textbox>
                   <w:txbxContent>
                     <w:p>
@@ -8705,7 +8922,23 @@
         </mc:AlternateContent>
       </w:r>
       <w:r>
-        <w:t>Start en controleer de MariaDB-service</w:t>
+        <w:t xml:space="preserve">Start </w:t>
+      </w:r>
+      <w:proofErr w:type="spellStart"/>
+      <w:r>
+        <w:t>en</w:t>
+      </w:r>
+      <w:proofErr w:type="spellEnd"/>
+      <w:r>
+        <w:t xml:space="preserve"> </w:t>
+      </w:r>
+      <w:proofErr w:type="spellStart"/>
+      <w:r>
+        <w:t>controleer</w:t>
+      </w:r>
+      <w:proofErr w:type="spellEnd"/>
+      <w:r>
+        <w:t xml:space="preserve"> de MariaDB-service</w:t>
       </w:r>
     </w:p>
     <w:p>
@@ -8717,16 +8950,19 @@
         </w:numPr>
       </w:pPr>
       <w:r>
+        <w:rPr>
+          <w:noProof/>
+        </w:rPr>
         <mc:AlternateContent>
           <mc:Choice Requires="wps">
             <w:drawing>
-              <wp:anchor distT="45720" distB="45720" distL="114300" distR="114300" simplePos="0" relativeHeight="251700224" behindDoc="0" locked="0" layoutInCell="1" allowOverlap="1" wp14:anchorId="1E3F54E8" wp14:editId="68A5E211">
+              <wp:anchor distT="45720" distB="45720" distL="114300" distR="114300" simplePos="0" relativeHeight="251700224" behindDoc="0" locked="0" layoutInCell="1" allowOverlap="1" wp14:anchorId="1E3F54E8" wp14:editId="0A0D79A4">
                 <wp:simplePos x="0" y="0"/>
                 <wp:positionH relativeFrom="column">
-                  <wp:posOffset>457200</wp:posOffset>
+                  <wp:posOffset>476250</wp:posOffset>
                 </wp:positionH>
                 <wp:positionV relativeFrom="paragraph">
-                  <wp:posOffset>1010285</wp:posOffset>
+                  <wp:posOffset>1057910</wp:posOffset>
                 </wp:positionV>
                 <wp:extent cx="2613660" cy="297180"/>
                 <wp:effectExtent l="0" t="0" r="15240" b="26670"/>
@@ -8796,7 +9032,7 @@
           </mc:Choice>
           <mc:Fallback>
             <w:pict>
-              <v:shape w14:anchorId="1E3F54E8" id="_x0000_s1051" type="#_x0000_t202" style="position:absolute;left:0;text-align:left;margin-left:36pt;margin-top:79.55pt;width:205.8pt;height:23.4pt;z-index:251700224;visibility:visible;mso-wrap-style:square;mso-width-percent:0;mso-height-percent:0;mso-wrap-distance-left:9pt;mso-wrap-distance-top:3.6pt;mso-wrap-distance-right:9pt;mso-wrap-distance-bottom:3.6pt;mso-position-horizontal:absolute;mso-position-horizontal-relative:text;mso-position-vertical:absolute;mso-position-vertical-relative:text;mso-width-percent:0;mso-height-percent:0;mso-width-relative:margin;mso-height-relative:margin;v-text-anchor:top" o:gfxdata="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">
+              <v:shape w14:anchorId="1E3F54E8" id="_x0000_s1051" type="#_x0000_t202" style="position:absolute;left:0;text-align:left;margin-left:37.5pt;margin-top:83.3pt;width:205.8pt;height:23.4pt;z-index:251700224;visibility:visible;mso-wrap-style:square;mso-width-percent:0;mso-height-percent:0;mso-wrap-distance-left:9pt;mso-wrap-distance-top:3.6pt;mso-wrap-distance-right:9pt;mso-wrap-distance-bottom:3.6pt;mso-position-horizontal:absolute;mso-position-horizontal-relative:text;mso-position-vertical:absolute;mso-position-vertical-relative:text;mso-width-percent:0;mso-height-percent:0;mso-width-relative:margin;mso-height-relative:margin;v-text-anchor:top" o:gfxdata="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">
                 <v:textbox>
                   <w:txbxContent>
                     <w:p>
@@ -8821,9 +9057,19 @@
           </mc:Fallback>
         </mc:AlternateContent>
       </w:r>
-      <w:r>
-        <w:t>Beveilig de installatie</w:t>
-      </w:r>
+      <w:proofErr w:type="spellStart"/>
+      <w:r>
+        <w:t>Beveilig</w:t>
+      </w:r>
+      <w:proofErr w:type="spellEnd"/>
+      <w:r>
+        <w:t xml:space="preserve"> de </w:t>
+      </w:r>
+      <w:proofErr w:type="spellStart"/>
+      <w:r>
+        <w:t>installatie</w:t>
+      </w:r>
+      <w:proofErr w:type="spellEnd"/>
     </w:p>
     <w:p>
       <w:pPr>
@@ -8897,10 +9143,13 @@
         </w:numPr>
       </w:pPr>
       <w:r>
+        <w:rPr>
+          <w:noProof/>
+        </w:rPr>
         <mc:AlternateContent>
           <mc:Choice Requires="wps">
             <w:drawing>
-              <wp:anchor distT="45720" distB="45720" distL="114300" distR="114300" simplePos="0" relativeHeight="251702272" behindDoc="0" locked="0" layoutInCell="1" allowOverlap="1" wp14:anchorId="3285224A" wp14:editId="515B84C3">
+              <wp:anchor distT="45720" distB="45720" distL="114300" distR="114300" simplePos="0" relativeHeight="251702272" behindDoc="0" locked="0" layoutInCell="1" allowOverlap="1" wp14:anchorId="3285224A" wp14:editId="16DED26E">
                 <wp:simplePos x="0" y="0"/>
                 <wp:positionH relativeFrom="column">
                   <wp:posOffset>449580</wp:posOffset>
@@ -9001,8 +9250,13 @@
           </mc:Fallback>
         </mc:AlternateContent>
       </w:r>
-      <w:r>
-        <w:t>Toegang tot MariaD</w:t>
+      <w:proofErr w:type="spellStart"/>
+      <w:r>
+        <w:t>Toegang</w:t>
+      </w:r>
+      <w:proofErr w:type="spellEnd"/>
+      <w:r>
+        <w:t xml:space="preserve"> tot MariaD</w:t>
       </w:r>
       <w:r>
         <w:t>B</w:t>
@@ -9017,16 +9271,19 @@
         </w:numPr>
       </w:pPr>
       <w:r>
+        <w:rPr>
+          <w:noProof/>
+        </w:rPr>
         <mc:AlternateContent>
           <mc:Choice Requires="wps">
             <w:drawing>
-              <wp:anchor distT="45720" distB="45720" distL="114300" distR="114300" simplePos="0" relativeHeight="251708416" behindDoc="0" locked="0" layoutInCell="1" allowOverlap="1" wp14:anchorId="6A5FEBDB" wp14:editId="30C9207C">
+              <wp:anchor distT="45720" distB="45720" distL="114300" distR="114300" simplePos="0" relativeHeight="251708416" behindDoc="0" locked="0" layoutInCell="1" allowOverlap="1" wp14:anchorId="6A5FEBDB" wp14:editId="17E7B4B3">
                 <wp:simplePos x="0" y="0"/>
                 <wp:positionH relativeFrom="column">
                   <wp:posOffset>472440</wp:posOffset>
                 </wp:positionH>
                 <wp:positionV relativeFrom="paragraph">
-                  <wp:posOffset>610870</wp:posOffset>
+                  <wp:posOffset>677545</wp:posOffset>
                 </wp:positionV>
                 <wp:extent cx="5486400" cy="1089660"/>
                 <wp:effectExtent l="0" t="0" r="19050" b="15240"/>
@@ -9172,7 +9429,7 @@
           </mc:Choice>
           <mc:Fallback>
             <w:pict>
-              <v:shape w14:anchorId="6A5FEBDB" id="_x0000_s1053" type="#_x0000_t202" style="position:absolute;left:0;text-align:left;margin-left:37.2pt;margin-top:48.1pt;width:6in;height:85.8pt;z-index:251708416;visibility:visible;mso-wrap-style:square;mso-width-percent:0;mso-height-percent:0;mso-wrap-distance-left:9pt;mso-wrap-distance-top:3.6pt;mso-wrap-distance-right:9pt;mso-wrap-distance-bottom:3.6pt;mso-position-horizontal:absolute;mso-position-horizontal-relative:text;mso-position-vertical:absolute;mso-position-vertical-relative:text;mso-width-percent:0;mso-height-percent:0;mso-width-relative:margin;mso-height-relative:margin;v-text-anchor:top" o:gfxdata="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">
+              <v:shape w14:anchorId="6A5FEBDB" id="_x0000_s1053" type="#_x0000_t202" style="position:absolute;left:0;text-align:left;margin-left:37.2pt;margin-top:53.35pt;width:6in;height:85.8pt;z-index:251708416;visibility:visible;mso-wrap-style:square;mso-width-percent:0;mso-height-percent:0;mso-wrap-distance-left:9pt;mso-wrap-distance-top:3.6pt;mso-wrap-distance-right:9pt;mso-wrap-distance-bottom:3.6pt;mso-position-horizontal:absolute;mso-position-horizontal-relative:text;mso-position-vertical:absolute;mso-position-vertical-relative:text;mso-width-percent:0;mso-height-percent:0;mso-width-relative:margin;mso-height-relative:margin;v-text-anchor:top" o:gfxdata="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">
                 <v:textbox>
                   <w:txbxContent>
                     <w:p>
@@ -9273,8 +9530,21 @@
           </mc:Fallback>
         </mc:AlternateContent>
       </w:r>
-      <w:r>
-        <w:t>Voeg volgende database toe</w:t>
+      <w:proofErr w:type="spellStart"/>
+      <w:r>
+        <w:t>Voeg</w:t>
+      </w:r>
+      <w:proofErr w:type="spellEnd"/>
+      <w:r>
+        <w:t xml:space="preserve"> </w:t>
+      </w:r>
+      <w:proofErr w:type="spellStart"/>
+      <w:r>
+        <w:t>volgende</w:t>
+      </w:r>
+      <w:proofErr w:type="spellEnd"/>
+      <w:r>
+        <w:t xml:space="preserve"> database toe</w:t>
       </w:r>
       <w:r>
         <w:t xml:space="preserve"> (database_structure.sql</w:t>
@@ -9292,16 +9562,19 @@
         </w:numPr>
       </w:pPr>
       <w:r>
+        <w:rPr>
+          <w:noProof/>
+        </w:rPr>
         <mc:AlternateContent>
           <mc:Choice Requires="wps">
             <w:drawing>
-              <wp:anchor distT="45720" distB="45720" distL="114300" distR="114300" simplePos="0" relativeHeight="251712512" behindDoc="0" locked="0" layoutInCell="1" allowOverlap="1" wp14:anchorId="3C700E10" wp14:editId="21327F27">
+              <wp:anchor distT="45720" distB="45720" distL="114300" distR="114300" simplePos="0" relativeHeight="251712512" behindDoc="0" locked="0" layoutInCell="1" allowOverlap="1" wp14:anchorId="3C700E10" wp14:editId="586326D4">
                 <wp:simplePos x="0" y="0"/>
-                <wp:positionH relativeFrom="column">
-                  <wp:posOffset>487680</wp:posOffset>
+                <wp:positionH relativeFrom="margin">
+                  <wp:align>right</wp:align>
                 </wp:positionH>
                 <wp:positionV relativeFrom="paragraph">
-                  <wp:posOffset>1398905</wp:posOffset>
+                  <wp:posOffset>1475105</wp:posOffset>
                 </wp:positionV>
                 <wp:extent cx="5234940" cy="807720"/>
                 <wp:effectExtent l="0" t="0" r="22860" b="11430"/>
@@ -9441,7 +9714,7 @@
           </mc:Choice>
           <mc:Fallback>
             <w:pict>
-              <v:shape w14:anchorId="3C700E10" id="_x0000_s1054" type="#_x0000_t202" style="position:absolute;left:0;text-align:left;margin-left:38.4pt;margin-top:110.15pt;width:412.2pt;height:63.6pt;z-index:251712512;visibility:visible;mso-wrap-style:square;mso-width-percent:0;mso-height-percent:0;mso-wrap-distance-left:9pt;mso-wrap-distance-top:3.6pt;mso-wrap-distance-right:9pt;mso-wrap-distance-bottom:3.6pt;mso-position-horizontal:absolute;mso-position-horizontal-relative:text;mso-position-vertical:absolute;mso-position-vertical-relative:text;mso-width-percent:0;mso-height-percent:0;mso-width-relative:margin;mso-height-relative:margin;v-text-anchor:top" o:gfxdata="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">
+              <v:shape w14:anchorId="3C700E10" id="_x0000_s1054" type="#_x0000_t202" style="position:absolute;left:0;text-align:left;margin-left:361pt;margin-top:116.15pt;width:412.2pt;height:63.6pt;z-index:251712512;visibility:visible;mso-wrap-style:square;mso-width-percent:0;mso-height-percent:0;mso-wrap-distance-left:9pt;mso-wrap-distance-top:3.6pt;mso-wrap-distance-right:9pt;mso-wrap-distance-bottom:3.6pt;mso-position-horizontal:right;mso-position-horizontal-relative:margin;mso-position-vertical:absolute;mso-position-vertical-relative:text;mso-width-percent:0;mso-height-percent:0;mso-width-relative:margin;mso-height-relative:margin;v-text-anchor:top" o:gfxdata="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">
                 <v:textbox>
                   <w:txbxContent>
                     <w:p>
@@ -9530,14 +9803,27 @@
                     </w:p>
                   </w:txbxContent>
                 </v:textbox>
-                <w10:wrap type="topAndBottom"/>
+                <w10:wrap type="topAndBottom" anchorx="margin"/>
               </v:shape>
             </w:pict>
           </mc:Fallback>
         </mc:AlternateContent>
       </w:r>
-      <w:r>
-        <w:t>Creëer een database user met rechten op onze nieuw gecreëerde database</w:t>
+      <w:proofErr w:type="spellStart"/>
+      <w:r>
+        <w:t>Creëer</w:t>
+      </w:r>
+      <w:proofErr w:type="spellEnd"/>
+      <w:r>
+        <w:t xml:space="preserve"> </w:t>
+      </w:r>
+      <w:proofErr w:type="spellStart"/>
+      <w:r>
+        <w:t>een</w:t>
+      </w:r>
+      <w:proofErr w:type="spellEnd"/>
+      <w:r>
+        <w:t xml:space="preserve"> database user met rechten op onze nieuw gecreëerde database</w:t>
       </w:r>
     </w:p>
     <w:p/>
@@ -9566,6 +9852,9 @@
         </w:numPr>
       </w:pPr>
       <w:r>
+        <w:rPr>
+          <w:noProof/>
+        </w:rPr>
         <mc:AlternateContent>
           <mc:Choice Requires="wps">
             <w:drawing>
@@ -9683,6 +9972,9 @@
         </w:numPr>
       </w:pPr>
       <w:r>
+        <w:rPr>
+          <w:noProof/>
+        </w:rPr>
         <mc:AlternateContent>
           <mc:Choice Requires="wps">
             <w:drawing>
@@ -9840,19 +10132,22 @@
         </w:numPr>
       </w:pPr>
       <w:r>
+        <w:rPr>
+          <w:noProof/>
+        </w:rPr>
         <mc:AlternateContent>
           <mc:Choice Requires="wps">
             <w:drawing>
-              <wp:anchor distT="45720" distB="45720" distL="114300" distR="114300" simplePos="0" relativeHeight="251677696" behindDoc="0" locked="0" layoutInCell="1" allowOverlap="1" wp14:anchorId="545D01E2" wp14:editId="77885D8C">
+              <wp:anchor distT="45720" distB="45720" distL="114300" distR="114300" simplePos="0" relativeHeight="251677696" behindDoc="0" locked="0" layoutInCell="1" allowOverlap="1" wp14:anchorId="545D01E2" wp14:editId="494FED93">
                 <wp:simplePos x="0" y="0"/>
                 <wp:positionH relativeFrom="margin">
-                  <wp:posOffset>906780</wp:posOffset>
+                  <wp:posOffset>904875</wp:posOffset>
                 </wp:positionH>
                 <wp:positionV relativeFrom="paragraph">
-                  <wp:posOffset>221615</wp:posOffset>
+                  <wp:posOffset>223520</wp:posOffset>
                 </wp:positionV>
-                <wp:extent cx="5166360" cy="297180"/>
-                <wp:effectExtent l="0" t="0" r="15240" b="26670"/>
+                <wp:extent cx="5314950" cy="352425"/>
+                <wp:effectExtent l="0" t="0" r="19050" b="28575"/>
                 <wp:wrapTopAndBottom/>
                 <wp:docPr id="1724898079" name="Text Box 2"/>
                 <wp:cNvGraphicFramePr>
@@ -9867,7 +10162,7 @@
                       <wps:spPr bwMode="auto">
                         <a:xfrm>
                           <a:off x="0" y="0"/>
-                          <a:ext cx="5166360" cy="297180"/>
+                          <a:ext cx="5314950" cy="352425"/>
                         </a:xfrm>
                         <a:prstGeom prst="rect">
                           <a:avLst/>
@@ -9945,7 +10240,7 @@
           </mc:Choice>
           <mc:Fallback>
             <w:pict>
-              <v:shape w14:anchorId="545D01E2" id="_x0000_s1057" type="#_x0000_t202" style="position:absolute;left:0;text-align:left;margin-left:71.4pt;margin-top:17.45pt;width:406.8pt;height:23.4pt;z-index:251677696;visibility:visible;mso-wrap-style:square;mso-width-percent:0;mso-height-percent:0;mso-wrap-distance-left:9pt;mso-wrap-distance-top:3.6pt;mso-wrap-distance-right:9pt;mso-wrap-distance-bottom:3.6pt;mso-position-horizontal:absolute;mso-position-horizontal-relative:margin;mso-position-vertical:absolute;mso-position-vertical-relative:text;mso-width-percent:0;mso-height-percent:0;mso-width-relative:margin;mso-height-relative:margin;v-text-anchor:top" o:gfxdata="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">
+              <v:shape w14:anchorId="545D01E2" id="_x0000_s1057" type="#_x0000_t202" style="position:absolute;left:0;text-align:left;margin-left:71.25pt;margin-top:17.6pt;width:418.5pt;height:27.75pt;z-index:251677696;visibility:visible;mso-wrap-style:square;mso-width-percent:0;mso-height-percent:0;mso-wrap-distance-left:9pt;mso-wrap-distance-top:3.6pt;mso-wrap-distance-right:9pt;mso-wrap-distance-bottom:3.6pt;mso-position-horizontal:absolute;mso-position-horizontal-relative:margin;mso-position-vertical:absolute;mso-position-vertical-relative:text;mso-width-percent:0;mso-height-percent:0;mso-width-relative:margin;mso-height-relative:margin;v-text-anchor:top" o:gfxdata="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">
                 <v:textbox>
                   <w:txbxContent>
                     <w:p>
@@ -9997,8 +10292,29 @@
         </mc:AlternateContent>
       </w:r>
       <w:r>
-        <w:t>Maak een wachtwoordbestand aan</w:t>
-      </w:r>
+        <w:t xml:space="preserve">Maak </w:t>
+      </w:r>
+      <w:proofErr w:type="spellStart"/>
+      <w:r>
+        <w:t>een</w:t>
+      </w:r>
+      <w:proofErr w:type="spellEnd"/>
+      <w:r>
+        <w:t xml:space="preserve"> </w:t>
+      </w:r>
+      <w:proofErr w:type="spellStart"/>
+      <w:r>
+        <w:t>wachtwoordbestand</w:t>
+      </w:r>
+      <w:proofErr w:type="spellEnd"/>
+      <w:r>
+        <w:t xml:space="preserve"> </w:t>
+      </w:r>
+      <w:proofErr w:type="spellStart"/>
+      <w:r>
+        <w:t>aan</w:t>
+      </w:r>
+      <w:proofErr w:type="spellEnd"/>
     </w:p>
     <w:p>
       <w:pPr>
@@ -10009,145 +10325,19 @@
         </w:numPr>
       </w:pPr>
       <w:r>
+        <w:rPr>
+          <w:noProof/>
+        </w:rPr>
         <mc:AlternateContent>
           <mc:Choice Requires="wps">
             <w:drawing>
-              <wp:anchor distT="45720" distB="45720" distL="114300" distR="114300" simplePos="0" relativeHeight="251679744" behindDoc="0" locked="0" layoutInCell="1" allowOverlap="1" wp14:anchorId="5E086E7E" wp14:editId="0E486334">
+              <wp:anchor distT="45720" distB="45720" distL="114300" distR="114300" simplePos="0" relativeHeight="251683840" behindDoc="0" locked="0" layoutInCell="1" allowOverlap="1" wp14:anchorId="574ABF9B" wp14:editId="597084A3">
                 <wp:simplePos x="0" y="0"/>
                 <wp:positionH relativeFrom="column">
-                  <wp:posOffset>899160</wp:posOffset>
+                  <wp:posOffset>939165</wp:posOffset>
                 </wp:positionH>
                 <wp:positionV relativeFrom="paragraph">
-                  <wp:posOffset>610870</wp:posOffset>
-                </wp:positionV>
-                <wp:extent cx="3368040" cy="297180"/>
-                <wp:effectExtent l="0" t="0" r="22860" b="26670"/>
-                <wp:wrapTopAndBottom/>
-                <wp:docPr id="100028390" name="Text Box 2"/>
-                <wp:cNvGraphicFramePr>
-                  <a:graphicFrameLocks xmlns:a="http://schemas.openxmlformats.org/drawingml/2006/main"/>
-                </wp:cNvGraphicFramePr>
-                <a:graphic xmlns:a="http://schemas.openxmlformats.org/drawingml/2006/main">
-                  <a:graphicData uri="http://schemas.microsoft.com/office/word/2010/wordprocessingShape">
-                    <wps:wsp>
-                      <wps:cNvSpPr txBox="1">
-                        <a:spLocks noChangeArrowheads="1"/>
-                      </wps:cNvSpPr>
-                      <wps:spPr bwMode="auto">
-                        <a:xfrm>
-                          <a:off x="0" y="0"/>
-                          <a:ext cx="3368040" cy="297180"/>
-                        </a:xfrm>
-                        <a:prstGeom prst="rect">
-                          <a:avLst/>
-                        </a:prstGeom>
-                        <a:solidFill>
-                          <a:srgbClr val="FFFFFF"/>
-                        </a:solidFill>
-                        <a:ln w="9525">
-                          <a:solidFill>
-                            <a:srgbClr val="000000"/>
-                          </a:solidFill>
-                          <a:miter lim="800000"/>
-                          <a:headEnd/>
-                          <a:tailEnd/>
-                        </a:ln>
-                      </wps:spPr>
-                      <wps:txbx>
-                        <w:txbxContent>
-                          <w:p>
-                            <w:pPr>
-                              <w:pStyle w:val="Code"/>
-                              <w:rPr>
-                                <w:lang w:val="nl-NL"/>
-                              </w:rPr>
-                            </w:pPr>
-                            <w:r>
-                              <w:rPr>
-                                <w:lang w:val="nl-NL"/>
-                              </w:rPr>
-                              <w:t>sudo nano /etc/mosquitto/</w:t>
-                            </w:r>
-                            <w:r>
-                              <w:rPr>
-                                <w:lang w:val="nl-NL"/>
-                              </w:rPr>
-                              <w:t>mosquitto</w:t>
-                            </w:r>
-                            <w:r>
-                              <w:rPr>
-                                <w:lang w:val="nl-NL"/>
-                              </w:rPr>
-                              <w:t>.conf</w:t>
-                            </w:r>
-                          </w:p>
-                        </w:txbxContent>
-                      </wps:txbx>
-                      <wps:bodyPr rot="0" vert="horz" wrap="square" lIns="91440" tIns="45720" rIns="91440" bIns="45720" anchor="t" anchorCtr="0">
-                        <a:noAutofit/>
-                      </wps:bodyPr>
-                    </wps:wsp>
-                  </a:graphicData>
-                </a:graphic>
-                <wp14:sizeRelH relativeFrom="margin">
-                  <wp14:pctWidth>0</wp14:pctWidth>
-                </wp14:sizeRelH>
-                <wp14:sizeRelV relativeFrom="margin">
-                  <wp14:pctHeight>0</wp14:pctHeight>
-                </wp14:sizeRelV>
-              </wp:anchor>
-            </w:drawing>
-          </mc:Choice>
-          <mc:Fallback>
-            <w:pict>
-              <v:shape w14:anchorId="5E086E7E" id="_x0000_s1058" type="#_x0000_t202" style="position:absolute;left:0;text-align:left;margin-left:70.8pt;margin-top:48.1pt;width:265.2pt;height:23.4pt;z-index:251679744;visibility:visible;mso-wrap-style:square;mso-width-percent:0;mso-height-percent:0;mso-wrap-distance-left:9pt;mso-wrap-distance-top:3.6pt;mso-wrap-distance-right:9pt;mso-wrap-distance-bottom:3.6pt;mso-position-horizontal:absolute;mso-position-horizontal-relative:text;mso-position-vertical:absolute;mso-position-vertical-relative:text;mso-width-percent:0;mso-height-percent:0;mso-width-relative:margin;mso-height-relative:margin;v-text-anchor:top" o:gfxdata="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">
-                <v:textbox>
-                  <w:txbxContent>
-                    <w:p>
-                      <w:pPr>
-                        <w:pStyle w:val="Code"/>
-                        <w:rPr>
-                          <w:lang w:val="nl-NL"/>
-                        </w:rPr>
-                      </w:pPr>
-                      <w:r>
-                        <w:rPr>
-                          <w:lang w:val="nl-NL"/>
-                        </w:rPr>
-                        <w:t>sudo nano /etc/mosquitto/</w:t>
-                      </w:r>
-                      <w:r>
-                        <w:rPr>
-                          <w:lang w:val="nl-NL"/>
-                        </w:rPr>
-                        <w:t>mosquitto</w:t>
-                      </w:r>
-                      <w:r>
-                        <w:rPr>
-                          <w:lang w:val="nl-NL"/>
-                        </w:rPr>
-                        <w:t>.conf</w:t>
-                      </w:r>
-                    </w:p>
-                  </w:txbxContent>
-                </v:textbox>
-                <w10:wrap type="topAndBottom"/>
-              </v:shape>
-            </w:pict>
-          </mc:Fallback>
-        </mc:AlternateContent>
-      </w:r>
-      <w:r>
-        <mc:AlternateContent>
-          <mc:Choice Requires="wps">
-            <w:drawing>
-              <wp:anchor distT="45720" distB="45720" distL="114300" distR="114300" simplePos="0" relativeHeight="251683840" behindDoc="0" locked="0" layoutInCell="1" allowOverlap="1" wp14:anchorId="574ABF9B" wp14:editId="5C80B896">
-                <wp:simplePos x="0" y="0"/>
-                <wp:positionH relativeFrom="column">
-                  <wp:posOffset>891540</wp:posOffset>
-                </wp:positionH>
-                <wp:positionV relativeFrom="paragraph">
-                  <wp:posOffset>969010</wp:posOffset>
+                  <wp:posOffset>1111885</wp:posOffset>
                 </wp:positionV>
                 <wp:extent cx="3383280" cy="601980"/>
                 <wp:effectExtent l="0" t="0" r="26670" b="26670"/>
@@ -10245,7 +10435,7 @@
           </mc:Choice>
           <mc:Fallback>
             <w:pict>
-              <v:shape w14:anchorId="574ABF9B" id="_x0000_s1059" type="#_x0000_t202" style="position:absolute;left:0;text-align:left;margin-left:70.2pt;margin-top:76.3pt;width:266.4pt;height:47.4pt;z-index:251683840;visibility:visible;mso-wrap-style:square;mso-width-percent:0;mso-height-percent:0;mso-wrap-distance-left:9pt;mso-wrap-distance-top:3.6pt;mso-wrap-distance-right:9pt;mso-wrap-distance-bottom:3.6pt;mso-position-horizontal:absolute;mso-position-horizontal-relative:text;mso-position-vertical:absolute;mso-position-vertical-relative:text;mso-width-percent:0;mso-height-percent:0;mso-width-relative:margin;mso-height-relative:margin;v-text-anchor:top" o:gfxdata="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">
+              <v:shape w14:anchorId="574ABF9B" id="_x0000_s1058" type="#_x0000_t202" style="position:absolute;left:0;text-align:left;margin-left:73.95pt;margin-top:87.55pt;width:266.4pt;height:47.4pt;z-index:251683840;visibility:visible;mso-wrap-style:square;mso-width-percent:0;mso-height-percent:0;mso-wrap-distance-left:9pt;mso-wrap-distance-top:3.6pt;mso-wrap-distance-right:9pt;mso-wrap-distance-bottom:3.6pt;mso-position-horizontal:absolute;mso-position-horizontal-relative:text;mso-position-vertical:absolute;mso-position-vertical-relative:text;mso-width-percent:0;mso-height-percent:0;mso-width-relative:margin;mso-height-relative:margin;v-text-anchor:top" o:gfxdata="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">
                 <v:textbox>
                   <w:txbxContent>
                     <w:p>
@@ -10299,13 +10489,160 @@
         </mc:AlternateContent>
       </w:r>
       <w:r>
+        <w:rPr>
+          <w:noProof/>
+        </w:rPr>
+        <mc:AlternateContent>
+          <mc:Choice Requires="wps">
+            <w:drawing>
+              <wp:anchor distT="45720" distB="45720" distL="114300" distR="114300" simplePos="0" relativeHeight="251679744" behindDoc="0" locked="0" layoutInCell="1" allowOverlap="1" wp14:anchorId="5E086E7E" wp14:editId="2F08DDB4">
+                <wp:simplePos x="0" y="0"/>
+                <wp:positionH relativeFrom="column">
+                  <wp:posOffset>946785</wp:posOffset>
+                </wp:positionH>
+                <wp:positionV relativeFrom="paragraph">
+                  <wp:posOffset>725170</wp:posOffset>
+                </wp:positionV>
+                <wp:extent cx="3368040" cy="297180"/>
+                <wp:effectExtent l="0" t="0" r="22860" b="26670"/>
+                <wp:wrapTopAndBottom/>
+                <wp:docPr id="100028390" name="Text Box 2"/>
+                <wp:cNvGraphicFramePr>
+                  <a:graphicFrameLocks xmlns:a="http://schemas.openxmlformats.org/drawingml/2006/main"/>
+                </wp:cNvGraphicFramePr>
+                <a:graphic xmlns:a="http://schemas.openxmlformats.org/drawingml/2006/main">
+                  <a:graphicData uri="http://schemas.microsoft.com/office/word/2010/wordprocessingShape">
+                    <wps:wsp>
+                      <wps:cNvSpPr txBox="1">
+                        <a:spLocks noChangeArrowheads="1"/>
+                      </wps:cNvSpPr>
+                      <wps:spPr bwMode="auto">
+                        <a:xfrm>
+                          <a:off x="0" y="0"/>
+                          <a:ext cx="3368040" cy="297180"/>
+                        </a:xfrm>
+                        <a:prstGeom prst="rect">
+                          <a:avLst/>
+                        </a:prstGeom>
+                        <a:solidFill>
+                          <a:srgbClr val="FFFFFF"/>
+                        </a:solidFill>
+                        <a:ln w="9525">
+                          <a:solidFill>
+                            <a:srgbClr val="000000"/>
+                          </a:solidFill>
+                          <a:miter lim="800000"/>
+                          <a:headEnd/>
+                          <a:tailEnd/>
+                        </a:ln>
+                      </wps:spPr>
+                      <wps:txbx>
+                        <w:txbxContent>
+                          <w:p>
+                            <w:pPr>
+                              <w:pStyle w:val="Code"/>
+                              <w:rPr>
+                                <w:lang w:val="nl-NL"/>
+                              </w:rPr>
+                            </w:pPr>
+                            <w:r>
+                              <w:rPr>
+                                <w:lang w:val="nl-NL"/>
+                              </w:rPr>
+                              <w:t>sudo nano /etc/mosquitto/</w:t>
+                            </w:r>
+                            <w:r>
+                              <w:rPr>
+                                <w:lang w:val="nl-NL"/>
+                              </w:rPr>
+                              <w:t>mosquitto</w:t>
+                            </w:r>
+                            <w:r>
+                              <w:rPr>
+                                <w:lang w:val="nl-NL"/>
+                              </w:rPr>
+                              <w:t>.conf</w:t>
+                            </w:r>
+                          </w:p>
+                        </w:txbxContent>
+                      </wps:txbx>
+                      <wps:bodyPr rot="0" vert="horz" wrap="square" lIns="91440" tIns="45720" rIns="91440" bIns="45720" anchor="t" anchorCtr="0">
+                        <a:noAutofit/>
+                      </wps:bodyPr>
+                    </wps:wsp>
+                  </a:graphicData>
+                </a:graphic>
+                <wp14:sizeRelH relativeFrom="margin">
+                  <wp14:pctWidth>0</wp14:pctWidth>
+                </wp14:sizeRelH>
+                <wp14:sizeRelV relativeFrom="margin">
+                  <wp14:pctHeight>0</wp14:pctHeight>
+                </wp14:sizeRelV>
+              </wp:anchor>
+            </w:drawing>
+          </mc:Choice>
+          <mc:Fallback>
+            <w:pict>
+              <v:shape w14:anchorId="5E086E7E" id="_x0000_s1059" type="#_x0000_t202" style="position:absolute;left:0;text-align:left;margin-left:74.55pt;margin-top:57.1pt;width:265.2pt;height:23.4pt;z-index:251679744;visibility:visible;mso-wrap-style:square;mso-width-percent:0;mso-height-percent:0;mso-wrap-distance-left:9pt;mso-wrap-distance-top:3.6pt;mso-wrap-distance-right:9pt;mso-wrap-distance-bottom:3.6pt;mso-position-horizontal:absolute;mso-position-horizontal-relative:text;mso-position-vertical:absolute;mso-position-vertical-relative:text;mso-width-percent:0;mso-height-percent:0;mso-width-relative:margin;mso-height-relative:margin;v-text-anchor:top" o:gfxdata="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">
+                <v:textbox>
+                  <w:txbxContent>
+                    <w:p>
+                      <w:pPr>
+                        <w:pStyle w:val="Code"/>
+                        <w:rPr>
+                          <w:lang w:val="nl-NL"/>
+                        </w:rPr>
+                      </w:pPr>
+                      <w:r>
+                        <w:rPr>
+                          <w:lang w:val="nl-NL"/>
+                        </w:rPr>
+                        <w:t>sudo nano /etc/mosquitto/</w:t>
+                      </w:r>
+                      <w:r>
+                        <w:rPr>
+                          <w:lang w:val="nl-NL"/>
+                        </w:rPr>
+                        <w:t>mosquitto</w:t>
+                      </w:r>
+                      <w:r>
+                        <w:rPr>
+                          <w:lang w:val="nl-NL"/>
+                        </w:rPr>
+                        <w:t>.conf</w:t>
+                      </w:r>
+                    </w:p>
+                  </w:txbxContent>
+                </v:textbox>
+                <w10:wrap type="topAndBottom"/>
+              </v:shape>
+            </w:pict>
+          </mc:Fallback>
+        </mc:AlternateContent>
+      </w:r>
+      <w:proofErr w:type="spellStart"/>
+      <w:r>
         <w:t>Bewerk</w:t>
       </w:r>
-      <w:r>
-        <w:t xml:space="preserve"> het configuratiebestand</w:t>
-      </w:r>
-      <w:r>
-        <w:t xml:space="preserve"> en </w:t>
+      <w:proofErr w:type="spellEnd"/>
+      <w:r>
+        <w:t xml:space="preserve"> het </w:t>
+      </w:r>
+      <w:proofErr w:type="spellStart"/>
+      <w:r>
+        <w:t>configuratiebestand</w:t>
+      </w:r>
+      <w:proofErr w:type="spellEnd"/>
+      <w:r>
+        <w:t xml:space="preserve"> </w:t>
+      </w:r>
+      <w:proofErr w:type="spellStart"/>
+      <w:r>
+        <w:t>en</w:t>
+      </w:r>
+      <w:proofErr w:type="spellEnd"/>
+      <w:r>
+        <w:t xml:space="preserve"> </w:t>
       </w:r>
       <w:r>
         <w:t>voeg volgende lijnen toe</w:t>
@@ -10320,16 +10657,19 @@
         </w:numPr>
       </w:pPr>
       <w:r>
+        <w:rPr>
+          <w:noProof/>
+        </w:rPr>
         <mc:AlternateContent>
           <mc:Choice Requires="wps">
             <w:drawing>
-              <wp:anchor distT="45720" distB="45720" distL="114300" distR="114300" simplePos="0" relativeHeight="251681792" behindDoc="0" locked="0" layoutInCell="1" allowOverlap="1" wp14:anchorId="4D06652B" wp14:editId="1760A962">
+              <wp:anchor distT="45720" distB="45720" distL="114300" distR="114300" simplePos="0" relativeHeight="251681792" behindDoc="0" locked="0" layoutInCell="1" allowOverlap="1" wp14:anchorId="4D06652B" wp14:editId="4CF7FBF5">
                 <wp:simplePos x="0" y="0"/>
                 <wp:positionH relativeFrom="column">
-                  <wp:posOffset>891540</wp:posOffset>
+                  <wp:posOffset>910590</wp:posOffset>
                 </wp:positionH>
                 <wp:positionV relativeFrom="paragraph">
-                  <wp:posOffset>1308735</wp:posOffset>
+                  <wp:posOffset>1423035</wp:posOffset>
                 </wp:positionV>
                 <wp:extent cx="2360930" cy="297180"/>
                 <wp:effectExtent l="0" t="0" r="12700" b="26670"/>
@@ -10399,7 +10739,7 @@
           </mc:Choice>
           <mc:Fallback>
             <w:pict>
-              <v:shape w14:anchorId="4D06652B" id="_x0000_s1060" type="#_x0000_t202" style="position:absolute;left:0;text-align:left;margin-left:70.2pt;margin-top:103.05pt;width:185.9pt;height:23.4pt;z-index:251681792;visibility:visible;mso-wrap-style:square;mso-width-percent:400;mso-height-percent:0;mso-wrap-distance-left:9pt;mso-wrap-distance-top:3.6pt;mso-wrap-distance-right:9pt;mso-wrap-distance-bottom:3.6pt;mso-position-horizontal:absolute;mso-position-horizontal-relative:text;mso-position-vertical:absolute;mso-position-vertical-relative:text;mso-width-percent:400;mso-height-percent:0;mso-width-relative:margin;mso-height-relative:margin;v-text-anchor:top" o:gfxdata="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">
+              <v:shape w14:anchorId="4D06652B" id="_x0000_s1060" type="#_x0000_t202" style="position:absolute;left:0;text-align:left;margin-left:71.7pt;margin-top:112.05pt;width:185.9pt;height:23.4pt;z-index:251681792;visibility:visible;mso-wrap-style:square;mso-width-percent:400;mso-height-percent:0;mso-wrap-distance-left:9pt;mso-wrap-distance-top:3.6pt;mso-wrap-distance-right:9pt;mso-wrap-distance-bottom:3.6pt;mso-position-horizontal:absolute;mso-position-horizontal-relative:text;mso-position-vertical:absolute;mso-position-vertical-relative:text;mso-width-percent:400;mso-height-percent:0;mso-width-relative:margin;mso-height-relative:margin;v-text-anchor:top" o:gfxdata="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">
                 <v:textbox>
                   <w:txbxContent>
                     <w:p>
@@ -10424,8 +10764,13 @@
           </mc:Fallback>
         </mc:AlternateContent>
       </w:r>
-      <w:r>
-        <w:t>Herstart Mosquitto Service</w:t>
+      <w:proofErr w:type="spellStart"/>
+      <w:r>
+        <w:t>Herstart</w:t>
+      </w:r>
+      <w:proofErr w:type="spellEnd"/>
+      <w:r>
+        <w:t xml:space="preserve"> Mosquitto Service</w:t>
       </w:r>
     </w:p>
     <w:p>
@@ -10447,10 +10792,13 @@
         </w:numPr>
       </w:pPr>
       <w:r>
+        <w:rPr>
+          <w:noProof/>
+        </w:rPr>
         <mc:AlternateContent>
           <mc:Choice Requires="wps">
             <w:drawing>
-              <wp:anchor distT="45720" distB="45720" distL="114300" distR="114300" simplePos="0" relativeHeight="251685888" behindDoc="0" locked="0" layoutInCell="1" allowOverlap="1" wp14:anchorId="2666B99B" wp14:editId="33CCCA90">
+              <wp:anchor distT="45720" distB="45720" distL="114300" distR="114300" simplePos="0" relativeHeight="251685888" behindDoc="0" locked="0" layoutInCell="1" allowOverlap="1" wp14:anchorId="2666B99B" wp14:editId="098D7547">
                 <wp:simplePos x="0" y="0"/>
                 <wp:positionH relativeFrom="margin">
                   <wp:posOffset>457200</wp:posOffset>
@@ -10551,8 +10899,13 @@
           </mc:Fallback>
         </mc:AlternateContent>
       </w:r>
-      <w:r>
-        <w:t>Installeer Node.js &amp; Node-RED</w:t>
+      <w:proofErr w:type="spellStart"/>
+      <w:r>
+        <w:t>Installeer</w:t>
+      </w:r>
+      <w:proofErr w:type="spellEnd"/>
+      <w:r>
+        <w:t xml:space="preserve"> Node.js &amp; Node-RED</w:t>
       </w:r>
     </w:p>
     <w:p>
@@ -10564,16 +10917,127 @@
         </w:numPr>
       </w:pPr>
       <w:r>
+        <w:rPr>
+          <w:noProof/>
+        </w:rPr>
         <mc:AlternateContent>
           <mc:Choice Requires="wps">
             <w:drawing>
-              <wp:anchor distT="45720" distB="45720" distL="114300" distR="114300" simplePos="0" relativeHeight="251687936" behindDoc="0" locked="0" layoutInCell="1" allowOverlap="1" wp14:anchorId="176F8F01" wp14:editId="599E560E">
+              <wp:anchor distT="45720" distB="45720" distL="114300" distR="114300" simplePos="0" relativeHeight="251689984" behindDoc="0" locked="0" layoutInCell="1" allowOverlap="1" wp14:anchorId="00766AC3" wp14:editId="39FA995B">
                 <wp:simplePos x="0" y="0"/>
                 <wp:positionH relativeFrom="margin">
-                  <wp:posOffset>449580</wp:posOffset>
+                  <wp:posOffset>508635</wp:posOffset>
                 </wp:positionH>
                 <wp:positionV relativeFrom="paragraph">
-                  <wp:posOffset>759460</wp:posOffset>
+                  <wp:posOffset>1382395</wp:posOffset>
+                </wp:positionV>
+                <wp:extent cx="1844040" cy="304800"/>
+                <wp:effectExtent l="0" t="0" r="22860" b="19050"/>
+                <wp:wrapTopAndBottom/>
+                <wp:docPr id="1860973823" name="Text Box 2"/>
+                <wp:cNvGraphicFramePr>
+                  <a:graphicFrameLocks xmlns:a="http://schemas.openxmlformats.org/drawingml/2006/main"/>
+                </wp:cNvGraphicFramePr>
+                <a:graphic xmlns:a="http://schemas.openxmlformats.org/drawingml/2006/main">
+                  <a:graphicData uri="http://schemas.microsoft.com/office/word/2010/wordprocessingShape">
+                    <wps:wsp>
+                      <wps:cNvSpPr txBox="1">
+                        <a:spLocks noChangeArrowheads="1"/>
+                      </wps:cNvSpPr>
+                      <wps:spPr bwMode="auto">
+                        <a:xfrm>
+                          <a:off x="0" y="0"/>
+                          <a:ext cx="1844040" cy="304800"/>
+                        </a:xfrm>
+                        <a:prstGeom prst="rect">
+                          <a:avLst/>
+                        </a:prstGeom>
+                        <a:solidFill>
+                          <a:srgbClr val="FFFFFF"/>
+                        </a:solidFill>
+                        <a:ln w="9525">
+                          <a:solidFill>
+                            <a:srgbClr val="000000"/>
+                          </a:solidFill>
+                          <a:miter lim="800000"/>
+                          <a:headEnd/>
+                          <a:tailEnd/>
+                        </a:ln>
+                      </wps:spPr>
+                      <wps:txbx>
+                        <w:txbxContent>
+                          <w:p>
+                            <w:pPr>
+                              <w:pStyle w:val="Code"/>
+                              <w:rPr>
+                                <w:lang w:val="nl-NL"/>
+                              </w:rPr>
+                            </w:pPr>
+                            <w:r>
+                              <w:rPr>
+                                <w:lang w:val="nl-NL"/>
+                              </w:rPr>
+                              <w:t>Node-red-start</w:t>
+                            </w:r>
+                          </w:p>
+                        </w:txbxContent>
+                      </wps:txbx>
+                      <wps:bodyPr rot="0" vert="horz" wrap="square" lIns="91440" tIns="45720" rIns="91440" bIns="45720" anchor="t" anchorCtr="0">
+                        <a:noAutofit/>
+                      </wps:bodyPr>
+                    </wps:wsp>
+                  </a:graphicData>
+                </a:graphic>
+                <wp14:sizeRelH relativeFrom="margin">
+                  <wp14:pctWidth>0</wp14:pctWidth>
+                </wp14:sizeRelH>
+                <wp14:sizeRelV relativeFrom="margin">
+                  <wp14:pctHeight>0</wp14:pctHeight>
+                </wp14:sizeRelV>
+              </wp:anchor>
+            </w:drawing>
+          </mc:Choice>
+          <mc:Fallback>
+            <w:pict>
+              <v:shape w14:anchorId="00766AC3" id="_x0000_s1062" type="#_x0000_t202" style="position:absolute;left:0;text-align:left;margin-left:40.05pt;margin-top:108.85pt;width:145.2pt;height:24pt;z-index:251689984;visibility:visible;mso-wrap-style:square;mso-width-percent:0;mso-height-percent:0;mso-wrap-distance-left:9pt;mso-wrap-distance-top:3.6pt;mso-wrap-distance-right:9pt;mso-wrap-distance-bottom:3.6pt;mso-position-horizontal:absolute;mso-position-horizontal-relative:margin;mso-position-vertical:absolute;mso-position-vertical-relative:text;mso-width-percent:0;mso-height-percent:0;mso-width-relative:margin;mso-height-relative:margin;v-text-anchor:top" o:gfxdata="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">
+                <v:textbox>
+                  <w:txbxContent>
+                    <w:p>
+                      <w:pPr>
+                        <w:pStyle w:val="Code"/>
+                        <w:rPr>
+                          <w:lang w:val="nl-NL"/>
+                        </w:rPr>
+                      </w:pPr>
+                      <w:r>
+                        <w:rPr>
+                          <w:lang w:val="nl-NL"/>
+                        </w:rPr>
+                        <w:t>Node-red-start</w:t>
+                      </w:r>
+                    </w:p>
+                  </w:txbxContent>
+                </v:textbox>
+                <w10:wrap type="topAndBottom" anchorx="margin"/>
+              </v:shape>
+            </w:pict>
+          </mc:Fallback>
+        </mc:AlternateContent>
+      </w:r>
+      <w:r>
+        <w:rPr>
+          <w:noProof/>
+        </w:rPr>
+        <mc:AlternateContent>
+          <mc:Choice Requires="wps">
+            <w:drawing>
+              <wp:anchor distT="45720" distB="45720" distL="114300" distR="114300" simplePos="0" relativeHeight="251687936" behindDoc="0" locked="0" layoutInCell="1" allowOverlap="1" wp14:anchorId="176F8F01" wp14:editId="6C9E7E27">
+                <wp:simplePos x="0" y="0"/>
+                <wp:positionH relativeFrom="margin">
+                  <wp:posOffset>468630</wp:posOffset>
+                </wp:positionH>
+                <wp:positionV relativeFrom="paragraph">
+                  <wp:posOffset>807085</wp:posOffset>
                 </wp:positionV>
                 <wp:extent cx="3124200" cy="304800"/>
                 <wp:effectExtent l="0" t="0" r="19050" b="19050"/>
@@ -10643,7 +11107,7 @@
           </mc:Choice>
           <mc:Fallback>
             <w:pict>
-              <v:shape w14:anchorId="176F8F01" id="_x0000_s1062" type="#_x0000_t202" style="position:absolute;left:0;text-align:left;margin-left:35.4pt;margin-top:59.8pt;width:246pt;height:24pt;z-index:251687936;visibility:visible;mso-wrap-style:square;mso-width-percent:0;mso-height-percent:0;mso-wrap-distance-left:9pt;mso-wrap-distance-top:3.6pt;mso-wrap-distance-right:9pt;mso-wrap-distance-bottom:3.6pt;mso-position-horizontal:absolute;mso-position-horizontal-relative:margin;mso-position-vertical:absolute;mso-position-vertical-relative:text;mso-width-percent:0;mso-height-percent:0;mso-width-relative:margin;mso-height-relative:margin;v-text-anchor:top" o:gfxdata="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">
+              <v:shape w14:anchorId="176F8F01" id="_x0000_s1063" type="#_x0000_t202" style="position:absolute;left:0;text-align:left;margin-left:36.9pt;margin-top:63.55pt;width:246pt;height:24pt;z-index:251687936;visibility:visible;mso-wrap-style:square;mso-width-percent:0;mso-height-percent:0;mso-wrap-distance-left:9pt;mso-wrap-distance-top:3.6pt;mso-wrap-distance-right:9pt;mso-wrap-distance-bottom:3.6pt;mso-position-horizontal:absolute;mso-position-horizontal-relative:margin;mso-position-vertical:absolute;mso-position-vertical-relative:text;mso-width-percent:0;mso-height-percent:0;mso-width-relative:margin;mso-height-relative:margin;v-text-anchor:top" o:gfxdata="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">
                 <v:textbox>
                   <w:txbxContent>
                     <w:p>
@@ -10669,7 +11133,23 @@
         </mc:AlternateContent>
       </w:r>
       <w:r>
-        <w:t>Start Node-RED automatisch bij opstarten</w:t>
+        <w:t xml:space="preserve">Start Node-RED </w:t>
+      </w:r>
+      <w:proofErr w:type="spellStart"/>
+      <w:r>
+        <w:t>automatisch</w:t>
+      </w:r>
+      <w:proofErr w:type="spellEnd"/>
+      <w:r>
+        <w:t xml:space="preserve"> </w:t>
+      </w:r>
+      <w:proofErr w:type="spellStart"/>
+      <w:r>
+        <w:t>bij</w:t>
+      </w:r>
+      <w:proofErr w:type="spellEnd"/>
+      <w:r>
+        <w:t xml:space="preserve"> opstarten</w:t>
       </w:r>
     </w:p>
     <w:p>
@@ -10681,111 +11161,6 @@
         </w:numPr>
       </w:pPr>
       <w:r>
-        <mc:AlternateContent>
-          <mc:Choice Requires="wps">
-            <w:drawing>
-              <wp:anchor distT="45720" distB="45720" distL="114300" distR="114300" simplePos="0" relativeHeight="251689984" behindDoc="0" locked="0" layoutInCell="1" allowOverlap="1" wp14:anchorId="00766AC3" wp14:editId="785F9C17">
-                <wp:simplePos x="0" y="0"/>
-                <wp:positionH relativeFrom="margin">
-                  <wp:posOffset>441960</wp:posOffset>
-                </wp:positionH>
-                <wp:positionV relativeFrom="paragraph">
-                  <wp:posOffset>602615</wp:posOffset>
-                </wp:positionV>
-                <wp:extent cx="1844040" cy="304800"/>
-                <wp:effectExtent l="0" t="0" r="22860" b="19050"/>
-                <wp:wrapTopAndBottom/>
-                <wp:docPr id="1860973823" name="Text Box 2"/>
-                <wp:cNvGraphicFramePr>
-                  <a:graphicFrameLocks xmlns:a="http://schemas.openxmlformats.org/drawingml/2006/main"/>
-                </wp:cNvGraphicFramePr>
-                <a:graphic xmlns:a="http://schemas.openxmlformats.org/drawingml/2006/main">
-                  <a:graphicData uri="http://schemas.microsoft.com/office/word/2010/wordprocessingShape">
-                    <wps:wsp>
-                      <wps:cNvSpPr txBox="1">
-                        <a:spLocks noChangeArrowheads="1"/>
-                      </wps:cNvSpPr>
-                      <wps:spPr bwMode="auto">
-                        <a:xfrm>
-                          <a:off x="0" y="0"/>
-                          <a:ext cx="1844040" cy="304800"/>
-                        </a:xfrm>
-                        <a:prstGeom prst="rect">
-                          <a:avLst/>
-                        </a:prstGeom>
-                        <a:solidFill>
-                          <a:srgbClr val="FFFFFF"/>
-                        </a:solidFill>
-                        <a:ln w="9525">
-                          <a:solidFill>
-                            <a:srgbClr val="000000"/>
-                          </a:solidFill>
-                          <a:miter lim="800000"/>
-                          <a:headEnd/>
-                          <a:tailEnd/>
-                        </a:ln>
-                      </wps:spPr>
-                      <wps:txbx>
-                        <w:txbxContent>
-                          <w:p>
-                            <w:pPr>
-                              <w:pStyle w:val="Code"/>
-                              <w:rPr>
-                                <w:lang w:val="nl-NL"/>
-                              </w:rPr>
-                            </w:pPr>
-                            <w:r>
-                              <w:rPr>
-                                <w:lang w:val="nl-NL"/>
-                              </w:rPr>
-                              <w:t>Node-red-start</w:t>
-                            </w:r>
-                          </w:p>
-                        </w:txbxContent>
-                      </wps:txbx>
-                      <wps:bodyPr rot="0" vert="horz" wrap="square" lIns="91440" tIns="45720" rIns="91440" bIns="45720" anchor="t" anchorCtr="0">
-                        <a:noAutofit/>
-                      </wps:bodyPr>
-                    </wps:wsp>
-                  </a:graphicData>
-                </a:graphic>
-                <wp14:sizeRelH relativeFrom="margin">
-                  <wp14:pctWidth>0</wp14:pctWidth>
-                </wp14:sizeRelH>
-                <wp14:sizeRelV relativeFrom="margin">
-                  <wp14:pctHeight>0</wp14:pctHeight>
-                </wp14:sizeRelV>
-              </wp:anchor>
-            </w:drawing>
-          </mc:Choice>
-          <mc:Fallback>
-            <w:pict>
-              <v:shape w14:anchorId="00766AC3" id="_x0000_s1063" type="#_x0000_t202" style="position:absolute;left:0;text-align:left;margin-left:34.8pt;margin-top:47.45pt;width:145.2pt;height:24pt;z-index:251689984;visibility:visible;mso-wrap-style:square;mso-width-percent:0;mso-height-percent:0;mso-wrap-distance-left:9pt;mso-wrap-distance-top:3.6pt;mso-wrap-distance-right:9pt;mso-wrap-distance-bottom:3.6pt;mso-position-horizontal:absolute;mso-position-horizontal-relative:margin;mso-position-vertical:absolute;mso-position-vertical-relative:text;mso-width-percent:0;mso-height-percent:0;mso-width-relative:margin;mso-height-relative:margin;v-text-anchor:top" o:gfxdata="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">
-                <v:textbox>
-                  <w:txbxContent>
-                    <w:p>
-                      <w:pPr>
-                        <w:pStyle w:val="Code"/>
-                        <w:rPr>
-                          <w:lang w:val="nl-NL"/>
-                        </w:rPr>
-                      </w:pPr>
-                      <w:r>
-                        <w:rPr>
-                          <w:lang w:val="nl-NL"/>
-                        </w:rPr>
-                        <w:t>Node-red-start</w:t>
-                      </w:r>
-                    </w:p>
-                  </w:txbxContent>
-                </v:textbox>
-                <w10:wrap type="topAndBottom" anchorx="margin"/>
-              </v:shape>
-            </w:pict>
-          </mc:Fallback>
-        </mc:AlternateContent>
-      </w:r>
-      <w:r>
         <w:t>Start Node-RED</w:t>
       </w:r>
     </w:p>
@@ -10798,6 +11173,9 @@
         </w:numPr>
       </w:pPr>
       <w:r>
+        <w:rPr>
+          <w:noProof/>
+        </w:rPr>
         <w:drawing>
           <wp:anchor distT="0" distB="0" distL="114300" distR="114300" simplePos="0" relativeHeight="251737088" behindDoc="0" locked="0" layoutInCell="1" allowOverlap="1" wp14:anchorId="188BCF8D" wp14:editId="1B457FFD">
             <wp:simplePos x="0" y="0"/>
@@ -10930,6 +11308,9 @@
         </w:numPr>
       </w:pPr>
       <w:r>
+        <w:rPr>
+          <w:noProof/>
+        </w:rPr>
         <w:lastRenderedPageBreak/>
         <w:drawing>
           <wp:anchor distT="0" distB="0" distL="114300" distR="114300" simplePos="0" relativeHeight="251709440" behindDoc="0" locked="0" layoutInCell="1" allowOverlap="1" wp14:anchorId="08801812" wp14:editId="0B66C607">
@@ -11030,6 +11411,9 @@
         </w:numPr>
       </w:pPr>
       <w:r>
+        <w:rPr>
+          <w:noProof/>
+        </w:rPr>
         <w:drawing>
           <wp:anchor distT="0" distB="0" distL="114300" distR="114300" simplePos="0" relativeHeight="251738112" behindDoc="0" locked="0" layoutInCell="1" allowOverlap="1" wp14:anchorId="39BC8E3F" wp14:editId="562C2320">
             <wp:simplePos x="0" y="0"/>
@@ -11138,6 +11522,9 @@
         </w:numPr>
       </w:pPr>
       <w:r>
+        <w:rPr>
+          <w:noProof/>
+        </w:rPr>
         <w:drawing>
           <wp:anchor distT="0" distB="0" distL="114300" distR="114300" simplePos="0" relativeHeight="251754496" behindDoc="0" locked="0" layoutInCell="1" allowOverlap="1" wp14:anchorId="1BB278CC" wp14:editId="09E768FE">
             <wp:simplePos x="0" y="0"/>
@@ -11237,12 +11624,15 @@
       <w:bookmarkStart w:id="20" w:name="_Toc199317608"/>
       <w:bookmarkStart w:id="21" w:name="_Ref199322619"/>
       <w:r>
+        <w:rPr>
+          <w:noProof/>
+        </w:rPr>
         <w:lastRenderedPageBreak/>
         <w:drawing>
-          <wp:anchor distT="0" distB="0" distL="114300" distR="114300" simplePos="0" relativeHeight="251741184" behindDoc="1" locked="0" layoutInCell="1" allowOverlap="1" wp14:anchorId="23C9E24A" wp14:editId="5E4F7265">
+          <wp:anchor distT="0" distB="0" distL="114300" distR="114300" simplePos="0" relativeHeight="251741184" behindDoc="1" locked="0" layoutInCell="1" allowOverlap="1" wp14:anchorId="23C9E24A" wp14:editId="157B4576">
             <wp:simplePos x="0" y="0"/>
             <wp:positionH relativeFrom="margin">
-              <wp:posOffset>2529840</wp:posOffset>
+              <wp:align>right</wp:align>
             </wp:positionH>
             <wp:positionV relativeFrom="paragraph">
               <wp:posOffset>114300</wp:posOffset>
@@ -11400,12 +11790,18 @@
     <w:p/>
     <w:p/>
     <w:p/>
+    <w:p/>
+    <w:p/>
+    <w:p/>
     <w:p>
       <w:pPr>
         <w:pStyle w:val="Heading2"/>
       </w:pPr>
       <w:bookmarkStart w:id="22" w:name="_Toc199317609"/>
       <w:r>
+        <w:rPr>
+          <w:noProof/>
+        </w:rPr>
         <w:drawing>
           <wp:anchor distT="0" distB="0" distL="114300" distR="114300" simplePos="0" relativeHeight="251732992" behindDoc="0" locked="0" layoutInCell="1" allowOverlap="1" wp14:anchorId="42719814" wp14:editId="55ED5953">
             <wp:simplePos x="0" y="0"/>
@@ -11605,14 +12001,17 @@
         </w:numPr>
       </w:pPr>
       <w:r>
+        <w:rPr>
+          <w:noProof/>
+        </w:rPr>
         <w:drawing>
-          <wp:anchor distT="0" distB="0" distL="114300" distR="114300" simplePos="0" relativeHeight="251734016" behindDoc="0" locked="0" layoutInCell="1" allowOverlap="1" wp14:anchorId="1CDA12FD" wp14:editId="1C660366">
+          <wp:anchor distT="0" distB="0" distL="114300" distR="114300" simplePos="0" relativeHeight="251734016" behindDoc="0" locked="0" layoutInCell="1" allowOverlap="1" wp14:anchorId="1CDA12FD" wp14:editId="56F6741B">
             <wp:simplePos x="0" y="0"/>
             <wp:positionH relativeFrom="margin">
-              <wp:align>center</wp:align>
+              <wp:align>right</wp:align>
             </wp:positionH>
             <wp:positionV relativeFrom="paragraph">
-              <wp:posOffset>305493</wp:posOffset>
+              <wp:posOffset>143510</wp:posOffset>
             </wp:positionV>
             <wp:extent cx="3790950" cy="2560320"/>
             <wp:effectExtent l="133350" t="114300" r="152400" b="163830"/>
@@ -11695,10 +12094,17 @@
         <w:t xml:space="preserve">Upload de </w:t>
       </w:r>
       <w:r>
-        <w:t>code naar de microcontroller</w:t>
+        <w:t xml:space="preserve">code </w:t>
+      </w:r>
+      <w:proofErr w:type="spellStart"/>
+      <w:r>
+        <w:t>naar</w:t>
+      </w:r>
+      <w:proofErr w:type="spellEnd"/>
+      <w:r>
+        <w:t xml:space="preserve"> de microcontroller</w:t>
       </w:r>
     </w:p>
-    <w:p/>
     <w:p/>
     <w:p/>
     <w:p/>
@@ -11711,13 +12117,13 @@
         <mc:AlternateContent>
           <mc:Choice Requires="wpi">
             <w:drawing>
-              <wp:anchor distT="0" distB="0" distL="114300" distR="114300" simplePos="0" relativeHeight="251758592" behindDoc="0" locked="0" layoutInCell="1" allowOverlap="1" wp14:anchorId="77DB947D" wp14:editId="7C110968">
+              <wp:anchor distT="0" distB="0" distL="114300" distR="114300" simplePos="0" relativeHeight="251758592" behindDoc="0" locked="0" layoutInCell="1" allowOverlap="1" wp14:anchorId="77DB947D" wp14:editId="034F2121">
                 <wp:simplePos x="0" y="0"/>
                 <wp:positionH relativeFrom="column">
-                  <wp:posOffset>2790132</wp:posOffset>
+                  <wp:posOffset>3627755</wp:posOffset>
                 </wp:positionH>
                 <wp:positionV relativeFrom="paragraph">
-                  <wp:posOffset>40640</wp:posOffset>
+                  <wp:posOffset>182245</wp:posOffset>
                 </wp:positionV>
                 <wp:extent cx="631190" cy="635"/>
                 <wp:effectExtent l="76200" t="95250" r="73660" b="94615"/>
@@ -11745,7 +12151,7 @@
           </mc:Choice>
           <mc:Fallback>
             <w:pict>
-              <v:shapetype w14:anchorId="25D6EA5E" id="_x0000_t75" coordsize="21600,21600" o:spt="75" o:preferrelative="t" path="m@4@5l@4@11@9@11@9@5xe" filled="f" stroked="f">
+              <v:shapetype w14:anchorId="44728E67" id="_x0000_t75" coordsize="21600,21600" o:spt="75" o:preferrelative="t" path="m@4@5l@4@11@9@11@9@5xe" filled="f" stroked="f">
                 <v:stroke joinstyle="miter"/>
                 <v:formulas>
                   <v:f eqn="if lineDrawn pixelLineWidth 0"/>
@@ -11764,7 +12170,7 @@
                 <v:path o:extrusionok="f" gradientshapeok="t" o:connecttype="rect"/>
                 <o:lock v:ext="edit" aspectratio="t"/>
               </v:shapetype>
-              <v:shape id="Ink 8" o:spid="_x0000_s1026" type="#_x0000_t75" style="position:absolute;margin-left:216.9pt;margin-top:-1.8pt;width:55.35pt;height:10pt;z-index:251758592;visibility:visible;mso-wrap-style:square;mso-width-percent:0;mso-wrap-distance-left:9pt;mso-wrap-distance-top:0;mso-wrap-distance-right:9pt;mso-wrap-distance-bottom:0;mso-position-horizontal:absolute;mso-position-horizontal-relative:text;mso-position-vertical:absolute;mso-position-vertical-relative:text;mso-width-percent:0;mso-width-relative:margin" o:gfxdata="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">
+              <v:shape id="Ink 8" o:spid="_x0000_s1026" type="#_x0000_t75" style="position:absolute;margin-left:282.8pt;margin-top:9.35pt;width:55.35pt;height:10pt;z-index:251758592;visibility:visible;mso-wrap-style:square;mso-width-percent:0;mso-wrap-distance-left:9pt;mso-wrap-distance-top:0;mso-wrap-distance-right:9pt;mso-wrap-distance-bottom:0;mso-position-horizontal:absolute;mso-position-horizontal-relative:text;mso-position-vertical:absolute;mso-position-vertical-relative:text;mso-width-percent:0;mso-width-relative:margin" o:gfxdata="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">
                 <v:imagedata r:id="rId50" o:title=""/>
               </v:shape>
             </w:pict>
@@ -11772,6 +12178,12 @@
         </mc:AlternateContent>
       </w:r>
     </w:p>
+    <w:p/>
+    <w:p/>
+    <w:p/>
+    <w:p/>
+    <w:p/>
+    <w:p/>
     <w:p>
       <w:pPr>
         <w:pStyle w:val="Heading1"/>
@@ -11853,14 +12265,17 @@
     </w:p>
     <w:p>
       <w:r>
+        <w:rPr>
+          <w:noProof/>
+        </w:rPr>
         <w:drawing>
-          <wp:anchor distT="0" distB="0" distL="114300" distR="114300" simplePos="0" relativeHeight="251736064" behindDoc="0" locked="0" layoutInCell="1" allowOverlap="1" wp14:anchorId="0D28C42A" wp14:editId="3AA8C577">
+          <wp:anchor distT="0" distB="0" distL="114300" distR="114300" simplePos="0" relativeHeight="251736064" behindDoc="0" locked="0" layoutInCell="1" allowOverlap="1" wp14:anchorId="0D28C42A" wp14:editId="1F71CA2C">
             <wp:simplePos x="0" y="0"/>
             <wp:positionH relativeFrom="margin">
               <wp:align>center</wp:align>
             </wp:positionH>
             <wp:positionV relativeFrom="paragraph">
-              <wp:posOffset>510540</wp:posOffset>
+              <wp:posOffset>507448</wp:posOffset>
             </wp:positionV>
             <wp:extent cx="5731510" cy="5410200"/>
             <wp:effectExtent l="133350" t="114300" r="135890" b="171450"/>
@@ -11941,7 +12356,23 @@
         <w:t>De</w:t>
       </w:r>
       <w:r>
-        <w:t xml:space="preserve"> formulieren maken het eenvoudig </w:t>
+        <w:t xml:space="preserve"> </w:t>
+      </w:r>
+      <w:proofErr w:type="spellStart"/>
+      <w:r>
+        <w:t>formulieren</w:t>
+      </w:r>
+      <w:proofErr w:type="spellEnd"/>
+      <w:r>
+        <w:t xml:space="preserve"> </w:t>
+      </w:r>
+      <w:proofErr w:type="spellStart"/>
+      <w:r>
+        <w:t>maken</w:t>
+      </w:r>
+      <w:proofErr w:type="spellEnd"/>
+      <w:r>
+        <w:t xml:space="preserve"> het eenvoudig </w:t>
       </w:r>
       <w:r>
         <w:t>om</w:t>
@@ -11959,23 +12390,41 @@
         <w:t>maken het h</w:t>
       </w:r>
       <w:r>
-        <w:t>ele proces heel gebruiksvriendelijk</w:t>
-      </w:r>
+        <w:t xml:space="preserve">ele </w:t>
+      </w:r>
+      <w:proofErr w:type="spellStart"/>
+      <w:r>
+        <w:t>proces</w:t>
+      </w:r>
+      <w:proofErr w:type="spellEnd"/>
+      <w:r>
+        <w:t xml:space="preserve"> heel </w:t>
+      </w:r>
+      <w:proofErr w:type="spellStart"/>
+      <w:r>
+        <w:t>gebruiksvriendelijk</w:t>
+      </w:r>
+      <w:proofErr w:type="spellEnd"/>
       <w:r>
         <w:t>.</w:t>
       </w:r>
     </w:p>
+    <w:p/>
+    <w:p/>
     <w:p>
       <w:r>
+        <w:rPr>
+          <w:noProof/>
+        </w:rPr>
         <w:lastRenderedPageBreak/>
         <w:drawing>
-          <wp:anchor distT="0" distB="0" distL="114300" distR="114300" simplePos="0" relativeHeight="251749376" behindDoc="0" locked="0" layoutInCell="1" allowOverlap="1" wp14:anchorId="693F21AE" wp14:editId="07D9BD45">
+          <wp:anchor distT="0" distB="0" distL="114300" distR="114300" simplePos="0" relativeHeight="251749376" behindDoc="0" locked="0" layoutInCell="1" allowOverlap="1" wp14:anchorId="693F21AE" wp14:editId="68A937E4">
             <wp:simplePos x="0" y="0"/>
             <wp:positionH relativeFrom="margin">
-              <wp:posOffset>-1905</wp:posOffset>
+              <wp:align>center</wp:align>
             </wp:positionH>
             <wp:positionV relativeFrom="paragraph">
-              <wp:posOffset>716280</wp:posOffset>
+              <wp:posOffset>512618</wp:posOffset>
             </wp:positionV>
             <wp:extent cx="5731510" cy="1619250"/>
             <wp:effectExtent l="133350" t="114300" r="135890" b="171450"/>
@@ -12052,7 +12501,23 @@
         <w:t>De</w:t>
       </w:r>
       <w:r>
-        <w:t xml:space="preserve"> toegangstabel maakt het eenvoudig om gebruikers </w:t>
+        <w:t xml:space="preserve"> </w:t>
+      </w:r>
+      <w:proofErr w:type="spellStart"/>
+      <w:r>
+        <w:t>toegangstabel</w:t>
+      </w:r>
+      <w:proofErr w:type="spellEnd"/>
+      <w:r>
+        <w:t xml:space="preserve"> </w:t>
+      </w:r>
+      <w:proofErr w:type="spellStart"/>
+      <w:r>
+        <w:t>maakt</w:t>
+      </w:r>
+      <w:proofErr w:type="spellEnd"/>
+      <w:r>
+        <w:t xml:space="preserve"> het eenvoudig om gebruikers </w:t>
       </w:r>
       <w:r>
         <w:t xml:space="preserve">toegang te verlenen </w:t>
@@ -12133,6 +12598,9 @@
         </w:rPr>
       </w:pPr>
       <w:r>
+        <w:rPr>
+          <w:noProof/>
+        </w:rPr>
         <w:drawing>
           <wp:anchor distT="0" distB="0" distL="114300" distR="114300" simplePos="0" relativeHeight="251731968" behindDoc="0" locked="0" layoutInCell="1" allowOverlap="1" wp14:anchorId="15A1ED7B" wp14:editId="71E4A32B">
             <wp:simplePos x="0" y="0"/>
@@ -12229,6 +12697,9 @@
     </w:p>
     <w:p>
       <w:r>
+        <w:rPr>
+          <w:noProof/>
+        </w:rPr>
         <mc:AlternateContent>
           <mc:Choice Requires="wpi">
             <w:drawing>
@@ -12266,7 +12737,7 @@
           </mc:Choice>
           <mc:Fallback>
             <w:pict>
-              <v:shape w14:anchorId="3521AAC0" id="Ink 2" o:spid="_x0000_s1026" type="#_x0000_t75" style="position:absolute;margin-left:241.95pt;margin-top:85.5pt;width:161.2pt;height:10pt;z-index:251753472;visibility:visible;mso-wrap-style:square;mso-width-percent:0;mso-wrap-distance-left:9pt;mso-wrap-distance-top:0;mso-wrap-distance-right:9pt;mso-wrap-distance-bottom:0;mso-position-horizontal:absolute;mso-position-horizontal-relative:text;mso-position-vertical:absolute;mso-position-vertical-relative:text;mso-width-percent:0;mso-width-relative:margin" o:gfxdata="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">
+              <v:shape w14:anchorId="67D6022B" id="Ink 2" o:spid="_x0000_s1026" type="#_x0000_t75" style="position:absolute;margin-left:241.95pt;margin-top:85.5pt;width:161.2pt;height:10pt;z-index:251753472;visibility:visible;mso-wrap-style:square;mso-width-percent:0;mso-wrap-distance-left:9pt;mso-wrap-distance-top:0;mso-wrap-distance-right:9pt;mso-wrap-distance-bottom:0;mso-position-horizontal:absolute;mso-position-horizontal-relative:text;mso-position-vertical:absolute;mso-position-vertical-relative:text;mso-width-percent:0;mso-width-relative:margin" o:gfxdata="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">
                 <v:imagedata r:id="rId55" o:title=""/>
               </v:shape>
             </w:pict>
@@ -12274,6 +12745,9 @@
         </mc:AlternateContent>
       </w:r>
       <w:r>
+        <w:rPr>
+          <w:noProof/>
+        </w:rPr>
         <mc:AlternateContent>
           <mc:Choice Requires="wpi">
             <w:drawing>
@@ -12311,7 +12785,7 @@
           </mc:Choice>
           <mc:Fallback>
             <w:pict>
-              <v:shape w14:anchorId="21ABE11C" id="Ink 2" o:spid="_x0000_s1026" type="#_x0000_t75" style="position:absolute;margin-left:205.95pt;margin-top:119.45pt;width:34.05pt;height:10pt;z-index:251751424;visibility:visible;mso-wrap-style:square;mso-width-percent:0;mso-wrap-distance-left:9pt;mso-wrap-distance-top:0;mso-wrap-distance-right:9pt;mso-wrap-distance-bottom:0;mso-position-horizontal:absolute;mso-position-horizontal-relative:text;mso-position-vertical:absolute;mso-position-vertical-relative:text;mso-width-percent:0;mso-width-relative:margin" o:gfxdata="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">
+              <v:shape w14:anchorId="411F9EDE" id="Ink 2" o:spid="_x0000_s1026" type="#_x0000_t75" style="position:absolute;margin-left:205.9pt;margin-top:119.45pt;width:34.05pt;height:10pt;z-index:251751424;visibility:visible;mso-wrap-style:square;mso-width-percent:0;mso-wrap-distance-left:9pt;mso-wrap-distance-top:0;mso-wrap-distance-right:9pt;mso-wrap-distance-bottom:0;mso-position-horizontal:absolute;mso-position-horizontal-relative:text;mso-position-vertical:absolute;mso-position-vertical-relative:text;mso-width-percent:0;mso-width-relative:margin" o:gfxdata="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">
                 <v:imagedata r:id="rId57" o:title=""/>
               </v:shape>
             </w:pict>
@@ -12331,6 +12805,10 @@
         <w:t>, onder het tabblad “Hallsensor Flow”, voeg je de nummers toe, gescheiden door een komma, op de aangegeven plaats zoals op de foto.</w:t>
       </w:r>
     </w:p>
+    <w:p/>
+    <w:p/>
+    <w:p/>
+    <w:p/>
     <w:p/>
     <w:p/>
     <w:p/>
@@ -12573,6 +13051,7 @@
         <w:docPartUnique/>
       </w:docPartObj>
     </w:sdtPr>
+    <w:sdtEndPr/>
     <w:sdtContent>
       <w:p>
         <w:pPr>
@@ -15842,14 +16321,12 @@
     <w:rPrDefault>
       <w:rPr>
         <w:rFonts w:asciiTheme="minorHAnsi" w:eastAsiaTheme="minorEastAsia" w:hAnsiTheme="minorHAnsi" w:cstheme="minorBidi"/>
-        <w:sz w:val="21"/>
-        <w:szCs w:val="21"/>
         <w:lang w:val="en-BE" w:eastAsia="en-US" w:bidi="ar-SA"/>
       </w:rPr>
     </w:rPrDefault>
     <w:pPrDefault>
       <w:pPr>
-        <w:spacing w:after="160" w:line="312" w:lineRule="auto"/>
+        <w:spacing w:after="120" w:line="264" w:lineRule="auto"/>
       </w:pPr>
     </w:pPrDefault>
   </w:docDefaults>
@@ -16234,13 +16711,7 @@
   <w:style w:type="paragraph" w:default="1" w:styleId="Normal">
     <w:name w:val="Normal"/>
     <w:qFormat/>
-    <w:rsid w:val="00692689"/>
-    <w:pPr>
-      <w:jc w:val="both"/>
-    </w:pPr>
-    <w:rPr>
-      <w:lang w:val="nl-NL"/>
-    </w:rPr>
+    <w:rsid w:val="00BE1B9B"/>
   </w:style>
   <w:style w:type="paragraph" w:styleId="Heading1">
     <w:name w:val="heading 1"/>
@@ -16249,22 +16720,18 @@
     <w:link w:val="Heading1Char"/>
     <w:uiPriority w:val="9"/>
     <w:qFormat/>
-    <w:rsid w:val="00793B2C"/>
+    <w:rsid w:val="00BE1B9B"/>
     <w:pPr>
       <w:keepNext/>
       <w:keepLines/>
-      <w:pBdr>
-        <w:left w:val="single" w:sz="12" w:space="12" w:color="A50E82" w:themeColor="accent2"/>
-      </w:pBdr>
-      <w:spacing w:before="80" w:after="80" w:line="240" w:lineRule="auto"/>
+      <w:spacing w:before="320" w:after="0" w:line="240" w:lineRule="auto"/>
       <w:outlineLvl w:val="0"/>
     </w:pPr>
     <w:rPr>
       <w:rFonts w:asciiTheme="majorHAnsi" w:eastAsiaTheme="majorEastAsia" w:hAnsiTheme="majorHAnsi" w:cstheme="majorBidi"/>
-      <w:caps/>
-      <w:spacing w:val="10"/>
-      <w:sz w:val="36"/>
-      <w:szCs w:val="36"/>
+      <w:color w:val="032348" w:themeColor="accent1" w:themeShade="BF"/>
+      <w:sz w:val="32"/>
+      <w:szCs w:val="32"/>
     </w:rPr>
   </w:style>
   <w:style w:type="paragraph" w:styleId="Heading2">
@@ -16275,17 +16742,18 @@
     <w:uiPriority w:val="9"/>
     <w:unhideWhenUsed/>
     <w:qFormat/>
-    <w:rsid w:val="00793B2C"/>
+    <w:rsid w:val="00BE1B9B"/>
     <w:pPr>
       <w:keepNext/>
       <w:keepLines/>
-      <w:spacing w:before="120" w:after="0" w:line="240" w:lineRule="auto"/>
+      <w:spacing w:before="80" w:after="0" w:line="240" w:lineRule="auto"/>
       <w:outlineLvl w:val="1"/>
     </w:pPr>
     <w:rPr>
       <w:rFonts w:asciiTheme="majorHAnsi" w:eastAsiaTheme="majorEastAsia" w:hAnsiTheme="majorHAnsi" w:cstheme="majorBidi"/>
-      <w:sz w:val="36"/>
-      <w:szCs w:val="36"/>
+      <w:color w:val="404040" w:themeColor="text1" w:themeTint="BF"/>
+      <w:sz w:val="28"/>
+      <w:szCs w:val="28"/>
     </w:rPr>
   </w:style>
   <w:style w:type="paragraph" w:styleId="Heading3">
@@ -16296,18 +16764,18 @@
     <w:uiPriority w:val="9"/>
     <w:unhideWhenUsed/>
     <w:qFormat/>
-    <w:rsid w:val="00793B2C"/>
+    <w:rsid w:val="00BE1B9B"/>
     <w:pPr>
       <w:keepNext/>
       <w:keepLines/>
-      <w:spacing w:before="80" w:after="0" w:line="240" w:lineRule="auto"/>
+      <w:spacing w:before="40" w:after="0" w:line="240" w:lineRule="auto"/>
       <w:outlineLvl w:val="2"/>
     </w:pPr>
     <w:rPr>
       <w:rFonts w:asciiTheme="majorHAnsi" w:eastAsiaTheme="majorEastAsia" w:hAnsiTheme="majorHAnsi" w:cstheme="majorBidi"/>
-      <w:caps/>
-      <w:sz w:val="28"/>
-      <w:szCs w:val="28"/>
+      <w:color w:val="146194" w:themeColor="text2"/>
+      <w:sz w:val="24"/>
+      <w:szCs w:val="24"/>
     </w:rPr>
   </w:style>
   <w:style w:type="paragraph" w:styleId="Heading4">
@@ -16319,19 +16787,17 @@
     <w:semiHidden/>
     <w:unhideWhenUsed/>
     <w:qFormat/>
-    <w:rsid w:val="00793B2C"/>
+    <w:rsid w:val="00BE1B9B"/>
     <w:pPr>
       <w:keepNext/>
       <w:keepLines/>
-      <w:spacing w:before="80" w:after="0" w:line="240" w:lineRule="auto"/>
+      <w:spacing w:before="40" w:after="0"/>
       <w:outlineLvl w:val="3"/>
     </w:pPr>
     <w:rPr>
       <w:rFonts w:asciiTheme="majorHAnsi" w:eastAsiaTheme="majorEastAsia" w:hAnsiTheme="majorHAnsi" w:cstheme="majorBidi"/>
-      <w:i/>
-      <w:iCs/>
-      <w:sz w:val="28"/>
-      <w:szCs w:val="28"/>
+      <w:sz w:val="22"/>
+      <w:szCs w:val="22"/>
     </w:rPr>
   </w:style>
   <w:style w:type="paragraph" w:styleId="Heading5">
@@ -16343,17 +16809,18 @@
     <w:semiHidden/>
     <w:unhideWhenUsed/>
     <w:qFormat/>
-    <w:rsid w:val="00793B2C"/>
+    <w:rsid w:val="00BE1B9B"/>
     <w:pPr>
       <w:keepNext/>
       <w:keepLines/>
-      <w:spacing w:before="80" w:after="0" w:line="240" w:lineRule="auto"/>
+      <w:spacing w:before="40" w:after="0"/>
       <w:outlineLvl w:val="4"/>
     </w:pPr>
     <w:rPr>
       <w:rFonts w:asciiTheme="majorHAnsi" w:eastAsiaTheme="majorEastAsia" w:hAnsiTheme="majorHAnsi" w:cstheme="majorBidi"/>
-      <w:sz w:val="24"/>
-      <w:szCs w:val="24"/>
+      <w:color w:val="146194" w:themeColor="text2"/>
+      <w:sz w:val="22"/>
+      <w:szCs w:val="22"/>
     </w:rPr>
   </w:style>
   <w:style w:type="paragraph" w:styleId="Heading6">
@@ -16365,19 +16832,20 @@
     <w:semiHidden/>
     <w:unhideWhenUsed/>
     <w:qFormat/>
-    <w:rsid w:val="00793B2C"/>
+    <w:rsid w:val="00BE1B9B"/>
     <w:pPr>
       <w:keepNext/>
       <w:keepLines/>
-      <w:spacing w:before="80" w:after="0" w:line="240" w:lineRule="auto"/>
+      <w:spacing w:before="40" w:after="0"/>
       <w:outlineLvl w:val="5"/>
     </w:pPr>
     <w:rPr>
       <w:rFonts w:asciiTheme="majorHAnsi" w:eastAsiaTheme="majorEastAsia" w:hAnsiTheme="majorHAnsi" w:cstheme="majorBidi"/>
       <w:i/>
       <w:iCs/>
-      <w:sz w:val="24"/>
-      <w:szCs w:val="24"/>
+      <w:color w:val="146194" w:themeColor="text2"/>
+      <w:sz w:val="21"/>
+      <w:szCs w:val="21"/>
     </w:rPr>
   </w:style>
   <w:style w:type="paragraph" w:styleId="Heading7">
@@ -16389,18 +16857,20 @@
     <w:semiHidden/>
     <w:unhideWhenUsed/>
     <w:qFormat/>
-    <w:rsid w:val="00793B2C"/>
+    <w:rsid w:val="00BE1B9B"/>
     <w:pPr>
       <w:keepNext/>
       <w:keepLines/>
-      <w:spacing w:before="80" w:after="0" w:line="240" w:lineRule="auto"/>
+      <w:spacing w:before="40" w:after="0"/>
       <w:outlineLvl w:val="6"/>
     </w:pPr>
     <w:rPr>
       <w:rFonts w:asciiTheme="majorHAnsi" w:eastAsiaTheme="majorEastAsia" w:hAnsiTheme="majorHAnsi" w:cstheme="majorBidi"/>
-      <w:color w:val="595959" w:themeColor="text1" w:themeTint="A6"/>
-      <w:sz w:val="24"/>
-      <w:szCs w:val="24"/>
+      <w:i/>
+      <w:iCs/>
+      <w:color w:val="021730" w:themeColor="accent1" w:themeShade="80"/>
+      <w:sz w:val="21"/>
+      <w:szCs w:val="21"/>
     </w:rPr>
   </w:style>
   <w:style w:type="paragraph" w:styleId="Heading8">
@@ -16412,16 +16882,18 @@
     <w:semiHidden/>
     <w:unhideWhenUsed/>
     <w:qFormat/>
-    <w:rsid w:val="00793B2C"/>
+    <w:rsid w:val="00BE1B9B"/>
     <w:pPr>
       <w:keepNext/>
       <w:keepLines/>
-      <w:spacing w:before="80" w:after="0" w:line="240" w:lineRule="auto"/>
+      <w:spacing w:before="40" w:after="0"/>
       <w:outlineLvl w:val="7"/>
     </w:pPr>
     <w:rPr>
       <w:rFonts w:asciiTheme="majorHAnsi" w:eastAsiaTheme="majorEastAsia" w:hAnsiTheme="majorHAnsi" w:cstheme="majorBidi"/>
-      <w:caps/>
+      <w:b/>
+      <w:bCs/>
+      <w:color w:val="146194" w:themeColor="text2"/>
     </w:rPr>
   </w:style>
   <w:style w:type="paragraph" w:styleId="Heading9">
@@ -16433,23 +16905,26 @@
     <w:semiHidden/>
     <w:unhideWhenUsed/>
     <w:qFormat/>
-    <w:rsid w:val="00793B2C"/>
+    <w:rsid w:val="00BE1B9B"/>
     <w:pPr>
       <w:keepNext/>
       <w:keepLines/>
-      <w:spacing w:before="80" w:after="0" w:line="240" w:lineRule="auto"/>
+      <w:spacing w:before="40" w:after="0"/>
       <w:outlineLvl w:val="8"/>
     </w:pPr>
     <w:rPr>
       <w:rFonts w:asciiTheme="majorHAnsi" w:eastAsiaTheme="majorEastAsia" w:hAnsiTheme="majorHAnsi" w:cstheme="majorBidi"/>
+      <w:b/>
+      <w:bCs/>
       <w:i/>
       <w:iCs/>
-      <w:caps/>
+      <w:color w:val="146194" w:themeColor="text2"/>
     </w:rPr>
   </w:style>
   <w:style w:type="character" w:default="1" w:styleId="DefaultParagraphFont">
     <w:name w:val="Default Paragraph Font"/>
     <w:uiPriority w:val="1"/>
+    <w:semiHidden/>
     <w:unhideWhenUsed/>
   </w:style>
   <w:style w:type="table" w:default="1" w:styleId="TableNormal">
@@ -16478,13 +16953,12 @@
     <w:basedOn w:val="DefaultParagraphFont"/>
     <w:link w:val="Heading1"/>
     <w:uiPriority w:val="9"/>
-    <w:rsid w:val="00793B2C"/>
+    <w:rsid w:val="00BE1B9B"/>
     <w:rPr>
       <w:rFonts w:asciiTheme="majorHAnsi" w:eastAsiaTheme="majorEastAsia" w:hAnsiTheme="majorHAnsi" w:cstheme="majorBidi"/>
-      <w:caps/>
-      <w:spacing w:val="10"/>
-      <w:sz w:val="36"/>
-      <w:szCs w:val="36"/>
+      <w:color w:val="032348" w:themeColor="accent1" w:themeShade="BF"/>
+      <w:sz w:val="32"/>
+      <w:szCs w:val="32"/>
     </w:rPr>
   </w:style>
   <w:style w:type="character" w:customStyle="1" w:styleId="Heading2Char">
@@ -16492,11 +16966,12 @@
     <w:basedOn w:val="DefaultParagraphFont"/>
     <w:link w:val="Heading2"/>
     <w:uiPriority w:val="9"/>
-    <w:rsid w:val="00793B2C"/>
+    <w:rsid w:val="00BE1B9B"/>
     <w:rPr>
       <w:rFonts w:asciiTheme="majorHAnsi" w:eastAsiaTheme="majorEastAsia" w:hAnsiTheme="majorHAnsi" w:cstheme="majorBidi"/>
-      <w:sz w:val="36"/>
-      <w:szCs w:val="36"/>
+      <w:color w:val="404040" w:themeColor="text1" w:themeTint="BF"/>
+      <w:sz w:val="28"/>
+      <w:szCs w:val="28"/>
     </w:rPr>
   </w:style>
   <w:style w:type="character" w:customStyle="1" w:styleId="Heading3Char">
@@ -16504,12 +16979,12 @@
     <w:basedOn w:val="DefaultParagraphFont"/>
     <w:link w:val="Heading3"/>
     <w:uiPriority w:val="9"/>
-    <w:rsid w:val="00793B2C"/>
+    <w:rsid w:val="00BE1B9B"/>
     <w:rPr>
       <w:rFonts w:asciiTheme="majorHAnsi" w:eastAsiaTheme="majorEastAsia" w:hAnsiTheme="majorHAnsi" w:cstheme="majorBidi"/>
-      <w:caps/>
-      <w:sz w:val="28"/>
-      <w:szCs w:val="28"/>
+      <w:color w:val="146194" w:themeColor="text2"/>
+      <w:sz w:val="24"/>
+      <w:szCs w:val="24"/>
     </w:rPr>
   </w:style>
   <w:style w:type="character" w:customStyle="1" w:styleId="Heading4Char">
@@ -16518,13 +16993,11 @@
     <w:link w:val="Heading4"/>
     <w:uiPriority w:val="9"/>
     <w:semiHidden/>
-    <w:rsid w:val="00793B2C"/>
+    <w:rsid w:val="00BE1B9B"/>
     <w:rPr>
       <w:rFonts w:asciiTheme="majorHAnsi" w:eastAsiaTheme="majorEastAsia" w:hAnsiTheme="majorHAnsi" w:cstheme="majorBidi"/>
-      <w:i/>
-      <w:iCs/>
-      <w:sz w:val="28"/>
-      <w:szCs w:val="28"/>
+      <w:sz w:val="22"/>
+      <w:szCs w:val="22"/>
     </w:rPr>
   </w:style>
   <w:style w:type="character" w:customStyle="1" w:styleId="Heading5Char">
@@ -16533,11 +17006,12 @@
     <w:link w:val="Heading5"/>
     <w:uiPriority w:val="9"/>
     <w:semiHidden/>
-    <w:rsid w:val="00793B2C"/>
+    <w:rsid w:val="00BE1B9B"/>
     <w:rPr>
       <w:rFonts w:asciiTheme="majorHAnsi" w:eastAsiaTheme="majorEastAsia" w:hAnsiTheme="majorHAnsi" w:cstheme="majorBidi"/>
-      <w:sz w:val="24"/>
-      <w:szCs w:val="24"/>
+      <w:color w:val="146194" w:themeColor="text2"/>
+      <w:sz w:val="22"/>
+      <w:szCs w:val="22"/>
     </w:rPr>
   </w:style>
   <w:style w:type="character" w:customStyle="1" w:styleId="Heading6Char">
@@ -16546,13 +17020,14 @@
     <w:link w:val="Heading6"/>
     <w:uiPriority w:val="9"/>
     <w:semiHidden/>
-    <w:rsid w:val="00793B2C"/>
+    <w:rsid w:val="00BE1B9B"/>
     <w:rPr>
       <w:rFonts w:asciiTheme="majorHAnsi" w:eastAsiaTheme="majorEastAsia" w:hAnsiTheme="majorHAnsi" w:cstheme="majorBidi"/>
       <w:i/>
       <w:iCs/>
-      <w:sz w:val="24"/>
-      <w:szCs w:val="24"/>
+      <w:color w:val="146194" w:themeColor="text2"/>
+      <w:sz w:val="21"/>
+      <w:szCs w:val="21"/>
     </w:rPr>
   </w:style>
   <w:style w:type="character" w:customStyle="1" w:styleId="Heading7Char">
@@ -16561,12 +17036,14 @@
     <w:link w:val="Heading7"/>
     <w:uiPriority w:val="9"/>
     <w:semiHidden/>
-    <w:rsid w:val="00793B2C"/>
+    <w:rsid w:val="00BE1B9B"/>
     <w:rPr>
       <w:rFonts w:asciiTheme="majorHAnsi" w:eastAsiaTheme="majorEastAsia" w:hAnsiTheme="majorHAnsi" w:cstheme="majorBidi"/>
-      <w:color w:val="595959" w:themeColor="text1" w:themeTint="A6"/>
-      <w:sz w:val="24"/>
-      <w:szCs w:val="24"/>
+      <w:i/>
+      <w:iCs/>
+      <w:color w:val="021730" w:themeColor="accent1" w:themeShade="80"/>
+      <w:sz w:val="21"/>
+      <w:szCs w:val="21"/>
     </w:rPr>
   </w:style>
   <w:style w:type="character" w:customStyle="1" w:styleId="Heading8Char">
@@ -16575,10 +17052,12 @@
     <w:link w:val="Heading8"/>
     <w:uiPriority w:val="9"/>
     <w:semiHidden/>
-    <w:rsid w:val="00793B2C"/>
+    <w:rsid w:val="00BE1B9B"/>
     <w:rPr>
       <w:rFonts w:asciiTheme="majorHAnsi" w:eastAsiaTheme="majorEastAsia" w:hAnsiTheme="majorHAnsi" w:cstheme="majorBidi"/>
-      <w:caps/>
+      <w:b/>
+      <w:bCs/>
+      <w:color w:val="146194" w:themeColor="text2"/>
     </w:rPr>
   </w:style>
   <w:style w:type="character" w:customStyle="1" w:styleId="Heading9Char">
@@ -16587,12 +17066,14 @@
     <w:link w:val="Heading9"/>
     <w:uiPriority w:val="9"/>
     <w:semiHidden/>
-    <w:rsid w:val="00793B2C"/>
+    <w:rsid w:val="00BE1B9B"/>
     <w:rPr>
       <w:rFonts w:asciiTheme="majorHAnsi" w:eastAsiaTheme="majorEastAsia" w:hAnsiTheme="majorHAnsi" w:cstheme="majorBidi"/>
+      <w:b/>
+      <w:bCs/>
       <w:i/>
       <w:iCs/>
-      <w:caps/>
+      <w:color w:val="146194" w:themeColor="text2"/>
     </w:rPr>
   </w:style>
   <w:style w:type="paragraph" w:styleId="Title">
@@ -16602,17 +17083,17 @@
     <w:link w:val="TitleChar"/>
     <w:uiPriority w:val="10"/>
     <w:qFormat/>
-    <w:rsid w:val="00793B2C"/>
+    <w:rsid w:val="00BE1B9B"/>
     <w:pPr>
       <w:spacing w:after="0" w:line="240" w:lineRule="auto"/>
       <w:contextualSpacing/>
     </w:pPr>
     <w:rPr>
       <w:rFonts w:asciiTheme="majorHAnsi" w:eastAsiaTheme="majorEastAsia" w:hAnsiTheme="majorHAnsi" w:cstheme="majorBidi"/>
-      <w:caps/>
-      <w:spacing w:val="40"/>
-      <w:sz w:val="76"/>
-      <w:szCs w:val="76"/>
+      <w:color w:val="052F61" w:themeColor="accent1"/>
+      <w:spacing w:val="-10"/>
+      <w:sz w:val="56"/>
+      <w:szCs w:val="56"/>
     </w:rPr>
   </w:style>
   <w:style w:type="character" w:customStyle="1" w:styleId="TitleChar">
@@ -16620,13 +17101,13 @@
     <w:basedOn w:val="DefaultParagraphFont"/>
     <w:link w:val="Title"/>
     <w:uiPriority w:val="10"/>
-    <w:rsid w:val="00793B2C"/>
+    <w:rsid w:val="00BE1B9B"/>
     <w:rPr>
       <w:rFonts w:asciiTheme="majorHAnsi" w:eastAsiaTheme="majorEastAsia" w:hAnsiTheme="majorHAnsi" w:cstheme="majorBidi"/>
-      <w:caps/>
-      <w:spacing w:val="40"/>
-      <w:sz w:val="76"/>
-      <w:szCs w:val="76"/>
+      <w:color w:val="052F61" w:themeColor="accent1"/>
+      <w:spacing w:val="-10"/>
+      <w:sz w:val="56"/>
+      <w:szCs w:val="56"/>
     </w:rPr>
   </w:style>
   <w:style w:type="paragraph" w:styleId="Subtitle">
@@ -16636,15 +17117,15 @@
     <w:link w:val="SubtitleChar"/>
     <w:uiPriority w:val="11"/>
     <w:qFormat/>
-    <w:rsid w:val="00793B2C"/>
+    <w:rsid w:val="00BE1B9B"/>
     <w:pPr>
       <w:numPr>
         <w:ilvl w:val="1"/>
       </w:numPr>
-      <w:spacing w:after="240"/>
+      <w:spacing w:line="240" w:lineRule="auto"/>
     </w:pPr>
     <w:rPr>
-      <w:color w:val="000000" w:themeColor="text1"/>
+      <w:rFonts w:asciiTheme="majorHAnsi" w:eastAsiaTheme="majorEastAsia" w:hAnsiTheme="majorHAnsi" w:cstheme="majorBidi"/>
       <w:sz w:val="24"/>
       <w:szCs w:val="24"/>
     </w:rPr>
@@ -16654,9 +17135,9 @@
     <w:basedOn w:val="DefaultParagraphFont"/>
     <w:link w:val="Subtitle"/>
     <w:uiPriority w:val="11"/>
-    <w:rsid w:val="00793B2C"/>
+    <w:rsid w:val="00BE1B9B"/>
     <w:rPr>
-      <w:color w:val="000000" w:themeColor="text1"/>
+      <w:rFonts w:asciiTheme="majorHAnsi" w:eastAsiaTheme="majorEastAsia" w:hAnsiTheme="majorHAnsi" w:cstheme="majorBidi"/>
       <w:sz w:val="24"/>
       <w:szCs w:val="24"/>
     </w:rPr>
@@ -16668,15 +17149,15 @@
     <w:link w:val="QuoteChar"/>
     <w:uiPriority w:val="29"/>
     <w:qFormat/>
-    <w:rsid w:val="00793B2C"/>
+    <w:rsid w:val="00BE1B9B"/>
     <w:pPr>
       <w:spacing w:before="160"/>
-      <w:ind w:left="720"/>
+      <w:ind w:left="720" w:right="720"/>
     </w:pPr>
     <w:rPr>
-      <w:rFonts w:asciiTheme="majorHAnsi" w:eastAsiaTheme="majorEastAsia" w:hAnsiTheme="majorHAnsi" w:cstheme="majorBidi"/>
-      <w:sz w:val="24"/>
-      <w:szCs w:val="24"/>
+      <w:i/>
+      <w:iCs/>
+      <w:color w:val="404040" w:themeColor="text1" w:themeTint="BF"/>
     </w:rPr>
   </w:style>
   <w:style w:type="character" w:customStyle="1" w:styleId="QuoteChar">
@@ -16684,11 +17165,11 @@
     <w:basedOn w:val="DefaultParagraphFont"/>
     <w:link w:val="Quote"/>
     <w:uiPriority w:val="29"/>
-    <w:rsid w:val="00793B2C"/>
+    <w:rsid w:val="00BE1B9B"/>
     <w:rPr>
-      <w:rFonts w:asciiTheme="majorHAnsi" w:eastAsiaTheme="majorEastAsia" w:hAnsiTheme="majorHAnsi" w:cstheme="majorBidi"/>
-      <w:sz w:val="24"/>
-      <w:szCs w:val="24"/>
+      <w:i/>
+      <w:iCs/>
+      <w:color w:val="404040" w:themeColor="text1" w:themeTint="BF"/>
     </w:rPr>
   </w:style>
   <w:style w:type="paragraph" w:styleId="ListParagraph">
@@ -16707,19 +17188,12 @@
     <w:basedOn w:val="DefaultParagraphFont"/>
     <w:uiPriority w:val="21"/>
     <w:qFormat/>
-    <w:rsid w:val="00793B2C"/>
+    <w:rsid w:val="00BE1B9B"/>
     <w:rPr>
-      <w:rFonts w:asciiTheme="minorHAnsi" w:eastAsiaTheme="minorEastAsia" w:hAnsiTheme="minorHAnsi" w:cstheme="minorBidi"/>
       <w:b/>
       <w:bCs/>
       <w:i/>
       <w:iCs/>
-      <w:color w:val="7B0A60" w:themeColor="accent2" w:themeShade="BF"/>
-      <w:spacing w:val="0"/>
-      <w:w w:val="100"/>
-      <w:position w:val="0"/>
-      <w:sz w:val="20"/>
-      <w:szCs w:val="20"/>
     </w:rPr>
   </w:style>
   <w:style w:type="paragraph" w:styleId="IntenseQuote">
@@ -16729,17 +17203,17 @@
     <w:link w:val="IntenseQuoteChar"/>
     <w:uiPriority w:val="30"/>
     <w:qFormat/>
-    <w:rsid w:val="00793B2C"/>
+    <w:rsid w:val="00BE1B9B"/>
     <w:pPr>
-      <w:spacing w:before="100" w:beforeAutospacing="1" w:after="240"/>
-      <w:ind w:left="936" w:right="936"/>
-      <w:jc w:val="center"/>
+      <w:pBdr>
+        <w:left w:val="single" w:sz="18" w:space="12" w:color="052F61" w:themeColor="accent1"/>
+      </w:pBdr>
+      <w:spacing w:before="100" w:beforeAutospacing="1" w:line="300" w:lineRule="auto"/>
+      <w:ind w:left="1224" w:right="1224"/>
     </w:pPr>
     <w:rPr>
       <w:rFonts w:asciiTheme="majorHAnsi" w:eastAsiaTheme="majorEastAsia" w:hAnsiTheme="majorHAnsi" w:cstheme="majorBidi"/>
-      <w:caps/>
-      <w:color w:val="7B0A60" w:themeColor="accent2" w:themeShade="BF"/>
-      <w:spacing w:val="10"/>
+      <w:color w:val="052F61" w:themeColor="accent1"/>
       <w:sz w:val="28"/>
       <w:szCs w:val="28"/>
     </w:rPr>
@@ -16749,12 +17223,10 @@
     <w:basedOn w:val="DefaultParagraphFont"/>
     <w:link w:val="IntenseQuote"/>
     <w:uiPriority w:val="30"/>
-    <w:rsid w:val="00793B2C"/>
+    <w:rsid w:val="00BE1B9B"/>
     <w:rPr>
       <w:rFonts w:asciiTheme="majorHAnsi" w:eastAsiaTheme="majorEastAsia" w:hAnsiTheme="majorHAnsi" w:cstheme="majorBidi"/>
-      <w:caps/>
-      <w:color w:val="7B0A60" w:themeColor="accent2" w:themeShade="BF"/>
-      <w:spacing w:val="10"/>
+      <w:color w:val="052F61" w:themeColor="accent1"/>
       <w:sz w:val="28"/>
       <w:szCs w:val="28"/>
     </w:rPr>
@@ -16764,19 +17236,12 @@
     <w:basedOn w:val="DefaultParagraphFont"/>
     <w:uiPriority w:val="32"/>
     <w:qFormat/>
-    <w:rsid w:val="00793B2C"/>
+    <w:rsid w:val="00BE1B9B"/>
     <w:rPr>
-      <w:rFonts w:asciiTheme="minorHAnsi" w:eastAsiaTheme="minorEastAsia" w:hAnsiTheme="minorHAnsi" w:cstheme="minorBidi"/>
       <w:b/>
       <w:bCs/>
-      <w:caps w:val="0"/>
       <w:smallCaps/>
-      <w:color w:val="191919" w:themeColor="text1" w:themeTint="E6"/>
-      <w:spacing w:val="10"/>
-      <w:w w:val="100"/>
-      <w:position w:val="0"/>
-      <w:sz w:val="20"/>
-      <w:szCs w:val="20"/>
+      <w:spacing w:val="5"/>
       <w:u w:val="single"/>
     </w:rPr>
   </w:style>
@@ -16785,7 +17250,7 @@
     <w:link w:val="NoSpacingChar"/>
     <w:uiPriority w:val="1"/>
     <w:qFormat/>
-    <w:rsid w:val="00793B2C"/>
+    <w:rsid w:val="00BE1B9B"/>
     <w:pPr>
       <w:spacing w:after="0" w:line="240" w:lineRule="auto"/>
     </w:pPr>
@@ -16804,18 +17269,16 @@
     <w:uiPriority w:val="35"/>
     <w:unhideWhenUsed/>
     <w:qFormat/>
-    <w:rsid w:val="00950EBA"/>
+    <w:rsid w:val="00BE1B9B"/>
     <w:pPr>
       <w:spacing w:line="240" w:lineRule="auto"/>
-      <w:jc w:val="left"/>
     </w:pPr>
     <w:rPr>
       <w:b/>
       <w:bCs/>
-      <w:color w:val="A50E82" w:themeColor="accent2"/>
-      <w:spacing w:val="10"/>
-      <w:sz w:val="16"/>
-      <w:szCs w:val="16"/>
+      <w:smallCaps/>
+      <w:color w:val="595959" w:themeColor="text1" w:themeTint="A6"/>
+      <w:spacing w:val="6"/>
     </w:rPr>
   </w:style>
   <w:style w:type="character" w:styleId="Strong">
@@ -16823,16 +17286,10 @@
     <w:basedOn w:val="DefaultParagraphFont"/>
     <w:uiPriority w:val="22"/>
     <w:qFormat/>
-    <w:rsid w:val="00793B2C"/>
+    <w:rsid w:val="00BE1B9B"/>
     <w:rPr>
-      <w:rFonts w:asciiTheme="minorHAnsi" w:eastAsiaTheme="minorEastAsia" w:hAnsiTheme="minorHAnsi" w:cstheme="minorBidi"/>
       <w:b/>
       <w:bCs/>
-      <w:spacing w:val="0"/>
-      <w:w w:val="100"/>
-      <w:position w:val="0"/>
-      <w:sz w:val="20"/>
-      <w:szCs w:val="20"/>
     </w:rPr>
   </w:style>
   <w:style w:type="character" w:styleId="Emphasis">
@@ -16840,14 +17297,10 @@
     <w:basedOn w:val="DefaultParagraphFont"/>
     <w:uiPriority w:val="20"/>
     <w:qFormat/>
-    <w:rsid w:val="00793B2C"/>
+    <w:rsid w:val="00BE1B9B"/>
     <w:rPr>
-      <w:rFonts w:asciiTheme="minorHAnsi" w:eastAsiaTheme="minorEastAsia" w:hAnsiTheme="minorHAnsi" w:cstheme="minorBidi"/>
       <w:i/>
       <w:iCs/>
-      <w:color w:val="7B0A60" w:themeColor="accent2" w:themeShade="BF"/>
-      <w:sz w:val="20"/>
-      <w:szCs w:val="20"/>
     </w:rPr>
   </w:style>
   <w:style w:type="character" w:styleId="SubtleEmphasis">
@@ -16855,11 +17308,11 @@
     <w:basedOn w:val="DefaultParagraphFont"/>
     <w:uiPriority w:val="19"/>
     <w:qFormat/>
-    <w:rsid w:val="00793B2C"/>
+    <w:rsid w:val="00BE1B9B"/>
     <w:rPr>
       <w:i/>
       <w:iCs/>
-      <w:color w:val="auto"/>
+      <w:color w:val="404040" w:themeColor="text1" w:themeTint="BF"/>
     </w:rPr>
   </w:style>
   <w:style w:type="character" w:styleId="SubtleReference">
@@ -16867,16 +17320,10 @@
     <w:basedOn w:val="DefaultParagraphFont"/>
     <w:uiPriority w:val="31"/>
     <w:qFormat/>
-    <w:rsid w:val="00793B2C"/>
+    <w:rsid w:val="00BE1B9B"/>
     <w:rPr>
-      <w:rFonts w:asciiTheme="minorHAnsi" w:eastAsiaTheme="minorEastAsia" w:hAnsiTheme="minorHAnsi" w:cstheme="minorBidi"/>
-      <w:caps w:val="0"/>
       <w:smallCaps/>
-      <w:color w:val="auto"/>
-      <w:spacing w:val="10"/>
-      <w:w w:val="100"/>
-      <w:sz w:val="20"/>
-      <w:szCs w:val="20"/>
+      <w:color w:val="404040" w:themeColor="text1" w:themeTint="BF"/>
       <w:u w:val="single" w:color="7F7F7F" w:themeColor="text1" w:themeTint="80"/>
     </w:rPr>
   </w:style>
@@ -16885,20 +17332,11 @@
     <w:basedOn w:val="DefaultParagraphFont"/>
     <w:uiPriority w:val="33"/>
     <w:qFormat/>
-    <w:rsid w:val="00793B2C"/>
+    <w:rsid w:val="00BE1B9B"/>
     <w:rPr>
-      <w:rFonts w:asciiTheme="minorHAnsi" w:eastAsiaTheme="minorEastAsia" w:hAnsiTheme="minorHAnsi" w:cstheme="minorBidi"/>
       <w:b/>
       <w:bCs/>
-      <w:i/>
-      <w:iCs/>
-      <w:caps w:val="0"/>
-      <w:smallCaps w:val="0"/>
-      <w:color w:val="auto"/>
-      <w:spacing w:val="10"/>
-      <w:w w:val="100"/>
-      <w:sz w:val="20"/>
-      <w:szCs w:val="20"/>
+      <w:smallCaps/>
     </w:rPr>
   </w:style>
   <w:style w:type="paragraph" w:styleId="TOCHeading">
@@ -16908,7 +17346,7 @@
     <w:uiPriority w:val="39"/>
     <w:unhideWhenUsed/>
     <w:qFormat/>
-    <w:rsid w:val="00793B2C"/>
+    <w:rsid w:val="00BE1B9B"/>
     <w:pPr>
       <w:outlineLvl w:val="9"/>
     </w:pPr>
@@ -16984,10 +17422,6 @@
     <w:pPr>
       <w:spacing w:after="0" w:line="240" w:lineRule="auto"/>
     </w:pPr>
-    <w:rPr>
-      <w:sz w:val="20"/>
-      <w:szCs w:val="20"/>
-    </w:rPr>
   </w:style>
   <w:style w:type="character" w:customStyle="1" w:styleId="FootnoteTextChar">
     <w:name w:val="Footnote Text Char"/>
@@ -17103,20 +17537,18 @@
     <w:rsid w:val="00B61BF7"/>
     <w:pPr>
       <w:spacing w:before="100" w:beforeAutospacing="1" w:after="100" w:afterAutospacing="1" w:line="240" w:lineRule="auto"/>
-      <w:jc w:val="left"/>
     </w:pPr>
     <w:rPr>
       <w:rFonts w:ascii="Times New Roman" w:hAnsi="Times New Roman" w:cs="Times New Roman"/>
       <w:sz w:val="24"/>
       <w:szCs w:val="24"/>
-      <w:lang w:val="en-BE" w:eastAsia="en-BE"/>
+      <w:lang w:eastAsia="en-BE"/>
     </w:rPr>
   </w:style>
   <w:style w:type="paragraph" w:customStyle="1" w:styleId="Code">
     <w:name w:val="Code"/>
     <w:basedOn w:val="Normal"/>
     <w:link w:val="CodeChar"/>
-    <w:qFormat/>
     <w:rsid w:val="002750F7"/>
     <w:pPr>
       <w:spacing w:after="0" w:line="240" w:lineRule="auto"/>

</xml_diff>

<commit_message>
Afstudeerproject: Testing fotos added
</commit_message>
<xml_diff>
--- a/Afstudeerproject/Documentatie/Dossier Guillaume de Oliveira Andrezo.docx
+++ b/Afstudeerproject/Documentatie/Dossier Guillaume de Oliveira Andrezo.docx
@@ -14,9 +14,6 @@
       <w:sdtContent>
         <w:p>
           <w:r>
-            <w:rPr>
-              <w:noProof/>
-            </w:rPr>
             <mc:AlternateContent>
               <mc:Choice Requires="wpg">
                 <w:drawing>
@@ -892,6 +889,7 @@
         <w:rPr>
           <w:rFonts w:asciiTheme="minorHAnsi" w:eastAsiaTheme="minorEastAsia" w:hAnsiTheme="minorHAnsi" w:cstheme="minorBidi"/>
           <w:caps/>
+          <w:color w:val="auto"/>
           <w:sz w:val="21"/>
           <w:szCs w:val="21"/>
         </w:rPr>
@@ -906,7 +904,6 @@
           <w:b/>
           <w:bCs/>
           <w:caps w:val="0"/>
-          <w:color w:val="auto"/>
           <w:sz w:val="20"/>
           <w:szCs w:val="20"/>
         </w:rPr>
@@ -2837,9 +2834,6 @@
         </w:numPr>
       </w:pPr>
       <w:r>
-        <w:rPr>
-          <w:noProof/>
-        </w:rPr>
         <mc:AlternateContent>
           <mc:Choice Requires="wps">
             <w:drawing>
@@ -2972,9 +2966,6 @@
         <w:pStyle w:val="ListParagraph"/>
       </w:pPr>
       <w:r>
-        <w:rPr>
-          <w:noProof/>
-        </w:rPr>
         <w:drawing>
           <wp:anchor distT="0" distB="0" distL="114300" distR="114300" simplePos="0" relativeHeight="251660288" behindDoc="0" locked="0" layoutInCell="1" allowOverlap="1" wp14:anchorId="630D90AB" wp14:editId="2E527339">
             <wp:simplePos x="0" y="0"/>
@@ -3066,9 +3057,6 @@
       </w:pPr>
       <w:bookmarkStart w:id="4" w:name="_Toc199317592"/>
       <w:r>
-        <w:rPr>
-          <w:noProof/>
-        </w:rPr>
         <w:lastRenderedPageBreak/>
         <w:drawing>
           <wp:anchor distT="0" distB="0" distL="114300" distR="114300" simplePos="0" relativeHeight="251661312" behindDoc="0" locked="0" layoutInCell="1" allowOverlap="1" wp14:anchorId="75607135" wp14:editId="26110894">
@@ -3249,9 +3237,6 @@
     <w:p/>
     <w:p>
       <w:r>
-        <w:rPr>
-          <w:noProof/>
-        </w:rPr>
         <mc:AlternateContent>
           <mc:Choice Requires="wps">
             <w:drawing>
@@ -3411,9 +3396,6 @@
         </w:numPr>
       </w:pPr>
       <w:r>
-        <w:rPr>
-          <w:noProof/>
-        </w:rPr>
         <mc:AlternateContent>
           <mc:Choice Requires="wps">
             <w:drawing>
@@ -3525,9 +3507,6 @@
         </mc:AlternateContent>
       </w:r>
       <w:r>
-        <w:rPr>
-          <w:noProof/>
-        </w:rPr>
         <mc:AlternateContent>
           <mc:Choice Requires="wps">
             <w:drawing>
@@ -3648,9 +3627,6 @@
         </mc:AlternateContent>
       </w:r>
       <w:r>
-        <w:rPr>
-          <w:noProof/>
-        </w:rPr>
         <w:drawing>
           <wp:anchor distT="0" distB="0" distL="114300" distR="114300" simplePos="0" relativeHeight="251720704" behindDoc="0" locked="0" layoutInCell="1" allowOverlap="1" wp14:anchorId="0E804381" wp14:editId="2E9B6F34">
             <wp:simplePos x="0" y="0"/>
@@ -3741,9 +3717,6 @@
         </w:drawing>
       </w:r>
       <w:r>
-        <w:rPr>
-          <w:noProof/>
-        </w:rPr>
         <w:drawing>
           <wp:anchor distT="0" distB="0" distL="114300" distR="114300" simplePos="0" relativeHeight="251719680" behindDoc="0" locked="0" layoutInCell="1" allowOverlap="1" wp14:anchorId="11768079" wp14:editId="0164C039">
             <wp:simplePos x="0" y="0"/>
@@ -3848,11 +3821,8 @@
       </w:pPr>
       <w:bookmarkStart w:id="6" w:name="_Toc199317594"/>
       <w:r>
-        <w:rPr>
-          <w:noProof/>
-        </w:rPr>
         <w:drawing>
-          <wp:anchor distT="0" distB="0" distL="114300" distR="114300" simplePos="0" relativeHeight="251662336" behindDoc="0" locked="0" layoutInCell="1" allowOverlap="1" wp14:anchorId="380841A6" wp14:editId="0EEC86C8">
+          <wp:anchor distT="0" distB="0" distL="114300" distR="114300" simplePos="0" relativeHeight="251662336" behindDoc="0" locked="0" layoutInCell="1" allowOverlap="1" wp14:anchorId="380841A6" wp14:editId="3C634407">
             <wp:simplePos x="0" y="0"/>
             <wp:positionH relativeFrom="margin">
               <wp:posOffset>114300</wp:posOffset>
@@ -4039,9 +4009,6 @@
     <w:p/>
     <w:p>
       <w:r>
-        <w:rPr>
-          <w:noProof/>
-        </w:rPr>
         <mc:AlternateContent>
           <mc:Choice Requires="wps">
             <w:drawing>
@@ -4154,9 +4121,6 @@
       </w:pPr>
       <w:bookmarkStart w:id="7" w:name="_Toc199317595"/>
       <w:r>
-        <w:rPr>
-          <w:noProof/>
-        </w:rPr>
         <w:lastRenderedPageBreak/>
         <w:drawing>
           <wp:anchor distT="0" distB="0" distL="114300" distR="114300" simplePos="0" relativeHeight="251663360" behindDoc="0" locked="0" layoutInCell="1" allowOverlap="1" wp14:anchorId="080EEF8F" wp14:editId="5F2203AA">
@@ -4259,29 +4223,8 @@
       <w:bookmarkEnd w:id="7"/>
     </w:p>
     <w:p>
-      <w:proofErr w:type="spellStart"/>
-      <w:r>
-        <w:t>Detecteert</w:t>
-      </w:r>
-      <w:proofErr w:type="spellEnd"/>
-      <w:r>
-        <w:t xml:space="preserve"> </w:t>
-      </w:r>
-      <w:proofErr w:type="spellStart"/>
-      <w:r>
-        <w:t>magneet</w:t>
-      </w:r>
-      <w:proofErr w:type="spellEnd"/>
-      <w:r>
-        <w:t xml:space="preserve"> </w:t>
-      </w:r>
-      <w:proofErr w:type="spellStart"/>
-      <w:r>
-        <w:t>nabijheid</w:t>
-      </w:r>
-      <w:proofErr w:type="spellEnd"/>
-      <w:r>
-        <w:t xml:space="preserve"> om de deuropening te registreren.</w:t>
+      <w:r>
+        <w:t>Detecteert magneet nabijheid om de deuropening te registreren.</w:t>
       </w:r>
     </w:p>
     <w:p>
@@ -4383,9 +4326,6 @@
     <w:p/>
     <w:p>
       <w:r>
-        <w:rPr>
-          <w:noProof/>
-        </w:rPr>
         <mc:AlternateContent>
           <mc:Choice Requires="wps">
             <w:drawing>
@@ -4518,9 +4458,6 @@
         </w:numPr>
       </w:pPr>
       <w:r>
-        <w:rPr>
-          <w:noProof/>
-        </w:rPr>
         <w:drawing>
           <wp:anchor distT="0" distB="0" distL="114300" distR="114300" simplePos="0" relativeHeight="251664384" behindDoc="0" locked="0" layoutInCell="1" allowOverlap="1" wp14:anchorId="2D7B9435" wp14:editId="348CBDB9">
             <wp:simplePos x="0" y="0"/>
@@ -4706,9 +4643,6 @@
     <w:p/>
     <w:p>
       <w:r>
-        <w:rPr>
-          <w:noProof/>
-        </w:rPr>
         <mc:AlternateContent>
           <mc:Choice Requires="wps">
             <w:drawing>
@@ -4847,9 +4781,6 @@
         </w:numPr>
       </w:pPr>
       <w:r>
-        <w:rPr>
-          <w:noProof/>
-        </w:rPr>
         <w:drawing>
           <wp:anchor distT="0" distB="0" distL="114300" distR="114300" simplePos="0" relativeHeight="251665408" behindDoc="0" locked="0" layoutInCell="1" allowOverlap="1" wp14:anchorId="7DD0FEC1" wp14:editId="17BF5796">
             <wp:simplePos x="0" y="0"/>
@@ -5014,9 +4945,6 @@
     <w:p/>
     <w:p>
       <w:r>
-        <w:rPr>
-          <w:noProof/>
-        </w:rPr>
         <mc:AlternateContent>
           <mc:Choice Requires="wps">
             <w:drawing>
@@ -5134,12 +5062,9 @@
       </w:pPr>
       <w:bookmarkStart w:id="10" w:name="_Toc199317598"/>
       <w:r>
-        <w:rPr>
-          <w:noProof/>
-        </w:rPr>
         <w:lastRenderedPageBreak/>
         <w:drawing>
-          <wp:anchor distT="0" distB="0" distL="114300" distR="114300" simplePos="0" relativeHeight="251742208" behindDoc="0" locked="0" layoutInCell="1" allowOverlap="1" wp14:anchorId="72D7A8B6" wp14:editId="4EF15DB3">
+          <wp:anchor distT="0" distB="0" distL="114300" distR="114300" simplePos="0" relativeHeight="251742208" behindDoc="0" locked="0" layoutInCell="1" allowOverlap="1" wp14:anchorId="72D7A8B6" wp14:editId="114FC5C8">
             <wp:simplePos x="0" y="0"/>
             <wp:positionH relativeFrom="margin">
               <wp:align>center</wp:align>
@@ -5472,31 +5397,7 @@
         <w:t>als</w:t>
       </w:r>
       <w:r>
-        <w:t xml:space="preserve"> </w:t>
-      </w:r>
-      <w:proofErr w:type="spellStart"/>
-      <w:r>
-        <w:t>deze</w:t>
-      </w:r>
-      <w:proofErr w:type="spellEnd"/>
-      <w:r>
-        <w:t xml:space="preserve"> </w:t>
-      </w:r>
-      <w:proofErr w:type="spellStart"/>
-      <w:r>
-        <w:t>validatie</w:t>
-      </w:r>
-      <w:proofErr w:type="spellEnd"/>
-      <w:r>
-        <w:t xml:space="preserve"> </w:t>
-      </w:r>
-      <w:proofErr w:type="spellStart"/>
-      <w:r>
-        <w:t>succesvol</w:t>
-      </w:r>
-      <w:proofErr w:type="spellEnd"/>
-      <w:r>
-        <w:t xml:space="preserve"> was.</w:t>
+        <w:t xml:space="preserve"> deze validatie succesvol was.</w:t>
       </w:r>
     </w:p>
     <w:p/>
@@ -5746,13 +5647,7 @@
         <w:t xml:space="preserve">; </w:t>
       </w:r>
       <w:r>
-        <w:t xml:space="preserve">Om het dashboard veilig via HTTPS toegankelijk te maken, wordt vaak een reverse proxy gebruikt, in combinatie met een </w:t>
-      </w:r>
-      <w:r>
-        <w:t>SSL-certificaat</w:t>
-      </w:r>
-      <w:r>
-        <w:t xml:space="preserve"> (Let’s Encrypt).</w:t>
+        <w:t>Om het dashboard veilig via HTTPS toegankelijk te maken, wordt vaak een reverse proxy gebruikt, in combinatie met een SSL-certificaat (Let’s Encrypt).</w:t>
       </w:r>
     </w:p>
     <w:p>
@@ -5782,16 +5677,12 @@
         <w:t>, genereert Node-RED automatisch een HTTP-verzoek naar de Telegram API. In dit verzoek worden de naam van de betrokken deur en de aard van de storing meegestuurd, zodat de beheerder direct via Telegram op de hoogte wordt gebracht van het probleem.</w:t>
       </w:r>
     </w:p>
-    <w:p/>
-    <w:p/>
-    <w:p/>
     <w:p>
       <w:pPr>
         <w:pStyle w:val="Heading1"/>
       </w:pPr>
       <w:bookmarkStart w:id="13" w:name="_Toc199317601"/>
       <w:r>
-        <w:lastRenderedPageBreak/>
         <w:t>Programmacode</w:t>
       </w:r>
       <w:bookmarkEnd w:id="13"/>
@@ -5820,45 +5711,1998 @@
         </w:r>
       </w:hyperlink>
     </w:p>
-    <w:p/>
     <w:p>
       <w:pPr>
         <w:pStyle w:val="Heading1"/>
       </w:pPr>
       <w:bookmarkStart w:id="14" w:name="_Toc199317602"/>
       <w:r>
+        <w:lastRenderedPageBreak/>
         <w:t>Testrapport</w:t>
       </w:r>
       <w:bookmarkEnd w:id="14"/>
     </w:p>
-    <w:p/>
+    <w:tbl>
+      <w:tblPr>
+        <w:tblStyle w:val="GridTable6Colorful-Accent1"/>
+        <w:tblW w:w="0" w:type="auto"/>
+        <w:tblLook w:val="04A0" w:firstRow="1" w:lastRow="0" w:firstColumn="1" w:lastColumn="0" w:noHBand="0" w:noVBand="1"/>
+      </w:tblPr>
+      <w:tblGrid>
+        <w:gridCol w:w="1467"/>
+        <w:gridCol w:w="1274"/>
+        <w:gridCol w:w="1626"/>
+        <w:gridCol w:w="1750"/>
+        <w:gridCol w:w="1603"/>
+        <w:gridCol w:w="1296"/>
+      </w:tblGrid>
+      <w:tr>
+        <w:trPr>
+          <w:cnfStyle w:val="100000000000" w:firstRow="1" w:lastRow="0" w:firstColumn="0" w:lastColumn="0" w:oddVBand="0" w:evenVBand="0" w:oddHBand="0" w:evenHBand="0" w:firstRowFirstColumn="0" w:firstRowLastColumn="0" w:lastRowFirstColumn="0" w:lastRowLastColumn="0"/>
+        </w:trPr>
+        <w:tc>
+          <w:tcPr>
+            <w:cnfStyle w:val="001000000000" w:firstRow="0" w:lastRow="0" w:firstColumn="1" w:lastColumn="0" w:oddVBand="0" w:evenVBand="0" w:oddHBand="0" w:evenHBand="0" w:firstRowFirstColumn="0" w:firstRowLastColumn="0" w:lastRowFirstColumn="0" w:lastRowLastColumn="0"/>
+            <w:tcW w:w="1467" w:type="dxa"/>
+          </w:tcPr>
+          <w:p>
+            <w:r>
+              <w:t>Component</w:t>
+            </w:r>
+          </w:p>
+        </w:tc>
+        <w:tc>
+          <w:tcPr>
+            <w:tcW w:w="1274" w:type="dxa"/>
+          </w:tcPr>
+          <w:p>
+            <w:pPr>
+              <w:jc w:val="center"/>
+              <w:cnfStyle w:val="100000000000" w:firstRow="1" w:lastRow="0" w:firstColumn="0" w:lastColumn="0" w:oddVBand="0" w:evenVBand="0" w:oddHBand="0" w:evenHBand="0" w:firstRowFirstColumn="0" w:firstRowLastColumn="0" w:lastRowFirstColumn="0" w:lastRowLastColumn="0"/>
+            </w:pPr>
+            <w:r>
+              <w:t>Test Type</w:t>
+            </w:r>
+          </w:p>
+        </w:tc>
+        <w:tc>
+          <w:tcPr>
+            <w:tcW w:w="1626" w:type="dxa"/>
+          </w:tcPr>
+          <w:p>
+            <w:pPr>
+              <w:cnfStyle w:val="100000000000" w:firstRow="1" w:lastRow="0" w:firstColumn="0" w:lastColumn="0" w:oddVBand="0" w:evenVBand="0" w:oddHBand="0" w:evenHBand="0" w:firstRowFirstColumn="0" w:firstRowLastColumn="0" w:lastRowFirstColumn="0" w:lastRowLastColumn="0"/>
+            </w:pPr>
+            <w:r>
+              <w:t>Doel</w:t>
+            </w:r>
+          </w:p>
+        </w:tc>
+        <w:tc>
+          <w:tcPr>
+            <w:tcW w:w="1750" w:type="dxa"/>
+          </w:tcPr>
+          <w:p>
+            <w:pPr>
+              <w:cnfStyle w:val="100000000000" w:firstRow="1" w:lastRow="0" w:firstColumn="0" w:lastColumn="0" w:oddVBand="0" w:evenVBand="0" w:oddHBand="0" w:evenHBand="0" w:firstRowFirstColumn="0" w:firstRowLastColumn="0" w:lastRowFirstColumn="0" w:lastRowLastColumn="0"/>
+            </w:pPr>
+            <w:r>
+              <w:t>Test Procedure</w:t>
+            </w:r>
+          </w:p>
+        </w:tc>
+        <w:tc>
+          <w:tcPr>
+            <w:tcW w:w="1603" w:type="dxa"/>
+          </w:tcPr>
+          <w:p>
+            <w:pPr>
+              <w:cnfStyle w:val="100000000000" w:firstRow="1" w:lastRow="0" w:firstColumn="0" w:lastColumn="0" w:oddVBand="0" w:evenVBand="0" w:oddHBand="0" w:evenHBand="0" w:firstRowFirstColumn="0" w:firstRowLastColumn="0" w:lastRowFirstColumn="0" w:lastRowLastColumn="0"/>
+            </w:pPr>
+            <w:r>
+              <w:t>Verwacht Resultaat</w:t>
+            </w:r>
+          </w:p>
+        </w:tc>
+        <w:tc>
+          <w:tcPr>
+            <w:tcW w:w="1296" w:type="dxa"/>
+          </w:tcPr>
+          <w:p>
+            <w:pPr>
+              <w:jc w:val="center"/>
+              <w:cnfStyle w:val="100000000000" w:firstRow="1" w:lastRow="0" w:firstColumn="0" w:lastColumn="0" w:oddVBand="0" w:evenVBand="0" w:oddHBand="0" w:evenHBand="0" w:firstRowFirstColumn="0" w:firstRowLastColumn="0" w:lastRowFirstColumn="0" w:lastRowLastColumn="0"/>
+            </w:pPr>
+            <w:r>
+              <w:t>Test Resultaat</w:t>
+            </w:r>
+          </w:p>
+        </w:tc>
+      </w:tr>
+      <w:tr>
+        <w:trPr>
+          <w:cnfStyle w:val="000000100000" w:firstRow="0" w:lastRow="0" w:firstColumn="0" w:lastColumn="0" w:oddVBand="0" w:evenVBand="0" w:oddHBand="1" w:evenHBand="0" w:firstRowFirstColumn="0" w:firstRowLastColumn="0" w:lastRowFirstColumn="0" w:lastRowLastColumn="0"/>
+        </w:trPr>
+        <w:tc>
+          <w:tcPr>
+            <w:cnfStyle w:val="001000000000" w:firstRow="0" w:lastRow="0" w:firstColumn="1" w:lastColumn="0" w:oddVBand="0" w:evenVBand="0" w:oddHBand="0" w:evenHBand="0" w:firstRowFirstColumn="0" w:firstRowLastColumn="0" w:lastRowFirstColumn="0" w:lastRowLastColumn="0"/>
+            <w:tcW w:w="1467" w:type="dxa"/>
+          </w:tcPr>
+          <w:p>
+            <w:pPr>
+              <w:rPr>
+                <w:b w:val="0"/>
+                <w:bCs w:val="0"/>
+              </w:rPr>
+            </w:pPr>
+            <w:r>
+              <w:rPr>
+                <w:b w:val="0"/>
+                <w:bCs w:val="0"/>
+              </w:rPr>
+              <w:t>NFC Module</w:t>
+            </w:r>
+          </w:p>
+        </w:tc>
+        <w:tc>
+          <w:tcPr>
+            <w:tcW w:w="1274" w:type="dxa"/>
+          </w:tcPr>
+          <w:p>
+            <w:pPr>
+              <w:jc w:val="center"/>
+              <w:cnfStyle w:val="000000100000" w:firstRow="0" w:lastRow="0" w:firstColumn="0" w:lastColumn="0" w:oddVBand="0" w:evenVBand="0" w:oddHBand="1" w:evenHBand="0" w:firstRowFirstColumn="0" w:firstRowLastColumn="0" w:lastRowFirstColumn="0" w:lastRowLastColumn="0"/>
+            </w:pPr>
+            <w:r>
+              <w:t>Unit Test</w:t>
+            </w:r>
+          </w:p>
+        </w:tc>
+        <w:tc>
+          <w:tcPr>
+            <w:tcW w:w="1626" w:type="dxa"/>
+          </w:tcPr>
+          <w:p>
+            <w:pPr>
+              <w:cnfStyle w:val="000000100000" w:firstRow="0" w:lastRow="0" w:firstColumn="0" w:lastColumn="0" w:oddVBand="0" w:evenVBand="0" w:oddHBand="1" w:evenHBand="0" w:firstRowFirstColumn="0" w:firstRowLastColumn="0" w:lastRowFirstColumn="0" w:lastRowLastColumn="0"/>
+            </w:pPr>
+            <w:r>
+              <w:t xml:space="preserve">Verifieer dat de </w:t>
+            </w:r>
+            <w:r>
+              <w:t>module</w:t>
+            </w:r>
+            <w:r>
+              <w:t xml:space="preserve"> werkt</w:t>
+            </w:r>
+          </w:p>
+        </w:tc>
+        <w:tc>
+          <w:tcPr>
+            <w:tcW w:w="1750" w:type="dxa"/>
+          </w:tcPr>
+          <w:p>
+            <w:pPr>
+              <w:cnfStyle w:val="000000100000" w:firstRow="0" w:lastRow="0" w:firstColumn="0" w:lastColumn="0" w:oddVBand="0" w:evenVBand="0" w:oddHBand="1" w:evenHBand="0" w:firstRowFirstColumn="0" w:firstRowLastColumn="0" w:lastRowFirstColumn="0" w:lastRowLastColumn="0"/>
+            </w:pPr>
+            <w:r>
+              <w:t xml:space="preserve">Test </w:t>
+            </w:r>
+            <w:r>
+              <w:t>voorbeeld</w:t>
+            </w:r>
+            <w:r>
+              <w:t>code van fabrikant</w:t>
+            </w:r>
+          </w:p>
+        </w:tc>
+        <w:tc>
+          <w:tcPr>
+            <w:tcW w:w="1603" w:type="dxa"/>
+          </w:tcPr>
+          <w:p>
+            <w:pPr>
+              <w:cnfStyle w:val="000000100000" w:firstRow="0" w:lastRow="0" w:firstColumn="0" w:lastColumn="0" w:oddVBand="0" w:evenVBand="0" w:oddHBand="1" w:evenHBand="0" w:firstRowFirstColumn="0" w:firstRowLastColumn="0" w:lastRowFirstColumn="0" w:lastRowLastColumn="0"/>
+            </w:pPr>
+            <w:r>
+              <w:t xml:space="preserve">De Module leest en schrijft </w:t>
+            </w:r>
+            <w:r>
+              <w:t>zoals verwacht</w:t>
+            </w:r>
+          </w:p>
+        </w:tc>
+        <w:tc>
+          <w:tcPr>
+            <w:tcW w:w="1296" w:type="dxa"/>
+          </w:tcPr>
+          <w:p>
+            <w:pPr>
+              <w:jc w:val="center"/>
+              <w:cnfStyle w:val="000000100000" w:firstRow="0" w:lastRow="0" w:firstColumn="0" w:lastColumn="0" w:oddVBand="0" w:evenVBand="0" w:oddHBand="1" w:evenHBand="0" w:firstRowFirstColumn="0" w:firstRowLastColumn="0" w:lastRowFirstColumn="0" w:lastRowLastColumn="0"/>
+            </w:pPr>
+            <w:r>
+              <w:drawing>
+                <wp:inline distT="0" distB="0" distL="0" distR="0" wp14:anchorId="4FA316C0" wp14:editId="3BA1C790">
+                  <wp:extent cx="603250" cy="603250"/>
+                  <wp:effectExtent l="0" t="0" r="0" b="0"/>
+                  <wp:docPr id="1165800592" name="Picture 6" descr="Check mark vector icon. Checkmark right symbol tick sign. Ok button correct  circle icon. 8134818 Vector Art at Vecteezy"/>
+                  <wp:cNvGraphicFramePr>
+                    <a:graphicFrameLocks xmlns:a="http://schemas.openxmlformats.org/drawingml/2006/main" noChangeAspect="1"/>
+                  </wp:cNvGraphicFramePr>
+                  <a:graphic xmlns:a="http://schemas.openxmlformats.org/drawingml/2006/main">
+                    <a:graphicData uri="http://schemas.openxmlformats.org/drawingml/2006/picture">
+                      <pic:pic xmlns:pic="http://schemas.openxmlformats.org/drawingml/2006/picture">
+                        <pic:nvPicPr>
+                          <pic:cNvPr id="0" name="Picture 14" descr="Check mark vector icon. Checkmark right symbol tick sign. Ok button correct  circle icon. 8134818 Vector Art at Vecteezy"/>
+                          <pic:cNvPicPr>
+                            <a:picLocks noChangeAspect="1" noChangeArrowheads="1"/>
+                          </pic:cNvPicPr>
+                        </pic:nvPicPr>
+                        <pic:blipFill>
+                          <a:blip r:embed="rId34" cstate="print">
+                            <a:extLst>
+                              <a:ext uri="{BEBA8EAE-BF5A-486C-A8C5-ECC9F3942E4B}">
+                                <a14:imgProps xmlns:a14="http://schemas.microsoft.com/office/drawing/2010/main">
+                                  <a14:imgLayer r:embed="rId35">
+                                    <a14:imgEffect>
+                                      <a14:backgroundRemoval t="10000" b="90000" l="10000" r="90000"/>
+                                    </a14:imgEffect>
+                                  </a14:imgLayer>
+                                </a14:imgProps>
+                              </a:ext>
+                              <a:ext uri="{28A0092B-C50C-407E-A947-70E740481C1C}">
+                                <a14:useLocalDpi xmlns:a14="http://schemas.microsoft.com/office/drawing/2010/main" val="0"/>
+                              </a:ext>
+                            </a:extLst>
+                          </a:blip>
+                          <a:srcRect/>
+                          <a:stretch>
+                            <a:fillRect/>
+                          </a:stretch>
+                        </pic:blipFill>
+                        <pic:spPr bwMode="auto">
+                          <a:xfrm>
+                            <a:off x="0" y="0"/>
+                            <a:ext cx="603250" cy="603250"/>
+                          </a:xfrm>
+                          <a:prstGeom prst="rect">
+                            <a:avLst/>
+                          </a:prstGeom>
+                          <a:noFill/>
+                          <a:ln>
+                            <a:noFill/>
+                          </a:ln>
+                        </pic:spPr>
+                      </pic:pic>
+                    </a:graphicData>
+                  </a:graphic>
+                </wp:inline>
+              </w:drawing>
+            </w:r>
+          </w:p>
+        </w:tc>
+      </w:tr>
+      <w:tr>
+        <w:tc>
+          <w:tcPr>
+            <w:cnfStyle w:val="001000000000" w:firstRow="0" w:lastRow="0" w:firstColumn="1" w:lastColumn="0" w:oddVBand="0" w:evenVBand="0" w:oddHBand="0" w:evenHBand="0" w:firstRowFirstColumn="0" w:firstRowLastColumn="0" w:lastRowFirstColumn="0" w:lastRowLastColumn="0"/>
+            <w:tcW w:w="1467" w:type="dxa"/>
+          </w:tcPr>
+          <w:p>
+            <w:pPr>
+              <w:rPr>
+                <w:b w:val="0"/>
+                <w:bCs w:val="0"/>
+              </w:rPr>
+            </w:pPr>
+            <w:r>
+              <w:rPr>
+                <w:b w:val="0"/>
+                <w:bCs w:val="0"/>
+              </w:rPr>
+              <w:t>NFC Module</w:t>
+            </w:r>
+          </w:p>
+        </w:tc>
+        <w:tc>
+          <w:tcPr>
+            <w:tcW w:w="1274" w:type="dxa"/>
+          </w:tcPr>
+          <w:p>
+            <w:pPr>
+              <w:jc w:val="center"/>
+              <w:cnfStyle w:val="000000000000" w:firstRow="0" w:lastRow="0" w:firstColumn="0" w:lastColumn="0" w:oddVBand="0" w:evenVBand="0" w:oddHBand="0" w:evenHBand="0" w:firstRowFirstColumn="0" w:firstRowLastColumn="0" w:lastRowFirstColumn="0" w:lastRowLastColumn="0"/>
+            </w:pPr>
+            <w:r>
+              <w:t>Integration Test</w:t>
+            </w:r>
+          </w:p>
+        </w:tc>
+        <w:tc>
+          <w:tcPr>
+            <w:tcW w:w="1626" w:type="dxa"/>
+          </w:tcPr>
+          <w:p>
+            <w:pPr>
+              <w:cnfStyle w:val="000000000000" w:firstRow="0" w:lastRow="0" w:firstColumn="0" w:lastColumn="0" w:oddVBand="0" w:evenVBand="0" w:oddHBand="0" w:evenHBand="0" w:firstRowFirstColumn="0" w:firstRowLastColumn="0" w:lastRowFirstColumn="0" w:lastRowLastColumn="0"/>
+            </w:pPr>
+            <w:r>
+              <w:t xml:space="preserve">Verifieer dat </w:t>
+            </w:r>
+            <w:r>
+              <w:t>de module correct integreert met de rest van het systeem</w:t>
+            </w:r>
+          </w:p>
+        </w:tc>
+        <w:tc>
+          <w:tcPr>
+            <w:tcW w:w="1750" w:type="dxa"/>
+          </w:tcPr>
+          <w:p>
+            <w:pPr>
+              <w:cnfStyle w:val="000000000000" w:firstRow="0" w:lastRow="0" w:firstColumn="0" w:lastColumn="0" w:oddVBand="0" w:evenVBand="0" w:oddHBand="0" w:evenHBand="0" w:firstRowFirstColumn="0" w:firstRowLastColumn="0" w:lastRowFirstColumn="0" w:lastRowLastColumn="0"/>
+            </w:pPr>
+            <w:r>
+              <w:t xml:space="preserve">Test </w:t>
+            </w:r>
+            <w:r>
+              <w:t>de volledige integratie</w:t>
+            </w:r>
+            <w:r>
+              <w:t xml:space="preserve"> van </w:t>
+            </w:r>
+            <w:r>
+              <w:t>de NFC module met de rest van het systeem</w:t>
+            </w:r>
+          </w:p>
+        </w:tc>
+        <w:tc>
+          <w:tcPr>
+            <w:tcW w:w="1603" w:type="dxa"/>
+          </w:tcPr>
+          <w:p>
+            <w:pPr>
+              <w:cnfStyle w:val="000000000000" w:firstRow="0" w:lastRow="0" w:firstColumn="0" w:lastColumn="0" w:oddVBand="0" w:evenVBand="0" w:oddHBand="0" w:evenHBand="0" w:firstRowFirstColumn="0" w:firstRowLastColumn="0" w:lastRowFirstColumn="0" w:lastRowLastColumn="0"/>
+            </w:pPr>
+            <w:r>
+              <w:t>NFC module leest en schrijft</w:t>
+            </w:r>
+            <w:r>
+              <w:t xml:space="preserve"> wanneer nodig</w:t>
+            </w:r>
+          </w:p>
+        </w:tc>
+        <w:tc>
+          <w:tcPr>
+            <w:tcW w:w="1296" w:type="dxa"/>
+          </w:tcPr>
+          <w:p>
+            <w:pPr>
+              <w:jc w:val="center"/>
+              <w:cnfStyle w:val="000000000000" w:firstRow="0" w:lastRow="0" w:firstColumn="0" w:lastColumn="0" w:oddVBand="0" w:evenVBand="0" w:oddHBand="0" w:evenHBand="0" w:firstRowFirstColumn="0" w:firstRowLastColumn="0" w:lastRowFirstColumn="0" w:lastRowLastColumn="0"/>
+            </w:pPr>
+          </w:p>
+          <w:p>
+            <w:pPr>
+              <w:jc w:val="center"/>
+              <w:cnfStyle w:val="000000000000" w:firstRow="0" w:lastRow="0" w:firstColumn="0" w:lastColumn="0" w:oddVBand="0" w:evenVBand="0" w:oddHBand="0" w:evenHBand="0" w:firstRowFirstColumn="0" w:firstRowLastColumn="0" w:lastRowFirstColumn="0" w:lastRowLastColumn="0"/>
+            </w:pPr>
+            <w:r>
+              <w:drawing>
+                <wp:inline distT="0" distB="0" distL="0" distR="0" wp14:anchorId="3344CC22" wp14:editId="69CEBFD2">
+                  <wp:extent cx="603250" cy="603250"/>
+                  <wp:effectExtent l="0" t="0" r="0" b="0"/>
+                  <wp:docPr id="1879023760" name="Picture 6" descr="Check mark vector icon. Checkmark right symbol tick sign. Ok button correct  circle icon. 8134818 Vector Art at Vecteezy"/>
+                  <wp:cNvGraphicFramePr>
+                    <a:graphicFrameLocks xmlns:a="http://schemas.openxmlformats.org/drawingml/2006/main" noChangeAspect="1"/>
+                  </wp:cNvGraphicFramePr>
+                  <a:graphic xmlns:a="http://schemas.openxmlformats.org/drawingml/2006/main">
+                    <a:graphicData uri="http://schemas.openxmlformats.org/drawingml/2006/picture">
+                      <pic:pic xmlns:pic="http://schemas.openxmlformats.org/drawingml/2006/picture">
+                        <pic:nvPicPr>
+                          <pic:cNvPr id="0" name="Picture 14" descr="Check mark vector icon. Checkmark right symbol tick sign. Ok button correct  circle icon. 8134818 Vector Art at Vecteezy"/>
+                          <pic:cNvPicPr>
+                            <a:picLocks noChangeAspect="1" noChangeArrowheads="1"/>
+                          </pic:cNvPicPr>
+                        </pic:nvPicPr>
+                        <pic:blipFill>
+                          <a:blip r:embed="rId34" cstate="print">
+                            <a:extLst>
+                              <a:ext uri="{BEBA8EAE-BF5A-486C-A8C5-ECC9F3942E4B}">
+                                <a14:imgProps xmlns:a14="http://schemas.microsoft.com/office/drawing/2010/main">
+                                  <a14:imgLayer r:embed="rId35">
+                                    <a14:imgEffect>
+                                      <a14:backgroundRemoval t="10000" b="90000" l="10000" r="90000"/>
+                                    </a14:imgEffect>
+                                  </a14:imgLayer>
+                                </a14:imgProps>
+                              </a:ext>
+                              <a:ext uri="{28A0092B-C50C-407E-A947-70E740481C1C}">
+                                <a14:useLocalDpi xmlns:a14="http://schemas.microsoft.com/office/drawing/2010/main" val="0"/>
+                              </a:ext>
+                            </a:extLst>
+                          </a:blip>
+                          <a:srcRect/>
+                          <a:stretch>
+                            <a:fillRect/>
+                          </a:stretch>
+                        </pic:blipFill>
+                        <pic:spPr bwMode="auto">
+                          <a:xfrm>
+                            <a:off x="0" y="0"/>
+                            <a:ext cx="603250" cy="603250"/>
+                          </a:xfrm>
+                          <a:prstGeom prst="rect">
+                            <a:avLst/>
+                          </a:prstGeom>
+                          <a:noFill/>
+                          <a:ln>
+                            <a:noFill/>
+                          </a:ln>
+                        </pic:spPr>
+                      </pic:pic>
+                    </a:graphicData>
+                  </a:graphic>
+                </wp:inline>
+              </w:drawing>
+            </w:r>
+          </w:p>
+        </w:tc>
+      </w:tr>
+      <w:tr>
+        <w:trPr>
+          <w:cnfStyle w:val="000000100000" w:firstRow="0" w:lastRow="0" w:firstColumn="0" w:lastColumn="0" w:oddVBand="0" w:evenVBand="0" w:oddHBand="1" w:evenHBand="0" w:firstRowFirstColumn="0" w:firstRowLastColumn="0" w:lastRowFirstColumn="0" w:lastRowLastColumn="0"/>
+        </w:trPr>
+        <w:tc>
+          <w:tcPr>
+            <w:cnfStyle w:val="001000000000" w:firstRow="0" w:lastRow="0" w:firstColumn="1" w:lastColumn="0" w:oddVBand="0" w:evenVBand="0" w:oddHBand="0" w:evenHBand="0" w:firstRowFirstColumn="0" w:firstRowLastColumn="0" w:lastRowFirstColumn="0" w:lastRowLastColumn="0"/>
+            <w:tcW w:w="1467" w:type="dxa"/>
+          </w:tcPr>
+          <w:p>
+            <w:pPr>
+              <w:rPr>
+                <w:b w:val="0"/>
+                <w:bCs w:val="0"/>
+              </w:rPr>
+            </w:pPr>
+            <w:r>
+              <w:rPr>
+                <w:b w:val="0"/>
+                <w:bCs w:val="0"/>
+              </w:rPr>
+              <w:t>NFC Module</w:t>
+            </w:r>
+          </w:p>
+        </w:tc>
+        <w:tc>
+          <w:tcPr>
+            <w:tcW w:w="1274" w:type="dxa"/>
+          </w:tcPr>
+          <w:p>
+            <w:pPr>
+              <w:jc w:val="center"/>
+              <w:cnfStyle w:val="000000100000" w:firstRow="0" w:lastRow="0" w:firstColumn="0" w:lastColumn="0" w:oddVBand="0" w:evenVBand="0" w:oddHBand="1" w:evenHBand="0" w:firstRowFirstColumn="0" w:firstRowLastColumn="0" w:lastRowFirstColumn="0" w:lastRowLastColumn="0"/>
+            </w:pPr>
+            <w:r>
+              <w:t>Real-World Test</w:t>
+            </w:r>
+          </w:p>
+        </w:tc>
+        <w:tc>
+          <w:tcPr>
+            <w:tcW w:w="1626" w:type="dxa"/>
+          </w:tcPr>
+          <w:p>
+            <w:pPr>
+              <w:cnfStyle w:val="000000100000" w:firstRow="0" w:lastRow="0" w:firstColumn="0" w:lastColumn="0" w:oddVBand="0" w:evenVBand="0" w:oddHBand="1" w:evenHBand="0" w:firstRowFirstColumn="0" w:firstRowLastColumn="0" w:lastRowFirstColumn="0" w:lastRowLastColumn="0"/>
+            </w:pPr>
+            <w:r>
+              <w:t>Testen van de module in een zo realistisch mogelijke situatie</w:t>
+            </w:r>
+          </w:p>
+        </w:tc>
+        <w:tc>
+          <w:tcPr>
+            <w:tcW w:w="1750" w:type="dxa"/>
+          </w:tcPr>
+          <w:p>
+            <w:pPr>
+              <w:cnfStyle w:val="000000100000" w:firstRow="0" w:lastRow="0" w:firstColumn="0" w:lastColumn="0" w:oddVBand="0" w:evenVBand="0" w:oddHBand="1" w:evenHBand="0" w:firstRowFirstColumn="0" w:firstRowLastColumn="0" w:lastRowFirstColumn="0" w:lastRowLastColumn="0"/>
+            </w:pPr>
+            <w:r>
+              <w:t>Test het systeem</w:t>
+            </w:r>
+            <w:r>
+              <w:t xml:space="preserve"> in </w:t>
+            </w:r>
+            <w:r>
+              <w:t>behuizing en realistische situatie</w:t>
+            </w:r>
+          </w:p>
+        </w:tc>
+        <w:tc>
+          <w:tcPr>
+            <w:tcW w:w="1603" w:type="dxa"/>
+          </w:tcPr>
+          <w:p>
+            <w:pPr>
+              <w:cnfStyle w:val="000000100000" w:firstRow="0" w:lastRow="0" w:firstColumn="0" w:lastColumn="0" w:oddVBand="0" w:evenVBand="0" w:oddHBand="1" w:evenHBand="0" w:firstRowFirstColumn="0" w:firstRowLastColumn="0" w:lastRowFirstColumn="0" w:lastRowLastColumn="0"/>
+            </w:pPr>
+            <w:r>
+              <w:t xml:space="preserve">NFC module </w:t>
+            </w:r>
+            <w:r>
+              <w:t xml:space="preserve">leest en schrijft </w:t>
+            </w:r>
+            <w:r>
+              <w:t>wanneer nodig</w:t>
+            </w:r>
+          </w:p>
+        </w:tc>
+        <w:tc>
+          <w:tcPr>
+            <w:tcW w:w="1296" w:type="dxa"/>
+          </w:tcPr>
+          <w:p>
+            <w:pPr>
+              <w:jc w:val="center"/>
+              <w:cnfStyle w:val="000000100000" w:firstRow="0" w:lastRow="0" w:firstColumn="0" w:lastColumn="0" w:oddVBand="0" w:evenVBand="0" w:oddHBand="1" w:evenHBand="0" w:firstRowFirstColumn="0" w:firstRowLastColumn="0" w:lastRowFirstColumn="0" w:lastRowLastColumn="0"/>
+            </w:pPr>
+          </w:p>
+          <w:p>
+            <w:pPr>
+              <w:jc w:val="center"/>
+              <w:cnfStyle w:val="000000100000" w:firstRow="0" w:lastRow="0" w:firstColumn="0" w:lastColumn="0" w:oddVBand="0" w:evenVBand="0" w:oddHBand="1" w:evenHBand="0" w:firstRowFirstColumn="0" w:firstRowLastColumn="0" w:lastRowFirstColumn="0" w:lastRowLastColumn="0"/>
+            </w:pPr>
+            <w:r>
+              <w:drawing>
+                <wp:inline distT="0" distB="0" distL="0" distR="0" wp14:anchorId="100720FE" wp14:editId="08DEE39D">
+                  <wp:extent cx="603250" cy="603250"/>
+                  <wp:effectExtent l="0" t="0" r="0" b="0"/>
+                  <wp:docPr id="790655500" name="Picture 6" descr="Check mark vector icon. Checkmark right symbol tick sign. Ok button correct  circle icon. 8134818 Vector Art at Vecteezy"/>
+                  <wp:cNvGraphicFramePr>
+                    <a:graphicFrameLocks xmlns:a="http://schemas.openxmlformats.org/drawingml/2006/main" noChangeAspect="1"/>
+                  </wp:cNvGraphicFramePr>
+                  <a:graphic xmlns:a="http://schemas.openxmlformats.org/drawingml/2006/main">
+                    <a:graphicData uri="http://schemas.openxmlformats.org/drawingml/2006/picture">
+                      <pic:pic xmlns:pic="http://schemas.openxmlformats.org/drawingml/2006/picture">
+                        <pic:nvPicPr>
+                          <pic:cNvPr id="0" name="Picture 14" descr="Check mark vector icon. Checkmark right symbol tick sign. Ok button correct  circle icon. 8134818 Vector Art at Vecteezy"/>
+                          <pic:cNvPicPr>
+                            <a:picLocks noChangeAspect="1" noChangeArrowheads="1"/>
+                          </pic:cNvPicPr>
+                        </pic:nvPicPr>
+                        <pic:blipFill>
+                          <a:blip r:embed="rId34" cstate="print">
+                            <a:extLst>
+                              <a:ext uri="{BEBA8EAE-BF5A-486C-A8C5-ECC9F3942E4B}">
+                                <a14:imgProps xmlns:a14="http://schemas.microsoft.com/office/drawing/2010/main">
+                                  <a14:imgLayer r:embed="rId35">
+                                    <a14:imgEffect>
+                                      <a14:backgroundRemoval t="10000" b="90000" l="10000" r="90000"/>
+                                    </a14:imgEffect>
+                                  </a14:imgLayer>
+                                </a14:imgProps>
+                              </a:ext>
+                              <a:ext uri="{28A0092B-C50C-407E-A947-70E740481C1C}">
+                                <a14:useLocalDpi xmlns:a14="http://schemas.microsoft.com/office/drawing/2010/main" val="0"/>
+                              </a:ext>
+                            </a:extLst>
+                          </a:blip>
+                          <a:srcRect/>
+                          <a:stretch>
+                            <a:fillRect/>
+                          </a:stretch>
+                        </pic:blipFill>
+                        <pic:spPr bwMode="auto">
+                          <a:xfrm>
+                            <a:off x="0" y="0"/>
+                            <a:ext cx="603250" cy="603250"/>
+                          </a:xfrm>
+                          <a:prstGeom prst="rect">
+                            <a:avLst/>
+                          </a:prstGeom>
+                          <a:noFill/>
+                          <a:ln>
+                            <a:noFill/>
+                          </a:ln>
+                        </pic:spPr>
+                      </pic:pic>
+                    </a:graphicData>
+                  </a:graphic>
+                </wp:inline>
+              </w:drawing>
+            </w:r>
+          </w:p>
+        </w:tc>
+      </w:tr>
+      <w:tr>
+        <w:tc>
+          <w:tcPr>
+            <w:cnfStyle w:val="001000000000" w:firstRow="0" w:lastRow="0" w:firstColumn="1" w:lastColumn="0" w:oddVBand="0" w:evenVBand="0" w:oddHBand="0" w:evenHBand="0" w:firstRowFirstColumn="0" w:firstRowLastColumn="0" w:lastRowFirstColumn="0" w:lastRowLastColumn="0"/>
+            <w:tcW w:w="1467" w:type="dxa"/>
+          </w:tcPr>
+          <w:p>
+            <w:pPr>
+              <w:rPr>
+                <w:b w:val="0"/>
+                <w:bCs w:val="0"/>
+              </w:rPr>
+            </w:pPr>
+            <w:r>
+              <w:rPr>
+                <w:b w:val="0"/>
+                <w:bCs w:val="0"/>
+              </w:rPr>
+              <w:t>NFC Module</w:t>
+            </w:r>
+          </w:p>
+        </w:tc>
+        <w:tc>
+          <w:tcPr>
+            <w:tcW w:w="1274" w:type="dxa"/>
+          </w:tcPr>
+          <w:p>
+            <w:pPr>
+              <w:jc w:val="center"/>
+              <w:cnfStyle w:val="000000000000" w:firstRow="0" w:lastRow="0" w:firstColumn="0" w:lastColumn="0" w:oddVBand="0" w:evenVBand="0" w:oddHBand="0" w:evenHBand="0" w:firstRowFirstColumn="0" w:firstRowLastColumn="0" w:lastRowFirstColumn="0" w:lastRowLastColumn="0"/>
+            </w:pPr>
+            <w:r>
+              <w:t>Load Test</w:t>
+            </w:r>
+          </w:p>
+        </w:tc>
+        <w:tc>
+          <w:tcPr>
+            <w:tcW w:w="1626" w:type="dxa"/>
+          </w:tcPr>
+          <w:p>
+            <w:pPr>
+              <w:cnfStyle w:val="000000000000" w:firstRow="0" w:lastRow="0" w:firstColumn="0" w:lastColumn="0" w:oddVBand="0" w:evenVBand="0" w:oddHBand="0" w:evenHBand="0" w:firstRowFirstColumn="0" w:firstRowLastColumn="0" w:lastRowFirstColumn="0" w:lastRowLastColumn="0"/>
+            </w:pPr>
+            <w:r>
+              <w:t>Test de limieten van de NFC module</w:t>
+            </w:r>
+          </w:p>
+        </w:tc>
+        <w:tc>
+          <w:tcPr>
+            <w:tcW w:w="1750" w:type="dxa"/>
+          </w:tcPr>
+          <w:p>
+            <w:pPr>
+              <w:cnfStyle w:val="000000000000" w:firstRow="0" w:lastRow="0" w:firstColumn="0" w:lastColumn="0" w:oddVBand="0" w:evenVBand="0" w:oddHBand="0" w:evenHBand="0" w:firstRowFirstColumn="0" w:firstRowLastColumn="0" w:lastRowFirstColumn="0" w:lastRowLastColumn="0"/>
+            </w:pPr>
+            <w:r>
+              <w:t>Test maximale afstand en leessnelheid van de module</w:t>
+            </w:r>
+          </w:p>
+        </w:tc>
+        <w:tc>
+          <w:tcPr>
+            <w:tcW w:w="1603" w:type="dxa"/>
+          </w:tcPr>
+          <w:p>
+            <w:pPr>
+              <w:cnfStyle w:val="000000000000" w:firstRow="0" w:lastRow="0" w:firstColumn="0" w:lastColumn="0" w:oddVBand="0" w:evenVBand="0" w:oddHBand="0" w:evenHBand="0" w:firstRowFirstColumn="0" w:firstRowLastColumn="0" w:lastRowFirstColumn="0" w:lastRowLastColumn="0"/>
+            </w:pPr>
+            <w:r>
+              <w:t>Module leest en schrijft</w:t>
+            </w:r>
+            <w:r>
+              <w:t xml:space="preserve"> met voldoende snelheid en vanop een respectabele afstand</w:t>
+            </w:r>
+          </w:p>
+        </w:tc>
+        <w:tc>
+          <w:tcPr>
+            <w:tcW w:w="1296" w:type="dxa"/>
+          </w:tcPr>
+          <w:p>
+            <w:pPr>
+              <w:jc w:val="center"/>
+              <w:cnfStyle w:val="000000000000" w:firstRow="0" w:lastRow="0" w:firstColumn="0" w:lastColumn="0" w:oddVBand="0" w:evenVBand="0" w:oddHBand="0" w:evenHBand="0" w:firstRowFirstColumn="0" w:firstRowLastColumn="0" w:lastRowFirstColumn="0" w:lastRowLastColumn="0"/>
+            </w:pPr>
+          </w:p>
+          <w:p>
+            <w:pPr>
+              <w:jc w:val="center"/>
+              <w:cnfStyle w:val="000000000000" w:firstRow="0" w:lastRow="0" w:firstColumn="0" w:lastColumn="0" w:oddVBand="0" w:evenVBand="0" w:oddHBand="0" w:evenHBand="0" w:firstRowFirstColumn="0" w:firstRowLastColumn="0" w:lastRowFirstColumn="0" w:lastRowLastColumn="0"/>
+            </w:pPr>
+          </w:p>
+          <w:p>
+            <w:pPr>
+              <w:jc w:val="center"/>
+              <w:cnfStyle w:val="000000000000" w:firstRow="0" w:lastRow="0" w:firstColumn="0" w:lastColumn="0" w:oddVBand="0" w:evenVBand="0" w:oddHBand="0" w:evenHBand="0" w:firstRowFirstColumn="0" w:firstRowLastColumn="0" w:lastRowFirstColumn="0" w:lastRowLastColumn="0"/>
+            </w:pPr>
+            <w:r>
+              <w:drawing>
+                <wp:inline distT="0" distB="0" distL="0" distR="0" wp14:anchorId="4F7232BA" wp14:editId="16BDC297">
+                  <wp:extent cx="603250" cy="603250"/>
+                  <wp:effectExtent l="0" t="0" r="0" b="0"/>
+                  <wp:docPr id="1546651838" name="Picture 6" descr="Check mark vector icon. Checkmark right symbol tick sign. Ok button correct  circle icon. 8134818 Vector Art at Vecteezy"/>
+                  <wp:cNvGraphicFramePr>
+                    <a:graphicFrameLocks xmlns:a="http://schemas.openxmlformats.org/drawingml/2006/main" noChangeAspect="1"/>
+                  </wp:cNvGraphicFramePr>
+                  <a:graphic xmlns:a="http://schemas.openxmlformats.org/drawingml/2006/main">
+                    <a:graphicData uri="http://schemas.openxmlformats.org/drawingml/2006/picture">
+                      <pic:pic xmlns:pic="http://schemas.openxmlformats.org/drawingml/2006/picture">
+                        <pic:nvPicPr>
+                          <pic:cNvPr id="0" name="Picture 14" descr="Check mark vector icon. Checkmark right symbol tick sign. Ok button correct  circle icon. 8134818 Vector Art at Vecteezy"/>
+                          <pic:cNvPicPr>
+                            <a:picLocks noChangeAspect="1" noChangeArrowheads="1"/>
+                          </pic:cNvPicPr>
+                        </pic:nvPicPr>
+                        <pic:blipFill>
+                          <a:blip r:embed="rId34" cstate="print">
+                            <a:extLst>
+                              <a:ext uri="{BEBA8EAE-BF5A-486C-A8C5-ECC9F3942E4B}">
+                                <a14:imgProps xmlns:a14="http://schemas.microsoft.com/office/drawing/2010/main">
+                                  <a14:imgLayer r:embed="rId35">
+                                    <a14:imgEffect>
+                                      <a14:backgroundRemoval t="10000" b="90000" l="10000" r="90000"/>
+                                    </a14:imgEffect>
+                                  </a14:imgLayer>
+                                </a14:imgProps>
+                              </a:ext>
+                              <a:ext uri="{28A0092B-C50C-407E-A947-70E740481C1C}">
+                                <a14:useLocalDpi xmlns:a14="http://schemas.microsoft.com/office/drawing/2010/main" val="0"/>
+                              </a:ext>
+                            </a:extLst>
+                          </a:blip>
+                          <a:srcRect/>
+                          <a:stretch>
+                            <a:fillRect/>
+                          </a:stretch>
+                        </pic:blipFill>
+                        <pic:spPr bwMode="auto">
+                          <a:xfrm>
+                            <a:off x="0" y="0"/>
+                            <a:ext cx="603250" cy="603250"/>
+                          </a:xfrm>
+                          <a:prstGeom prst="rect">
+                            <a:avLst/>
+                          </a:prstGeom>
+                          <a:noFill/>
+                          <a:ln>
+                            <a:noFill/>
+                          </a:ln>
+                        </pic:spPr>
+                      </pic:pic>
+                    </a:graphicData>
+                  </a:graphic>
+                </wp:inline>
+              </w:drawing>
+            </w:r>
+          </w:p>
+        </w:tc>
+      </w:tr>
+      <w:tr>
+        <w:trPr>
+          <w:cnfStyle w:val="000000100000" w:firstRow="0" w:lastRow="0" w:firstColumn="0" w:lastColumn="0" w:oddVBand="0" w:evenVBand="0" w:oddHBand="1" w:evenHBand="0" w:firstRowFirstColumn="0" w:firstRowLastColumn="0" w:lastRowFirstColumn="0" w:lastRowLastColumn="0"/>
+        </w:trPr>
+        <w:tc>
+          <w:tcPr>
+            <w:cnfStyle w:val="001000000000" w:firstRow="0" w:lastRow="0" w:firstColumn="1" w:lastColumn="0" w:oddVBand="0" w:evenVBand="0" w:oddHBand="0" w:evenHBand="0" w:firstRowFirstColumn="0" w:firstRowLastColumn="0" w:lastRowFirstColumn="0" w:lastRowLastColumn="0"/>
+            <w:tcW w:w="1467" w:type="dxa"/>
+          </w:tcPr>
+          <w:p>
+            <w:pPr>
+              <w:rPr>
+                <w:b w:val="0"/>
+                <w:bCs w:val="0"/>
+              </w:rPr>
+            </w:pPr>
+            <w:r>
+              <w:rPr>
+                <w:b w:val="0"/>
+                <w:bCs w:val="0"/>
+              </w:rPr>
+              <w:t>Hall Sensor</w:t>
+            </w:r>
+          </w:p>
+        </w:tc>
+        <w:tc>
+          <w:tcPr>
+            <w:tcW w:w="1274" w:type="dxa"/>
+          </w:tcPr>
+          <w:p>
+            <w:pPr>
+              <w:jc w:val="center"/>
+              <w:cnfStyle w:val="000000100000" w:firstRow="0" w:lastRow="0" w:firstColumn="0" w:lastColumn="0" w:oddVBand="0" w:evenVBand="0" w:oddHBand="1" w:evenHBand="0" w:firstRowFirstColumn="0" w:firstRowLastColumn="0" w:lastRowFirstColumn="0" w:lastRowLastColumn="0"/>
+            </w:pPr>
+            <w:r>
+              <w:t>Unit Test</w:t>
+            </w:r>
+          </w:p>
+        </w:tc>
+        <w:tc>
+          <w:tcPr>
+            <w:tcW w:w="1626" w:type="dxa"/>
+          </w:tcPr>
+          <w:p>
+            <w:pPr>
+              <w:cnfStyle w:val="000000100000" w:firstRow="0" w:lastRow="0" w:firstColumn="0" w:lastColumn="0" w:oddVBand="0" w:evenVBand="0" w:oddHBand="1" w:evenHBand="0" w:firstRowFirstColumn="0" w:firstRowLastColumn="0" w:lastRowFirstColumn="0" w:lastRowLastColumn="0"/>
+            </w:pPr>
+            <w:r>
+              <w:t>Testen van sensor apart</w:t>
+            </w:r>
+          </w:p>
+        </w:tc>
+        <w:tc>
+          <w:tcPr>
+            <w:tcW w:w="1750" w:type="dxa"/>
+          </w:tcPr>
+          <w:p>
+            <w:pPr>
+              <w:cnfStyle w:val="000000100000" w:firstRow="0" w:lastRow="0" w:firstColumn="0" w:lastColumn="0" w:oddVBand="0" w:evenVBand="0" w:oddHBand="1" w:evenHBand="0" w:firstRowFirstColumn="0" w:firstRowLastColumn="0" w:lastRowFirstColumn="0" w:lastRowLastColumn="0"/>
+            </w:pPr>
+            <w:r>
+              <w:t xml:space="preserve">Lees </w:t>
+            </w:r>
+            <w:r>
+              <w:t>sensor waarde uit en toon in seriële monitor</w:t>
+            </w:r>
+          </w:p>
+        </w:tc>
+        <w:tc>
+          <w:tcPr>
+            <w:tcW w:w="1603" w:type="dxa"/>
+          </w:tcPr>
+          <w:p>
+            <w:pPr>
+              <w:cnfStyle w:val="000000100000" w:firstRow="0" w:lastRow="0" w:firstColumn="0" w:lastColumn="0" w:oddVBand="0" w:evenVBand="0" w:oddHBand="1" w:evenHBand="0" w:firstRowFirstColumn="0" w:firstRowLastColumn="0" w:lastRowFirstColumn="0" w:lastRowLastColumn="0"/>
+            </w:pPr>
+            <w:r>
+              <w:t>Sensorwaarde wordt geprint in seriële monitor</w:t>
+            </w:r>
+          </w:p>
+        </w:tc>
+        <w:tc>
+          <w:tcPr>
+            <w:tcW w:w="1296" w:type="dxa"/>
+          </w:tcPr>
+          <w:p>
+            <w:pPr>
+              <w:jc w:val="center"/>
+              <w:cnfStyle w:val="000000100000" w:firstRow="0" w:lastRow="0" w:firstColumn="0" w:lastColumn="0" w:oddVBand="0" w:evenVBand="0" w:oddHBand="1" w:evenHBand="0" w:firstRowFirstColumn="0" w:firstRowLastColumn="0" w:lastRowFirstColumn="0" w:lastRowLastColumn="0"/>
+            </w:pPr>
+            <w:r>
+              <w:drawing>
+                <wp:inline distT="0" distB="0" distL="0" distR="0" wp14:anchorId="5673CFD7" wp14:editId="7FE88831">
+                  <wp:extent cx="603250" cy="603250"/>
+                  <wp:effectExtent l="0" t="0" r="0" b="0"/>
+                  <wp:docPr id="1099881335" name="Picture 6" descr="Check mark vector icon. Checkmark right symbol tick sign. Ok button correct  circle icon. 8134818 Vector Art at Vecteezy"/>
+                  <wp:cNvGraphicFramePr>
+                    <a:graphicFrameLocks xmlns:a="http://schemas.openxmlformats.org/drawingml/2006/main" noChangeAspect="1"/>
+                  </wp:cNvGraphicFramePr>
+                  <a:graphic xmlns:a="http://schemas.openxmlformats.org/drawingml/2006/main">
+                    <a:graphicData uri="http://schemas.openxmlformats.org/drawingml/2006/picture">
+                      <pic:pic xmlns:pic="http://schemas.openxmlformats.org/drawingml/2006/picture">
+                        <pic:nvPicPr>
+                          <pic:cNvPr id="0" name="Picture 14" descr="Check mark vector icon. Checkmark right symbol tick sign. Ok button correct  circle icon. 8134818 Vector Art at Vecteezy"/>
+                          <pic:cNvPicPr>
+                            <a:picLocks noChangeAspect="1" noChangeArrowheads="1"/>
+                          </pic:cNvPicPr>
+                        </pic:nvPicPr>
+                        <pic:blipFill>
+                          <a:blip r:embed="rId34" cstate="print">
+                            <a:extLst>
+                              <a:ext uri="{BEBA8EAE-BF5A-486C-A8C5-ECC9F3942E4B}">
+                                <a14:imgProps xmlns:a14="http://schemas.microsoft.com/office/drawing/2010/main">
+                                  <a14:imgLayer r:embed="rId35">
+                                    <a14:imgEffect>
+                                      <a14:backgroundRemoval t="10000" b="90000" l="10000" r="90000"/>
+                                    </a14:imgEffect>
+                                  </a14:imgLayer>
+                                </a14:imgProps>
+                              </a:ext>
+                              <a:ext uri="{28A0092B-C50C-407E-A947-70E740481C1C}">
+                                <a14:useLocalDpi xmlns:a14="http://schemas.microsoft.com/office/drawing/2010/main" val="0"/>
+                              </a:ext>
+                            </a:extLst>
+                          </a:blip>
+                          <a:srcRect/>
+                          <a:stretch>
+                            <a:fillRect/>
+                          </a:stretch>
+                        </pic:blipFill>
+                        <pic:spPr bwMode="auto">
+                          <a:xfrm>
+                            <a:off x="0" y="0"/>
+                            <a:ext cx="603250" cy="603250"/>
+                          </a:xfrm>
+                          <a:prstGeom prst="rect">
+                            <a:avLst/>
+                          </a:prstGeom>
+                          <a:noFill/>
+                          <a:ln>
+                            <a:noFill/>
+                          </a:ln>
+                        </pic:spPr>
+                      </pic:pic>
+                    </a:graphicData>
+                  </a:graphic>
+                </wp:inline>
+              </w:drawing>
+            </w:r>
+          </w:p>
+        </w:tc>
+      </w:tr>
+      <w:tr>
+        <w:tc>
+          <w:tcPr>
+            <w:cnfStyle w:val="001000000000" w:firstRow="0" w:lastRow="0" w:firstColumn="1" w:lastColumn="0" w:oddVBand="0" w:evenVBand="0" w:oddHBand="0" w:evenHBand="0" w:firstRowFirstColumn="0" w:firstRowLastColumn="0" w:lastRowFirstColumn="0" w:lastRowLastColumn="0"/>
+            <w:tcW w:w="1467" w:type="dxa"/>
+          </w:tcPr>
+          <w:p>
+            <w:pPr>
+              <w:rPr>
+                <w:b w:val="0"/>
+                <w:bCs w:val="0"/>
+              </w:rPr>
+            </w:pPr>
+            <w:r>
+              <w:rPr>
+                <w:b w:val="0"/>
+                <w:bCs w:val="0"/>
+              </w:rPr>
+              <w:t>Hall Sensor</w:t>
+            </w:r>
+          </w:p>
+        </w:tc>
+        <w:tc>
+          <w:tcPr>
+            <w:tcW w:w="1274" w:type="dxa"/>
+          </w:tcPr>
+          <w:p>
+            <w:pPr>
+              <w:jc w:val="center"/>
+              <w:cnfStyle w:val="000000000000" w:firstRow="0" w:lastRow="0" w:firstColumn="0" w:lastColumn="0" w:oddVBand="0" w:evenVBand="0" w:oddHBand="0" w:evenHBand="0" w:firstRowFirstColumn="0" w:firstRowLastColumn="0" w:lastRowFirstColumn="0" w:lastRowLastColumn="0"/>
+            </w:pPr>
+            <w:r>
+              <w:t>Integration Test</w:t>
+            </w:r>
+          </w:p>
+        </w:tc>
+        <w:tc>
+          <w:tcPr>
+            <w:tcW w:w="1626" w:type="dxa"/>
+          </w:tcPr>
+          <w:p>
+            <w:pPr>
+              <w:cnfStyle w:val="000000000000" w:firstRow="0" w:lastRow="0" w:firstColumn="0" w:lastColumn="0" w:oddVBand="0" w:evenVBand="0" w:oddHBand="0" w:evenHBand="0" w:firstRowFirstColumn="0" w:firstRowLastColumn="0" w:lastRowFirstColumn="0" w:lastRowLastColumn="0"/>
+            </w:pPr>
+            <w:r>
+              <w:t>Verifieer dat de sensor correct werkt met alle componenten</w:t>
+            </w:r>
+          </w:p>
+        </w:tc>
+        <w:tc>
+          <w:tcPr>
+            <w:tcW w:w="1750" w:type="dxa"/>
+          </w:tcPr>
+          <w:p>
+            <w:pPr>
+              <w:cnfStyle w:val="000000000000" w:firstRow="0" w:lastRow="0" w:firstColumn="0" w:lastColumn="0" w:oddVBand="0" w:evenVBand="0" w:oddHBand="0" w:evenHBand="0" w:firstRowFirstColumn="0" w:firstRowLastColumn="0" w:lastRowFirstColumn="0" w:lastRowLastColumn="0"/>
+            </w:pPr>
+            <w:r>
+              <w:t xml:space="preserve">Monitor sensor </w:t>
+            </w:r>
+            <w:r>
+              <w:t>in combinatie met de rest van het systeem</w:t>
+            </w:r>
+          </w:p>
+        </w:tc>
+        <w:tc>
+          <w:tcPr>
+            <w:tcW w:w="1603" w:type="dxa"/>
+          </w:tcPr>
+          <w:p>
+            <w:pPr>
+              <w:cnfStyle w:val="000000000000" w:firstRow="0" w:lastRow="0" w:firstColumn="0" w:lastColumn="0" w:oddVBand="0" w:evenVBand="0" w:oddHBand="0" w:evenHBand="0" w:firstRowFirstColumn="0" w:firstRowLastColumn="0" w:lastRowFirstColumn="0" w:lastRowLastColumn="0"/>
+            </w:pPr>
+            <w:r>
+              <w:t>Sensor retourneert correcte waarden</w:t>
+            </w:r>
+          </w:p>
+        </w:tc>
+        <w:tc>
+          <w:tcPr>
+            <w:tcW w:w="1296" w:type="dxa"/>
+          </w:tcPr>
+          <w:p>
+            <w:pPr>
+              <w:jc w:val="center"/>
+              <w:cnfStyle w:val="000000000000" w:firstRow="0" w:lastRow="0" w:firstColumn="0" w:lastColumn="0" w:oddVBand="0" w:evenVBand="0" w:oddHBand="0" w:evenHBand="0" w:firstRowFirstColumn="0" w:firstRowLastColumn="0" w:lastRowFirstColumn="0" w:lastRowLastColumn="0"/>
+            </w:pPr>
+            <w:r>
+              <w:drawing>
+                <wp:inline distT="0" distB="0" distL="0" distR="0" wp14:anchorId="787833C6" wp14:editId="0B1A02C2">
+                  <wp:extent cx="603250" cy="603250"/>
+                  <wp:effectExtent l="0" t="0" r="0" b="0"/>
+                  <wp:docPr id="257015443" name="Picture 6" descr="Check mark vector icon. Checkmark right symbol tick sign. Ok button correct  circle icon. 8134818 Vector Art at Vecteezy"/>
+                  <wp:cNvGraphicFramePr>
+                    <a:graphicFrameLocks xmlns:a="http://schemas.openxmlformats.org/drawingml/2006/main" noChangeAspect="1"/>
+                  </wp:cNvGraphicFramePr>
+                  <a:graphic xmlns:a="http://schemas.openxmlformats.org/drawingml/2006/main">
+                    <a:graphicData uri="http://schemas.openxmlformats.org/drawingml/2006/picture">
+                      <pic:pic xmlns:pic="http://schemas.openxmlformats.org/drawingml/2006/picture">
+                        <pic:nvPicPr>
+                          <pic:cNvPr id="0" name="Picture 14" descr="Check mark vector icon. Checkmark right symbol tick sign. Ok button correct  circle icon. 8134818 Vector Art at Vecteezy"/>
+                          <pic:cNvPicPr>
+                            <a:picLocks noChangeAspect="1" noChangeArrowheads="1"/>
+                          </pic:cNvPicPr>
+                        </pic:nvPicPr>
+                        <pic:blipFill>
+                          <a:blip r:embed="rId34" cstate="print">
+                            <a:extLst>
+                              <a:ext uri="{BEBA8EAE-BF5A-486C-A8C5-ECC9F3942E4B}">
+                                <a14:imgProps xmlns:a14="http://schemas.microsoft.com/office/drawing/2010/main">
+                                  <a14:imgLayer r:embed="rId35">
+                                    <a14:imgEffect>
+                                      <a14:backgroundRemoval t="10000" b="90000" l="10000" r="90000"/>
+                                    </a14:imgEffect>
+                                  </a14:imgLayer>
+                                </a14:imgProps>
+                              </a:ext>
+                              <a:ext uri="{28A0092B-C50C-407E-A947-70E740481C1C}">
+                                <a14:useLocalDpi xmlns:a14="http://schemas.microsoft.com/office/drawing/2010/main" val="0"/>
+                              </a:ext>
+                            </a:extLst>
+                          </a:blip>
+                          <a:srcRect/>
+                          <a:stretch>
+                            <a:fillRect/>
+                          </a:stretch>
+                        </pic:blipFill>
+                        <pic:spPr bwMode="auto">
+                          <a:xfrm>
+                            <a:off x="0" y="0"/>
+                            <a:ext cx="603250" cy="603250"/>
+                          </a:xfrm>
+                          <a:prstGeom prst="rect">
+                            <a:avLst/>
+                          </a:prstGeom>
+                          <a:noFill/>
+                          <a:ln>
+                            <a:noFill/>
+                          </a:ln>
+                        </pic:spPr>
+                      </pic:pic>
+                    </a:graphicData>
+                  </a:graphic>
+                </wp:inline>
+              </w:drawing>
+            </w:r>
+          </w:p>
+        </w:tc>
+      </w:tr>
+      <w:tr>
+        <w:trPr>
+          <w:cnfStyle w:val="000000100000" w:firstRow="0" w:lastRow="0" w:firstColumn="0" w:lastColumn="0" w:oddVBand="0" w:evenVBand="0" w:oddHBand="1" w:evenHBand="0" w:firstRowFirstColumn="0" w:firstRowLastColumn="0" w:lastRowFirstColumn="0" w:lastRowLastColumn="0"/>
+        </w:trPr>
+        <w:tc>
+          <w:tcPr>
+            <w:cnfStyle w:val="001000000000" w:firstRow="0" w:lastRow="0" w:firstColumn="1" w:lastColumn="0" w:oddVBand="0" w:evenVBand="0" w:oddHBand="0" w:evenHBand="0" w:firstRowFirstColumn="0" w:firstRowLastColumn="0" w:lastRowFirstColumn="0" w:lastRowLastColumn="0"/>
+            <w:tcW w:w="1467" w:type="dxa"/>
+          </w:tcPr>
+          <w:p>
+            <w:pPr>
+              <w:rPr>
+                <w:b w:val="0"/>
+                <w:bCs w:val="0"/>
+              </w:rPr>
+            </w:pPr>
+            <w:r>
+              <w:rPr>
+                <w:b w:val="0"/>
+                <w:bCs w:val="0"/>
+              </w:rPr>
+              <w:t>Hall Sensor</w:t>
+            </w:r>
+          </w:p>
+        </w:tc>
+        <w:tc>
+          <w:tcPr>
+            <w:tcW w:w="1274" w:type="dxa"/>
+          </w:tcPr>
+          <w:p>
+            <w:pPr>
+              <w:jc w:val="center"/>
+              <w:cnfStyle w:val="000000100000" w:firstRow="0" w:lastRow="0" w:firstColumn="0" w:lastColumn="0" w:oddVBand="0" w:evenVBand="0" w:oddHBand="1" w:evenHBand="0" w:firstRowFirstColumn="0" w:firstRowLastColumn="0" w:lastRowFirstColumn="0" w:lastRowLastColumn="0"/>
+            </w:pPr>
+            <w:r>
+              <w:t>Real-World Test</w:t>
+            </w:r>
+          </w:p>
+        </w:tc>
+        <w:tc>
+          <w:tcPr>
+            <w:tcW w:w="1626" w:type="dxa"/>
+          </w:tcPr>
+          <w:p>
+            <w:pPr>
+              <w:cnfStyle w:val="000000100000" w:firstRow="0" w:lastRow="0" w:firstColumn="0" w:lastColumn="0" w:oddVBand="0" w:evenVBand="0" w:oddHBand="1" w:evenHBand="0" w:firstRowFirstColumn="0" w:firstRowLastColumn="0" w:lastRowFirstColumn="0" w:lastRowLastColumn="0"/>
+            </w:pPr>
+            <w:r>
+              <w:t>Test de hall sensor in een realistisch scenario</w:t>
+            </w:r>
+          </w:p>
+        </w:tc>
+        <w:tc>
+          <w:tcPr>
+            <w:tcW w:w="1750" w:type="dxa"/>
+          </w:tcPr>
+          <w:p>
+            <w:pPr>
+              <w:cnfStyle w:val="000000100000" w:firstRow="0" w:lastRow="0" w:firstColumn="0" w:lastColumn="0" w:oddVBand="0" w:evenVBand="0" w:oddHBand="1" w:evenHBand="0" w:firstRowFirstColumn="0" w:firstRowLastColumn="0" w:lastRowFirstColumn="0" w:lastRowLastColumn="0"/>
+            </w:pPr>
+            <w:r>
+              <w:t>Test de sensor</w:t>
+            </w:r>
+            <w:r>
+              <w:t xml:space="preserve"> in finale behuizing met echte deur actie</w:t>
+            </w:r>
+          </w:p>
+        </w:tc>
+        <w:tc>
+          <w:tcPr>
+            <w:tcW w:w="1603" w:type="dxa"/>
+          </w:tcPr>
+          <w:p>
+            <w:pPr>
+              <w:cnfStyle w:val="000000100000" w:firstRow="0" w:lastRow="0" w:firstColumn="0" w:lastColumn="0" w:oddVBand="0" w:evenVBand="0" w:oddHBand="1" w:evenHBand="0" w:firstRowFirstColumn="0" w:firstRowLastColumn="0" w:lastRowFirstColumn="0" w:lastRowLastColumn="0"/>
+            </w:pPr>
+            <w:r>
+              <w:t>Sensor retourneert correcte waarden</w:t>
+            </w:r>
+          </w:p>
+        </w:tc>
+        <w:tc>
+          <w:tcPr>
+            <w:tcW w:w="1296" w:type="dxa"/>
+          </w:tcPr>
+          <w:p>
+            <w:pPr>
+              <w:jc w:val="center"/>
+              <w:cnfStyle w:val="000000100000" w:firstRow="0" w:lastRow="0" w:firstColumn="0" w:lastColumn="0" w:oddVBand="0" w:evenVBand="0" w:oddHBand="1" w:evenHBand="0" w:firstRowFirstColumn="0" w:firstRowLastColumn="0" w:lastRowFirstColumn="0" w:lastRowLastColumn="0"/>
+            </w:pPr>
+            <w:r>
+              <w:drawing>
+                <wp:inline distT="0" distB="0" distL="0" distR="0" wp14:anchorId="14FFE94B" wp14:editId="01754663">
+                  <wp:extent cx="603250" cy="603250"/>
+                  <wp:effectExtent l="0" t="0" r="0" b="0"/>
+                  <wp:docPr id="940791260" name="Picture 6" descr="Check mark vector icon. Checkmark right symbol tick sign. Ok button correct  circle icon. 8134818 Vector Art at Vecteezy"/>
+                  <wp:cNvGraphicFramePr>
+                    <a:graphicFrameLocks xmlns:a="http://schemas.openxmlformats.org/drawingml/2006/main" noChangeAspect="1"/>
+                  </wp:cNvGraphicFramePr>
+                  <a:graphic xmlns:a="http://schemas.openxmlformats.org/drawingml/2006/main">
+                    <a:graphicData uri="http://schemas.openxmlformats.org/drawingml/2006/picture">
+                      <pic:pic xmlns:pic="http://schemas.openxmlformats.org/drawingml/2006/picture">
+                        <pic:nvPicPr>
+                          <pic:cNvPr id="0" name="Picture 14" descr="Check mark vector icon. Checkmark right symbol tick sign. Ok button correct  circle icon. 8134818 Vector Art at Vecteezy"/>
+                          <pic:cNvPicPr>
+                            <a:picLocks noChangeAspect="1" noChangeArrowheads="1"/>
+                          </pic:cNvPicPr>
+                        </pic:nvPicPr>
+                        <pic:blipFill>
+                          <a:blip r:embed="rId34" cstate="print">
+                            <a:extLst>
+                              <a:ext uri="{BEBA8EAE-BF5A-486C-A8C5-ECC9F3942E4B}">
+                                <a14:imgProps xmlns:a14="http://schemas.microsoft.com/office/drawing/2010/main">
+                                  <a14:imgLayer r:embed="rId35">
+                                    <a14:imgEffect>
+                                      <a14:backgroundRemoval t="10000" b="90000" l="10000" r="90000"/>
+                                    </a14:imgEffect>
+                                  </a14:imgLayer>
+                                </a14:imgProps>
+                              </a:ext>
+                              <a:ext uri="{28A0092B-C50C-407E-A947-70E740481C1C}">
+                                <a14:useLocalDpi xmlns:a14="http://schemas.microsoft.com/office/drawing/2010/main" val="0"/>
+                              </a:ext>
+                            </a:extLst>
+                          </a:blip>
+                          <a:srcRect/>
+                          <a:stretch>
+                            <a:fillRect/>
+                          </a:stretch>
+                        </pic:blipFill>
+                        <pic:spPr bwMode="auto">
+                          <a:xfrm>
+                            <a:off x="0" y="0"/>
+                            <a:ext cx="603250" cy="603250"/>
+                          </a:xfrm>
+                          <a:prstGeom prst="rect">
+                            <a:avLst/>
+                          </a:prstGeom>
+                          <a:noFill/>
+                          <a:ln>
+                            <a:noFill/>
+                          </a:ln>
+                        </pic:spPr>
+                      </pic:pic>
+                    </a:graphicData>
+                  </a:graphic>
+                </wp:inline>
+              </w:drawing>
+            </w:r>
+          </w:p>
+        </w:tc>
+      </w:tr>
+      <w:tr>
+        <w:tc>
+          <w:tcPr>
+            <w:cnfStyle w:val="001000000000" w:firstRow="0" w:lastRow="0" w:firstColumn="1" w:lastColumn="0" w:oddVBand="0" w:evenVBand="0" w:oddHBand="0" w:evenHBand="0" w:firstRowFirstColumn="0" w:firstRowLastColumn="0" w:lastRowFirstColumn="0" w:lastRowLastColumn="0"/>
+            <w:tcW w:w="1467" w:type="dxa"/>
+          </w:tcPr>
+          <w:p>
+            <w:pPr>
+              <w:rPr>
+                <w:b w:val="0"/>
+                <w:bCs w:val="0"/>
+              </w:rPr>
+            </w:pPr>
+            <w:r>
+              <w:rPr>
+                <w:b w:val="0"/>
+                <w:bCs w:val="0"/>
+              </w:rPr>
+              <w:t>Hall Sensor</w:t>
+            </w:r>
+          </w:p>
+        </w:tc>
+        <w:tc>
+          <w:tcPr>
+            <w:tcW w:w="1274" w:type="dxa"/>
+          </w:tcPr>
+          <w:p>
+            <w:pPr>
+              <w:jc w:val="center"/>
+              <w:cnfStyle w:val="000000000000" w:firstRow="0" w:lastRow="0" w:firstColumn="0" w:lastColumn="0" w:oddVBand="0" w:evenVBand="0" w:oddHBand="0" w:evenHBand="0" w:firstRowFirstColumn="0" w:firstRowLastColumn="0" w:lastRowFirstColumn="0" w:lastRowLastColumn="0"/>
+            </w:pPr>
+            <w:r>
+              <w:t>Load Test</w:t>
+            </w:r>
+          </w:p>
+        </w:tc>
+        <w:tc>
+          <w:tcPr>
+            <w:tcW w:w="1626" w:type="dxa"/>
+          </w:tcPr>
+          <w:p>
+            <w:pPr>
+              <w:cnfStyle w:val="000000000000" w:firstRow="0" w:lastRow="0" w:firstColumn="0" w:lastColumn="0" w:oddVBand="0" w:evenVBand="0" w:oddHBand="0" w:evenHBand="0" w:firstRowFirstColumn="0" w:firstRowLastColumn="0" w:lastRowFirstColumn="0" w:lastRowLastColumn="0"/>
+            </w:pPr>
+            <w:r>
+              <w:t>Test limieten van de sensor</w:t>
+            </w:r>
+          </w:p>
+        </w:tc>
+        <w:tc>
+          <w:tcPr>
+            <w:tcW w:w="1750" w:type="dxa"/>
+          </w:tcPr>
+          <w:p>
+            <w:pPr>
+              <w:cnfStyle w:val="000000000000" w:firstRow="0" w:lastRow="0" w:firstColumn="0" w:lastColumn="0" w:oddVBand="0" w:evenVBand="0" w:oddHBand="0" w:evenHBand="0" w:firstRowFirstColumn="0" w:firstRowLastColumn="0" w:lastRowFirstColumn="0" w:lastRowLastColumn="0"/>
+            </w:pPr>
+            <w:r>
+              <w:t>Test hoe snel ik de sensor kan uitlezen</w:t>
+            </w:r>
+          </w:p>
+        </w:tc>
+        <w:tc>
+          <w:tcPr>
+            <w:tcW w:w="1603" w:type="dxa"/>
+          </w:tcPr>
+          <w:p>
+            <w:pPr>
+              <w:cnfStyle w:val="000000000000" w:firstRow="0" w:lastRow="0" w:firstColumn="0" w:lastColumn="0" w:oddVBand="0" w:evenVBand="0" w:oddHBand="0" w:evenHBand="0" w:firstRowFirstColumn="0" w:firstRowLastColumn="0" w:lastRowFirstColumn="0" w:lastRowLastColumn="0"/>
+            </w:pPr>
+            <w:r>
+              <w:t xml:space="preserve">Zelfs met korte delay </w:t>
+            </w:r>
+            <w:r>
+              <w:t>retourneert de sensor correcte waarden</w:t>
+            </w:r>
+          </w:p>
+        </w:tc>
+        <w:tc>
+          <w:tcPr>
+            <w:tcW w:w="1296" w:type="dxa"/>
+          </w:tcPr>
+          <w:p>
+            <w:pPr>
+              <w:jc w:val="center"/>
+              <w:cnfStyle w:val="000000000000" w:firstRow="0" w:lastRow="0" w:firstColumn="0" w:lastColumn="0" w:oddVBand="0" w:evenVBand="0" w:oddHBand="0" w:evenHBand="0" w:firstRowFirstColumn="0" w:firstRowLastColumn="0" w:lastRowFirstColumn="0" w:lastRowLastColumn="0"/>
+            </w:pPr>
+            <w:r>
+              <w:drawing>
+                <wp:inline distT="0" distB="0" distL="0" distR="0" wp14:anchorId="7DA66161" wp14:editId="556792BD">
+                  <wp:extent cx="603250" cy="603250"/>
+                  <wp:effectExtent l="0" t="0" r="0" b="0"/>
+                  <wp:docPr id="1454697138" name="Picture 6" descr="Check mark vector icon. Checkmark right symbol tick sign. Ok button correct  circle icon. 8134818 Vector Art at Vecteezy"/>
+                  <wp:cNvGraphicFramePr>
+                    <a:graphicFrameLocks xmlns:a="http://schemas.openxmlformats.org/drawingml/2006/main" noChangeAspect="1"/>
+                  </wp:cNvGraphicFramePr>
+                  <a:graphic xmlns:a="http://schemas.openxmlformats.org/drawingml/2006/main">
+                    <a:graphicData uri="http://schemas.openxmlformats.org/drawingml/2006/picture">
+                      <pic:pic xmlns:pic="http://schemas.openxmlformats.org/drawingml/2006/picture">
+                        <pic:nvPicPr>
+                          <pic:cNvPr id="0" name="Picture 14" descr="Check mark vector icon. Checkmark right symbol tick sign. Ok button correct  circle icon. 8134818 Vector Art at Vecteezy"/>
+                          <pic:cNvPicPr>
+                            <a:picLocks noChangeAspect="1" noChangeArrowheads="1"/>
+                          </pic:cNvPicPr>
+                        </pic:nvPicPr>
+                        <pic:blipFill>
+                          <a:blip r:embed="rId34" cstate="print">
+                            <a:extLst>
+                              <a:ext uri="{BEBA8EAE-BF5A-486C-A8C5-ECC9F3942E4B}">
+                                <a14:imgProps xmlns:a14="http://schemas.microsoft.com/office/drawing/2010/main">
+                                  <a14:imgLayer r:embed="rId35">
+                                    <a14:imgEffect>
+                                      <a14:backgroundRemoval t="10000" b="90000" l="10000" r="90000"/>
+                                    </a14:imgEffect>
+                                  </a14:imgLayer>
+                                </a14:imgProps>
+                              </a:ext>
+                              <a:ext uri="{28A0092B-C50C-407E-A947-70E740481C1C}">
+                                <a14:useLocalDpi xmlns:a14="http://schemas.microsoft.com/office/drawing/2010/main" val="0"/>
+                              </a:ext>
+                            </a:extLst>
+                          </a:blip>
+                          <a:srcRect/>
+                          <a:stretch>
+                            <a:fillRect/>
+                          </a:stretch>
+                        </pic:blipFill>
+                        <pic:spPr bwMode="auto">
+                          <a:xfrm>
+                            <a:off x="0" y="0"/>
+                            <a:ext cx="603250" cy="603250"/>
+                          </a:xfrm>
+                          <a:prstGeom prst="rect">
+                            <a:avLst/>
+                          </a:prstGeom>
+                          <a:noFill/>
+                          <a:ln>
+                            <a:noFill/>
+                          </a:ln>
+                        </pic:spPr>
+                      </pic:pic>
+                    </a:graphicData>
+                  </a:graphic>
+                </wp:inline>
+              </w:drawing>
+            </w:r>
+          </w:p>
+        </w:tc>
+      </w:tr>
+      <w:tr>
+        <w:trPr>
+          <w:cnfStyle w:val="000000100000" w:firstRow="0" w:lastRow="0" w:firstColumn="0" w:lastColumn="0" w:oddVBand="0" w:evenVBand="0" w:oddHBand="1" w:evenHBand="0" w:firstRowFirstColumn="0" w:firstRowLastColumn="0" w:lastRowFirstColumn="0" w:lastRowLastColumn="0"/>
+        </w:trPr>
+        <w:tc>
+          <w:tcPr>
+            <w:cnfStyle w:val="001000000000" w:firstRow="0" w:lastRow="0" w:firstColumn="1" w:lastColumn="0" w:oddVBand="0" w:evenVBand="0" w:oddHBand="0" w:evenHBand="0" w:firstRowFirstColumn="0" w:firstRowLastColumn="0" w:lastRowFirstColumn="0" w:lastRowLastColumn="0"/>
+            <w:tcW w:w="1467" w:type="dxa"/>
+          </w:tcPr>
+          <w:p>
+            <w:pPr>
+              <w:rPr>
+                <w:b w:val="0"/>
+                <w:bCs w:val="0"/>
+              </w:rPr>
+            </w:pPr>
+            <w:r>
+              <w:rPr>
+                <w:b w:val="0"/>
+                <w:bCs w:val="0"/>
+              </w:rPr>
+              <w:t>OLED Display</w:t>
+            </w:r>
+          </w:p>
+        </w:tc>
+        <w:tc>
+          <w:tcPr>
+            <w:tcW w:w="1274" w:type="dxa"/>
+          </w:tcPr>
+          <w:p>
+            <w:pPr>
+              <w:jc w:val="center"/>
+              <w:cnfStyle w:val="000000100000" w:firstRow="0" w:lastRow="0" w:firstColumn="0" w:lastColumn="0" w:oddVBand="0" w:evenVBand="0" w:oddHBand="1" w:evenHBand="0" w:firstRowFirstColumn="0" w:firstRowLastColumn="0" w:lastRowFirstColumn="0" w:lastRowLastColumn="0"/>
+              <w:rPr>
+                <w:b/>
+                <w:bCs/>
+              </w:rPr>
+            </w:pPr>
+            <w:r>
+              <w:t>Unit Test</w:t>
+            </w:r>
+          </w:p>
+        </w:tc>
+        <w:tc>
+          <w:tcPr>
+            <w:tcW w:w="1626" w:type="dxa"/>
+          </w:tcPr>
+          <w:p>
+            <w:pPr>
+              <w:cnfStyle w:val="000000100000" w:firstRow="0" w:lastRow="0" w:firstColumn="0" w:lastColumn="0" w:oddVBand="0" w:evenVBand="0" w:oddHBand="1" w:evenHBand="0" w:firstRowFirstColumn="0" w:firstRowLastColumn="0" w:lastRowFirstColumn="0" w:lastRowLastColumn="0"/>
+            </w:pPr>
+            <w:r>
+              <w:t>Test of OLED display functioneert</w:t>
+            </w:r>
+          </w:p>
+        </w:tc>
+        <w:tc>
+          <w:tcPr>
+            <w:tcW w:w="1750" w:type="dxa"/>
+          </w:tcPr>
+          <w:p>
+            <w:pPr>
+              <w:cnfStyle w:val="000000100000" w:firstRow="0" w:lastRow="0" w:firstColumn="0" w:lastColumn="0" w:oddVBand="0" w:evenVBand="0" w:oddHBand="1" w:evenHBand="0" w:firstRowFirstColumn="0" w:firstRowLastColumn="0" w:lastRowFirstColumn="0" w:lastRowLastColumn="0"/>
+            </w:pPr>
+            <w:r>
+              <w:t>Test de voorbeeldcode meegeleverd door fabrikant</w:t>
+            </w:r>
+          </w:p>
+        </w:tc>
+        <w:tc>
+          <w:tcPr>
+            <w:tcW w:w="1603" w:type="dxa"/>
+          </w:tcPr>
+          <w:p>
+            <w:pPr>
+              <w:cnfStyle w:val="000000100000" w:firstRow="0" w:lastRow="0" w:firstColumn="0" w:lastColumn="0" w:oddVBand="0" w:evenVBand="0" w:oddHBand="1" w:evenHBand="0" w:firstRowFirstColumn="0" w:firstRowLastColumn="0" w:lastRowFirstColumn="0" w:lastRowLastColumn="0"/>
+            </w:pPr>
+            <w:r>
+              <w:t>Display toont “Hello World</w:t>
+            </w:r>
+            <w:r>
+              <w:t>” op het scherm</w:t>
+            </w:r>
+          </w:p>
+        </w:tc>
+        <w:tc>
+          <w:tcPr>
+            <w:tcW w:w="1296" w:type="dxa"/>
+          </w:tcPr>
+          <w:p>
+            <w:pPr>
+              <w:jc w:val="center"/>
+              <w:cnfStyle w:val="000000100000" w:firstRow="0" w:lastRow="0" w:firstColumn="0" w:lastColumn="0" w:oddVBand="0" w:evenVBand="0" w:oddHBand="1" w:evenHBand="0" w:firstRowFirstColumn="0" w:firstRowLastColumn="0" w:lastRowFirstColumn="0" w:lastRowLastColumn="0"/>
+            </w:pPr>
+            <w:r>
+              <w:drawing>
+                <wp:inline distT="0" distB="0" distL="0" distR="0" wp14:anchorId="1566B96C" wp14:editId="562E9DC6">
+                  <wp:extent cx="603250" cy="603250"/>
+                  <wp:effectExtent l="0" t="0" r="0" b="0"/>
+                  <wp:docPr id="1497979989" name="Picture 6" descr="Check mark vector icon. Checkmark right symbol tick sign. Ok button correct  circle icon. 8134818 Vector Art at Vecteezy"/>
+                  <wp:cNvGraphicFramePr>
+                    <a:graphicFrameLocks xmlns:a="http://schemas.openxmlformats.org/drawingml/2006/main" noChangeAspect="1"/>
+                  </wp:cNvGraphicFramePr>
+                  <a:graphic xmlns:a="http://schemas.openxmlformats.org/drawingml/2006/main">
+                    <a:graphicData uri="http://schemas.openxmlformats.org/drawingml/2006/picture">
+                      <pic:pic xmlns:pic="http://schemas.openxmlformats.org/drawingml/2006/picture">
+                        <pic:nvPicPr>
+                          <pic:cNvPr id="0" name="Picture 14" descr="Check mark vector icon. Checkmark right symbol tick sign. Ok button correct  circle icon. 8134818 Vector Art at Vecteezy"/>
+                          <pic:cNvPicPr>
+                            <a:picLocks noChangeAspect="1" noChangeArrowheads="1"/>
+                          </pic:cNvPicPr>
+                        </pic:nvPicPr>
+                        <pic:blipFill>
+                          <a:blip r:embed="rId34" cstate="print">
+                            <a:extLst>
+                              <a:ext uri="{BEBA8EAE-BF5A-486C-A8C5-ECC9F3942E4B}">
+                                <a14:imgProps xmlns:a14="http://schemas.microsoft.com/office/drawing/2010/main">
+                                  <a14:imgLayer r:embed="rId35">
+                                    <a14:imgEffect>
+                                      <a14:backgroundRemoval t="10000" b="90000" l="10000" r="90000"/>
+                                    </a14:imgEffect>
+                                  </a14:imgLayer>
+                                </a14:imgProps>
+                              </a:ext>
+                              <a:ext uri="{28A0092B-C50C-407E-A947-70E740481C1C}">
+                                <a14:useLocalDpi xmlns:a14="http://schemas.microsoft.com/office/drawing/2010/main" val="0"/>
+                              </a:ext>
+                            </a:extLst>
+                          </a:blip>
+                          <a:srcRect/>
+                          <a:stretch>
+                            <a:fillRect/>
+                          </a:stretch>
+                        </pic:blipFill>
+                        <pic:spPr bwMode="auto">
+                          <a:xfrm>
+                            <a:off x="0" y="0"/>
+                            <a:ext cx="603250" cy="603250"/>
+                          </a:xfrm>
+                          <a:prstGeom prst="rect">
+                            <a:avLst/>
+                          </a:prstGeom>
+                          <a:noFill/>
+                          <a:ln>
+                            <a:noFill/>
+                          </a:ln>
+                        </pic:spPr>
+                      </pic:pic>
+                    </a:graphicData>
+                  </a:graphic>
+                </wp:inline>
+              </w:drawing>
+            </w:r>
+          </w:p>
+        </w:tc>
+      </w:tr>
+      <w:tr>
+        <w:tc>
+          <w:tcPr>
+            <w:cnfStyle w:val="001000000000" w:firstRow="0" w:lastRow="0" w:firstColumn="1" w:lastColumn="0" w:oddVBand="0" w:evenVBand="0" w:oddHBand="0" w:evenHBand="0" w:firstRowFirstColumn="0" w:firstRowLastColumn="0" w:lastRowFirstColumn="0" w:lastRowLastColumn="0"/>
+            <w:tcW w:w="1467" w:type="dxa"/>
+          </w:tcPr>
+          <w:p>
+            <w:pPr>
+              <w:rPr>
+                <w:b w:val="0"/>
+                <w:bCs w:val="0"/>
+              </w:rPr>
+            </w:pPr>
+            <w:r>
+              <w:rPr>
+                <w:b w:val="0"/>
+                <w:bCs w:val="0"/>
+              </w:rPr>
+              <w:t>OLED Display</w:t>
+            </w:r>
+          </w:p>
+        </w:tc>
+        <w:tc>
+          <w:tcPr>
+            <w:tcW w:w="1274" w:type="dxa"/>
+          </w:tcPr>
+          <w:p>
+            <w:pPr>
+              <w:jc w:val="center"/>
+              <w:cnfStyle w:val="000000000000" w:firstRow="0" w:lastRow="0" w:firstColumn="0" w:lastColumn="0" w:oddVBand="0" w:evenVBand="0" w:oddHBand="0" w:evenHBand="0" w:firstRowFirstColumn="0" w:firstRowLastColumn="0" w:lastRowFirstColumn="0" w:lastRowLastColumn="0"/>
+            </w:pPr>
+            <w:r>
+              <w:t>Integration Test</w:t>
+            </w:r>
+          </w:p>
+        </w:tc>
+        <w:tc>
+          <w:tcPr>
+            <w:tcW w:w="1626" w:type="dxa"/>
+          </w:tcPr>
+          <w:p>
+            <w:pPr>
+              <w:cnfStyle w:val="000000000000" w:firstRow="0" w:lastRow="0" w:firstColumn="0" w:lastColumn="0" w:oddVBand="0" w:evenVBand="0" w:oddHBand="0" w:evenHBand="0" w:firstRowFirstColumn="0" w:firstRowLastColumn="0" w:lastRowFirstColumn="0" w:lastRowLastColumn="0"/>
+            </w:pPr>
+            <w:r>
+              <w:t xml:space="preserve">Test </w:t>
+            </w:r>
+            <w:r>
+              <w:t>de display in combinatie met alle componenten</w:t>
+            </w:r>
+          </w:p>
+        </w:tc>
+        <w:tc>
+          <w:tcPr>
+            <w:tcW w:w="1750" w:type="dxa"/>
+          </w:tcPr>
+          <w:p>
+            <w:pPr>
+              <w:cnfStyle w:val="000000000000" w:firstRow="0" w:lastRow="0" w:firstColumn="0" w:lastColumn="0" w:oddVBand="0" w:evenVBand="0" w:oddHBand="0" w:evenHBand="0" w:firstRowFirstColumn="0" w:firstRowLastColumn="0" w:lastRowFirstColumn="0" w:lastRowLastColumn="0"/>
+            </w:pPr>
+            <w:r>
+              <w:t>Monitor display in combinatie met het hele systeem</w:t>
+            </w:r>
+          </w:p>
+        </w:tc>
+        <w:tc>
+          <w:tcPr>
+            <w:tcW w:w="1603" w:type="dxa"/>
+          </w:tcPr>
+          <w:p>
+            <w:pPr>
+              <w:cnfStyle w:val="000000000000" w:firstRow="0" w:lastRow="0" w:firstColumn="0" w:lastColumn="0" w:oddVBand="0" w:evenVBand="0" w:oddHBand="0" w:evenHBand="0" w:firstRowFirstColumn="0" w:firstRowLastColumn="0" w:lastRowFirstColumn="0" w:lastRowLastColumn="0"/>
+            </w:pPr>
+            <w:r>
+              <w:t xml:space="preserve">Display toont correcte </w:t>
+            </w:r>
+            <w:r>
+              <w:t>berichten</w:t>
+            </w:r>
+          </w:p>
+        </w:tc>
+        <w:tc>
+          <w:tcPr>
+            <w:tcW w:w="1296" w:type="dxa"/>
+          </w:tcPr>
+          <w:p>
+            <w:pPr>
+              <w:jc w:val="center"/>
+              <w:cnfStyle w:val="000000000000" w:firstRow="0" w:lastRow="0" w:firstColumn="0" w:lastColumn="0" w:oddVBand="0" w:evenVBand="0" w:oddHBand="0" w:evenHBand="0" w:firstRowFirstColumn="0" w:firstRowLastColumn="0" w:lastRowFirstColumn="0" w:lastRowLastColumn="0"/>
+            </w:pPr>
+            <w:r>
+              <w:drawing>
+                <wp:inline distT="0" distB="0" distL="0" distR="0" wp14:anchorId="0BD83B6C" wp14:editId="300F4DF6">
+                  <wp:extent cx="603250" cy="603250"/>
+                  <wp:effectExtent l="0" t="0" r="0" b="0"/>
+                  <wp:docPr id="1387655940" name="Picture 6" descr="Check mark vector icon. Checkmark right symbol tick sign. Ok button correct  circle icon. 8134818 Vector Art at Vecteezy"/>
+                  <wp:cNvGraphicFramePr>
+                    <a:graphicFrameLocks xmlns:a="http://schemas.openxmlformats.org/drawingml/2006/main" noChangeAspect="1"/>
+                  </wp:cNvGraphicFramePr>
+                  <a:graphic xmlns:a="http://schemas.openxmlformats.org/drawingml/2006/main">
+                    <a:graphicData uri="http://schemas.openxmlformats.org/drawingml/2006/picture">
+                      <pic:pic xmlns:pic="http://schemas.openxmlformats.org/drawingml/2006/picture">
+                        <pic:nvPicPr>
+                          <pic:cNvPr id="0" name="Picture 14" descr="Check mark vector icon. Checkmark right symbol tick sign. Ok button correct  circle icon. 8134818 Vector Art at Vecteezy"/>
+                          <pic:cNvPicPr>
+                            <a:picLocks noChangeAspect="1" noChangeArrowheads="1"/>
+                          </pic:cNvPicPr>
+                        </pic:nvPicPr>
+                        <pic:blipFill>
+                          <a:blip r:embed="rId34" cstate="print">
+                            <a:extLst>
+                              <a:ext uri="{BEBA8EAE-BF5A-486C-A8C5-ECC9F3942E4B}">
+                                <a14:imgProps xmlns:a14="http://schemas.microsoft.com/office/drawing/2010/main">
+                                  <a14:imgLayer r:embed="rId35">
+                                    <a14:imgEffect>
+                                      <a14:backgroundRemoval t="10000" b="90000" l="10000" r="90000"/>
+                                    </a14:imgEffect>
+                                  </a14:imgLayer>
+                                </a14:imgProps>
+                              </a:ext>
+                              <a:ext uri="{28A0092B-C50C-407E-A947-70E740481C1C}">
+                                <a14:useLocalDpi xmlns:a14="http://schemas.microsoft.com/office/drawing/2010/main" val="0"/>
+                              </a:ext>
+                            </a:extLst>
+                          </a:blip>
+                          <a:srcRect/>
+                          <a:stretch>
+                            <a:fillRect/>
+                          </a:stretch>
+                        </pic:blipFill>
+                        <pic:spPr bwMode="auto">
+                          <a:xfrm>
+                            <a:off x="0" y="0"/>
+                            <a:ext cx="603250" cy="603250"/>
+                          </a:xfrm>
+                          <a:prstGeom prst="rect">
+                            <a:avLst/>
+                          </a:prstGeom>
+                          <a:noFill/>
+                          <a:ln>
+                            <a:noFill/>
+                          </a:ln>
+                        </pic:spPr>
+                      </pic:pic>
+                    </a:graphicData>
+                  </a:graphic>
+                </wp:inline>
+              </w:drawing>
+            </w:r>
+          </w:p>
+        </w:tc>
+      </w:tr>
+      <w:tr>
+        <w:trPr>
+          <w:cnfStyle w:val="000000100000" w:firstRow="0" w:lastRow="0" w:firstColumn="0" w:lastColumn="0" w:oddVBand="0" w:evenVBand="0" w:oddHBand="1" w:evenHBand="0" w:firstRowFirstColumn="0" w:firstRowLastColumn="0" w:lastRowFirstColumn="0" w:lastRowLastColumn="0"/>
+        </w:trPr>
+        <w:tc>
+          <w:tcPr>
+            <w:cnfStyle w:val="001000000000" w:firstRow="0" w:lastRow="0" w:firstColumn="1" w:lastColumn="0" w:oddVBand="0" w:evenVBand="0" w:oddHBand="0" w:evenHBand="0" w:firstRowFirstColumn="0" w:firstRowLastColumn="0" w:lastRowFirstColumn="0" w:lastRowLastColumn="0"/>
+            <w:tcW w:w="1467" w:type="dxa"/>
+          </w:tcPr>
+          <w:p>
+            <w:pPr>
+              <w:rPr>
+                <w:b w:val="0"/>
+                <w:bCs w:val="0"/>
+              </w:rPr>
+            </w:pPr>
+            <w:r>
+              <w:rPr>
+                <w:b w:val="0"/>
+                <w:bCs w:val="0"/>
+              </w:rPr>
+              <w:lastRenderedPageBreak/>
+              <w:t>OLED Display</w:t>
+            </w:r>
+          </w:p>
+        </w:tc>
+        <w:tc>
+          <w:tcPr>
+            <w:tcW w:w="1274" w:type="dxa"/>
+          </w:tcPr>
+          <w:p>
+            <w:pPr>
+              <w:jc w:val="center"/>
+              <w:cnfStyle w:val="000000100000" w:firstRow="0" w:lastRow="0" w:firstColumn="0" w:lastColumn="0" w:oddVBand="0" w:evenVBand="0" w:oddHBand="1" w:evenHBand="0" w:firstRowFirstColumn="0" w:firstRowLastColumn="0" w:lastRowFirstColumn="0" w:lastRowLastColumn="0"/>
+            </w:pPr>
+            <w:r>
+              <w:t>Real-World Test</w:t>
+            </w:r>
+          </w:p>
+        </w:tc>
+        <w:tc>
+          <w:tcPr>
+            <w:tcW w:w="1626" w:type="dxa"/>
+          </w:tcPr>
+          <w:p>
+            <w:pPr>
+              <w:cnfStyle w:val="000000100000" w:firstRow="0" w:lastRow="0" w:firstColumn="0" w:lastColumn="0" w:oddVBand="0" w:evenVBand="0" w:oddHBand="1" w:evenHBand="0" w:firstRowFirstColumn="0" w:firstRowLastColumn="0" w:lastRowFirstColumn="0" w:lastRowLastColumn="0"/>
+            </w:pPr>
+            <w:r>
+              <w:t>Test de display in een au</w:t>
+            </w:r>
+            <w:r>
+              <w:t>t</w:t>
+            </w:r>
+            <w:r>
+              <w:t>hentieke situatie</w:t>
+            </w:r>
+          </w:p>
+        </w:tc>
+        <w:tc>
+          <w:tcPr>
+            <w:tcW w:w="1750" w:type="dxa"/>
+          </w:tcPr>
+          <w:p>
+            <w:pPr>
+              <w:cnfStyle w:val="000000100000" w:firstRow="0" w:lastRow="0" w:firstColumn="0" w:lastColumn="0" w:oddVBand="0" w:evenVBand="0" w:oddHBand="1" w:evenHBand="0" w:firstRowFirstColumn="0" w:firstRowLastColumn="0" w:lastRowFirstColumn="0" w:lastRowLastColumn="0"/>
+            </w:pPr>
+            <w:r>
+              <w:t>Test display in finale</w:t>
+            </w:r>
+            <w:r>
+              <w:t xml:space="preserve"> behuizing</w:t>
+            </w:r>
+          </w:p>
+        </w:tc>
+        <w:tc>
+          <w:tcPr>
+            <w:tcW w:w="1603" w:type="dxa"/>
+          </w:tcPr>
+          <w:p>
+            <w:pPr>
+              <w:cnfStyle w:val="000000100000" w:firstRow="0" w:lastRow="0" w:firstColumn="0" w:lastColumn="0" w:oddVBand="0" w:evenVBand="0" w:oddHBand="1" w:evenHBand="0" w:firstRowFirstColumn="0" w:firstRowLastColumn="0" w:lastRowFirstColumn="0" w:lastRowLastColumn="0"/>
+            </w:pPr>
+            <w:r>
+              <w:t>Display toont correcte status berichten</w:t>
+            </w:r>
+          </w:p>
+        </w:tc>
+        <w:tc>
+          <w:tcPr>
+            <w:tcW w:w="1296" w:type="dxa"/>
+          </w:tcPr>
+          <w:p>
+            <w:pPr>
+              <w:jc w:val="center"/>
+              <w:cnfStyle w:val="000000100000" w:firstRow="0" w:lastRow="0" w:firstColumn="0" w:lastColumn="0" w:oddVBand="0" w:evenVBand="0" w:oddHBand="1" w:evenHBand="0" w:firstRowFirstColumn="0" w:firstRowLastColumn="0" w:lastRowFirstColumn="0" w:lastRowLastColumn="0"/>
+            </w:pPr>
+            <w:r>
+              <w:drawing>
+                <wp:inline distT="0" distB="0" distL="0" distR="0" wp14:anchorId="4624F9EF" wp14:editId="0464F4C8">
+                  <wp:extent cx="603250" cy="603250"/>
+                  <wp:effectExtent l="0" t="0" r="0" b="0"/>
+                  <wp:docPr id="1044536519" name="Picture 6" descr="Check mark vector icon. Checkmark right symbol tick sign. Ok button correct  circle icon. 8134818 Vector Art at Vecteezy"/>
+                  <wp:cNvGraphicFramePr>
+                    <a:graphicFrameLocks xmlns:a="http://schemas.openxmlformats.org/drawingml/2006/main" noChangeAspect="1"/>
+                  </wp:cNvGraphicFramePr>
+                  <a:graphic xmlns:a="http://schemas.openxmlformats.org/drawingml/2006/main">
+                    <a:graphicData uri="http://schemas.openxmlformats.org/drawingml/2006/picture">
+                      <pic:pic xmlns:pic="http://schemas.openxmlformats.org/drawingml/2006/picture">
+                        <pic:nvPicPr>
+                          <pic:cNvPr id="0" name="Picture 14" descr="Check mark vector icon. Checkmark right symbol tick sign. Ok button correct  circle icon. 8134818 Vector Art at Vecteezy"/>
+                          <pic:cNvPicPr>
+                            <a:picLocks noChangeAspect="1" noChangeArrowheads="1"/>
+                          </pic:cNvPicPr>
+                        </pic:nvPicPr>
+                        <pic:blipFill>
+                          <a:blip r:embed="rId34" cstate="print">
+                            <a:extLst>
+                              <a:ext uri="{BEBA8EAE-BF5A-486C-A8C5-ECC9F3942E4B}">
+                                <a14:imgProps xmlns:a14="http://schemas.microsoft.com/office/drawing/2010/main">
+                                  <a14:imgLayer r:embed="rId35">
+                                    <a14:imgEffect>
+                                      <a14:backgroundRemoval t="10000" b="90000" l="10000" r="90000"/>
+                                    </a14:imgEffect>
+                                  </a14:imgLayer>
+                                </a14:imgProps>
+                              </a:ext>
+                              <a:ext uri="{28A0092B-C50C-407E-A947-70E740481C1C}">
+                                <a14:useLocalDpi xmlns:a14="http://schemas.microsoft.com/office/drawing/2010/main" val="0"/>
+                              </a:ext>
+                            </a:extLst>
+                          </a:blip>
+                          <a:srcRect/>
+                          <a:stretch>
+                            <a:fillRect/>
+                          </a:stretch>
+                        </pic:blipFill>
+                        <pic:spPr bwMode="auto">
+                          <a:xfrm>
+                            <a:off x="0" y="0"/>
+                            <a:ext cx="603250" cy="603250"/>
+                          </a:xfrm>
+                          <a:prstGeom prst="rect">
+                            <a:avLst/>
+                          </a:prstGeom>
+                          <a:noFill/>
+                          <a:ln>
+                            <a:noFill/>
+                          </a:ln>
+                        </pic:spPr>
+                      </pic:pic>
+                    </a:graphicData>
+                  </a:graphic>
+                </wp:inline>
+              </w:drawing>
+            </w:r>
+          </w:p>
+        </w:tc>
+      </w:tr>
+      <w:tr>
+        <w:tc>
+          <w:tcPr>
+            <w:cnfStyle w:val="001000000000" w:firstRow="0" w:lastRow="0" w:firstColumn="1" w:lastColumn="0" w:oddVBand="0" w:evenVBand="0" w:oddHBand="0" w:evenHBand="0" w:firstRowFirstColumn="0" w:firstRowLastColumn="0" w:lastRowFirstColumn="0" w:lastRowLastColumn="0"/>
+            <w:tcW w:w="1467" w:type="dxa"/>
+          </w:tcPr>
+          <w:p>
+            <w:pPr>
+              <w:rPr>
+                <w:b w:val="0"/>
+                <w:bCs w:val="0"/>
+              </w:rPr>
+            </w:pPr>
+            <w:r>
+              <w:rPr>
+                <w:b w:val="0"/>
+                <w:bCs w:val="0"/>
+              </w:rPr>
+              <w:t>OLED Display</w:t>
+            </w:r>
+          </w:p>
+        </w:tc>
+        <w:tc>
+          <w:tcPr>
+            <w:tcW w:w="1274" w:type="dxa"/>
+          </w:tcPr>
+          <w:p>
+            <w:pPr>
+              <w:jc w:val="center"/>
+              <w:cnfStyle w:val="000000000000" w:firstRow="0" w:lastRow="0" w:firstColumn="0" w:lastColumn="0" w:oddVBand="0" w:evenVBand="0" w:oddHBand="0" w:evenHBand="0" w:firstRowFirstColumn="0" w:firstRowLastColumn="0" w:lastRowFirstColumn="0" w:lastRowLastColumn="0"/>
+            </w:pPr>
+            <w:r>
+              <w:t>Load Test</w:t>
+            </w:r>
+          </w:p>
+        </w:tc>
+        <w:tc>
+          <w:tcPr>
+            <w:tcW w:w="1626" w:type="dxa"/>
+          </w:tcPr>
+          <w:p>
+            <w:pPr>
+              <w:cnfStyle w:val="000000000000" w:firstRow="0" w:lastRow="0" w:firstColumn="0" w:lastColumn="0" w:oddVBand="0" w:evenVBand="0" w:oddHBand="0" w:evenHBand="0" w:firstRowFirstColumn="0" w:firstRowLastColumn="0" w:lastRowFirstColumn="0" w:lastRowLastColumn="0"/>
+            </w:pPr>
+            <w:r>
+              <w:t>Test de limieten van de display</w:t>
+            </w:r>
+          </w:p>
+        </w:tc>
+        <w:tc>
+          <w:tcPr>
+            <w:tcW w:w="1750" w:type="dxa"/>
+          </w:tcPr>
+          <w:p>
+            <w:pPr>
+              <w:cnfStyle w:val="000000000000" w:firstRow="0" w:lastRow="0" w:firstColumn="0" w:lastColumn="0" w:oddVBand="0" w:evenVBand="0" w:oddHBand="0" w:evenHBand="0" w:firstRowFirstColumn="0" w:firstRowLastColumn="0" w:lastRowFirstColumn="0" w:lastRowLastColumn="0"/>
+            </w:pPr>
+            <w:r>
+              <w:t xml:space="preserve">Test </w:t>
+            </w:r>
+            <w:r>
+              <w:t>hoe snel de display gerefreshed kan worden</w:t>
+            </w:r>
+          </w:p>
+        </w:tc>
+        <w:tc>
+          <w:tcPr>
+            <w:tcW w:w="1603" w:type="dxa"/>
+          </w:tcPr>
+          <w:p>
+            <w:pPr>
+              <w:cnfStyle w:val="000000000000" w:firstRow="0" w:lastRow="0" w:firstColumn="0" w:lastColumn="0" w:oddVBand="0" w:evenVBand="0" w:oddHBand="0" w:evenHBand="0" w:firstRowFirstColumn="0" w:firstRowLastColumn="0" w:lastRowFirstColumn="0" w:lastRowLastColumn="0"/>
+            </w:pPr>
+            <w:r>
+              <w:t>Display refreshed snel en toont correcte de status berichten</w:t>
+            </w:r>
+          </w:p>
+        </w:tc>
+        <w:tc>
+          <w:tcPr>
+            <w:tcW w:w="1296" w:type="dxa"/>
+          </w:tcPr>
+          <w:p>
+            <w:pPr>
+              <w:jc w:val="center"/>
+              <w:cnfStyle w:val="000000000000" w:firstRow="0" w:lastRow="0" w:firstColumn="0" w:lastColumn="0" w:oddVBand="0" w:evenVBand="0" w:oddHBand="0" w:evenHBand="0" w:firstRowFirstColumn="0" w:firstRowLastColumn="0" w:lastRowFirstColumn="0" w:lastRowLastColumn="0"/>
+            </w:pPr>
+            <w:r>
+              <w:drawing>
+                <wp:inline distT="0" distB="0" distL="0" distR="0" wp14:anchorId="5B43FBFD" wp14:editId="5A9E425E">
+                  <wp:extent cx="603250" cy="603250"/>
+                  <wp:effectExtent l="0" t="0" r="0" b="0"/>
+                  <wp:docPr id="205611532" name="Picture 6" descr="Check mark vector icon. Checkmark right symbol tick sign. Ok button correct  circle icon. 8134818 Vector Art at Vecteezy"/>
+                  <wp:cNvGraphicFramePr>
+                    <a:graphicFrameLocks xmlns:a="http://schemas.openxmlformats.org/drawingml/2006/main" noChangeAspect="1"/>
+                  </wp:cNvGraphicFramePr>
+                  <a:graphic xmlns:a="http://schemas.openxmlformats.org/drawingml/2006/main">
+                    <a:graphicData uri="http://schemas.openxmlformats.org/drawingml/2006/picture">
+                      <pic:pic xmlns:pic="http://schemas.openxmlformats.org/drawingml/2006/picture">
+                        <pic:nvPicPr>
+                          <pic:cNvPr id="0" name="Picture 14" descr="Check mark vector icon. Checkmark right symbol tick sign. Ok button correct  circle icon. 8134818 Vector Art at Vecteezy"/>
+                          <pic:cNvPicPr>
+                            <a:picLocks noChangeAspect="1" noChangeArrowheads="1"/>
+                          </pic:cNvPicPr>
+                        </pic:nvPicPr>
+                        <pic:blipFill>
+                          <a:blip r:embed="rId34" cstate="print">
+                            <a:extLst>
+                              <a:ext uri="{BEBA8EAE-BF5A-486C-A8C5-ECC9F3942E4B}">
+                                <a14:imgProps xmlns:a14="http://schemas.microsoft.com/office/drawing/2010/main">
+                                  <a14:imgLayer r:embed="rId35">
+                                    <a14:imgEffect>
+                                      <a14:backgroundRemoval t="10000" b="90000" l="10000" r="90000"/>
+                                    </a14:imgEffect>
+                                  </a14:imgLayer>
+                                </a14:imgProps>
+                              </a:ext>
+                              <a:ext uri="{28A0092B-C50C-407E-A947-70E740481C1C}">
+                                <a14:useLocalDpi xmlns:a14="http://schemas.microsoft.com/office/drawing/2010/main" val="0"/>
+                              </a:ext>
+                            </a:extLst>
+                          </a:blip>
+                          <a:srcRect/>
+                          <a:stretch>
+                            <a:fillRect/>
+                          </a:stretch>
+                        </pic:blipFill>
+                        <pic:spPr bwMode="auto">
+                          <a:xfrm>
+                            <a:off x="0" y="0"/>
+                            <a:ext cx="603250" cy="603250"/>
+                          </a:xfrm>
+                          <a:prstGeom prst="rect">
+                            <a:avLst/>
+                          </a:prstGeom>
+                          <a:noFill/>
+                          <a:ln>
+                            <a:noFill/>
+                          </a:ln>
+                        </pic:spPr>
+                      </pic:pic>
+                    </a:graphicData>
+                  </a:graphic>
+                </wp:inline>
+              </w:drawing>
+            </w:r>
+          </w:p>
+        </w:tc>
+      </w:tr>
+    </w:tbl>
     <w:p>
-      <w:r>
-        <w:t>In the works</w:t>
-      </w:r>
-    </w:p>
-    <w:p/>
-    <w:p/>
-    <w:p/>
-    <w:p/>
-    <w:p/>
-    <w:p/>
-    <w:p/>
-    <w:p/>
-    <w:p/>
-    <w:p/>
-    <w:p/>
-    <w:p/>
-    <w:p/>
-    <w:p/>
-    <w:p/>
-    <w:p>
       <w:pPr>
         <w:pStyle w:val="Heading1"/>
       </w:pPr>
       <w:bookmarkStart w:id="15" w:name="_Toc199317603"/>
       <w:r>
-        <w:lastRenderedPageBreak/>
         <w:t>Installatiehandleiding</w:t>
       </w:r>
       <w:bookmarkEnd w:id="15"/>
@@ -5888,9 +7732,6 @@
         </w:numPr>
       </w:pPr>
       <w:r>
-        <w:rPr>
-          <w:noProof/>
-        </w:rPr>
         <w:drawing>
           <wp:anchor distT="0" distB="0" distL="114300" distR="114300" simplePos="0" relativeHeight="251743232" behindDoc="0" locked="0" layoutInCell="1" allowOverlap="1" wp14:anchorId="4D995CBA" wp14:editId="5F848467">
             <wp:simplePos x="0" y="0"/>
@@ -5915,7 +7756,7 @@
                     <pic:cNvPicPr/>
                   </pic:nvPicPr>
                   <pic:blipFill>
-                    <a:blip r:embed="rId34">
+                    <a:blip r:embed="rId36">
                       <a:extLst>
                         <a:ext uri="{28A0092B-C50C-407E-A947-70E740481C1C}">
                           <a14:useLocalDpi xmlns:a14="http://schemas.microsoft.com/office/drawing/2010/main" val="0"/>
@@ -5974,7 +7815,7 @@
       <w:r>
         <w:t xml:space="preserve">Log in op </w:t>
       </w:r>
-      <w:hyperlink r:id="rId35" w:history="1">
+      <w:hyperlink r:id="rId37" w:history="1">
         <w:r>
           <w:rPr>
             <w:rStyle w:val="Hyperlink"/>
@@ -5996,11 +7837,9 @@
         </w:numPr>
       </w:pPr>
       <w:r>
-        <w:rPr>
-          <w:noProof/>
-        </w:rPr>
+        <w:lastRenderedPageBreak/>
         <w:drawing>
-          <wp:anchor distT="0" distB="0" distL="114300" distR="114300" simplePos="0" relativeHeight="251744256" behindDoc="0" locked="0" layoutInCell="1" allowOverlap="1" wp14:anchorId="46A2EB53" wp14:editId="20297B9B">
+          <wp:anchor distT="0" distB="0" distL="114300" distR="114300" simplePos="0" relativeHeight="251744256" behindDoc="0" locked="0" layoutInCell="1" allowOverlap="1" wp14:anchorId="46A2EB53" wp14:editId="462E5C85">
             <wp:simplePos x="0" y="0"/>
             <wp:positionH relativeFrom="margin">
               <wp:align>center</wp:align>
@@ -6023,7 +7862,7 @@
                     <pic:cNvPicPr/>
                   </pic:nvPicPr>
                   <pic:blipFill rotWithShape="1">
-                    <a:blip r:embed="rId36">
+                    <a:blip r:embed="rId38">
                       <a:extLst>
                         <a:ext uri="{28A0092B-C50C-407E-A947-70E740481C1C}">
                           <a14:useLocalDpi xmlns:a14="http://schemas.microsoft.com/office/drawing/2010/main" val="0"/>
@@ -6091,8 +7930,6 @@
       </w:r>
     </w:p>
     <w:p/>
-    <w:p/>
-    <w:p/>
     <w:p>
       <w:pPr>
         <w:pStyle w:val="ListParagraph"/>
@@ -6102,10 +7939,6 @@
         </w:numPr>
       </w:pPr>
       <w:r>
-        <w:rPr>
-          <w:noProof/>
-        </w:rPr>
-        <w:lastRenderedPageBreak/>
         <w:drawing>
           <wp:anchor distT="0" distB="0" distL="114300" distR="114300" simplePos="0" relativeHeight="251745280" behindDoc="0" locked="0" layoutInCell="1" allowOverlap="1" wp14:anchorId="5C6374B6" wp14:editId="66D95609">
             <wp:simplePos x="0" y="0"/>
@@ -6130,7 +7963,7 @@
                     <pic:cNvPicPr/>
                   </pic:nvPicPr>
                   <pic:blipFill>
-                    <a:blip r:embed="rId37">
+                    <a:blip r:embed="rId39">
                       <a:extLst>
                         <a:ext uri="{28A0092B-C50C-407E-A947-70E740481C1C}">
                           <a14:useLocalDpi xmlns:a14="http://schemas.microsoft.com/office/drawing/2010/main" val="0"/>
@@ -6193,12 +8026,24 @@
     <w:p>
       <w:pPr>
         <w:pStyle w:val="ListParagraph"/>
+      </w:pPr>
+    </w:p>
+    <w:p/>
+    <w:p/>
+    <w:p/>
+    <w:p/>
+    <w:p/>
+    <w:p/>
+    <w:p>
+      <w:pPr>
+        <w:pStyle w:val="ListParagraph"/>
         <w:numPr>
           <w:ilvl w:val="0"/>
           <w:numId w:val="15"/>
         </w:numPr>
       </w:pPr>
       <w:r>
+        <w:lastRenderedPageBreak/>
         <w:t xml:space="preserve">Configureer </w:t>
       </w:r>
       <w:r>
@@ -6653,14 +8498,6 @@
         <w:t xml:space="preserve"> + create</w:t>
       </w:r>
     </w:p>
-    <w:p/>
-    <w:p/>
-    <w:p/>
-    <w:p/>
-    <w:p/>
-    <w:p/>
-    <w:p/>
-    <w:p/>
     <w:p>
       <w:pPr>
         <w:pStyle w:val="ListParagraph"/>
@@ -6670,7 +8507,6 @@
         </w:numPr>
       </w:pPr>
       <w:r>
-        <w:lastRenderedPageBreak/>
         <w:t xml:space="preserve">Open </w:t>
       </w:r>
       <w:r>
@@ -6689,9 +8525,6 @@
         </w:numPr>
       </w:pPr>
       <w:r>
-        <w:rPr>
-          <w:noProof/>
-        </w:rPr>
         <w:drawing>
           <wp:anchor distT="0" distB="0" distL="114300" distR="114300" simplePos="0" relativeHeight="251746304" behindDoc="0" locked="0" layoutInCell="1" allowOverlap="1" wp14:anchorId="31CB7CCF" wp14:editId="29EF7E30">
             <wp:simplePos x="0" y="0"/>
@@ -6716,7 +8549,7 @@
                     <pic:cNvPicPr/>
                   </pic:nvPicPr>
                   <pic:blipFill>
-                    <a:blip r:embed="rId38">
+                    <a:blip r:embed="rId40">
                       <a:extLst>
                         <a:ext uri="{28A0092B-C50C-407E-A947-70E740481C1C}">
                           <a14:useLocalDpi xmlns:a14="http://schemas.microsoft.com/office/drawing/2010/main" val="0"/>
@@ -6776,6 +8609,12 @@
         <w:t>Ga naar de Virtuele Machine instellingen</w:t>
       </w:r>
     </w:p>
+    <w:p/>
+    <w:p/>
+    <w:p/>
+    <w:p/>
+    <w:p/>
+    <w:p/>
     <w:p>
       <w:pPr>
         <w:pStyle w:val="ListParagraph"/>
@@ -6785,17 +8624,15 @@
         </w:numPr>
       </w:pPr>
       <w:r>
-        <w:rPr>
-          <w:noProof/>
-        </w:rPr>
+        <w:lastRenderedPageBreak/>
         <w:drawing>
-          <wp:anchor distT="0" distB="0" distL="114300" distR="114300" simplePos="0" relativeHeight="251747328" behindDoc="0" locked="0" layoutInCell="1" allowOverlap="1" wp14:anchorId="6FEF4CC7" wp14:editId="7E54F355">
+          <wp:anchor distT="0" distB="0" distL="114300" distR="114300" simplePos="0" relativeHeight="251747328" behindDoc="0" locked="0" layoutInCell="1" allowOverlap="1" wp14:anchorId="6FEF4CC7" wp14:editId="33F3BEB5">
             <wp:simplePos x="0" y="0"/>
             <wp:positionH relativeFrom="margin">
               <wp:align>center</wp:align>
             </wp:positionH>
             <wp:positionV relativeFrom="paragraph">
-              <wp:posOffset>4101465</wp:posOffset>
+              <wp:posOffset>313690</wp:posOffset>
             </wp:positionV>
             <wp:extent cx="5863590" cy="3063240"/>
             <wp:effectExtent l="133350" t="114300" r="137160" b="156210"/>
@@ -6812,7 +8649,7 @@
                     <pic:cNvPicPr/>
                   </pic:nvPicPr>
                   <pic:blipFill>
-                    <a:blip r:embed="rId39">
+                    <a:blip r:embed="rId41">
                       <a:extLst>
                         <a:ext uri="{28A0092B-C50C-407E-A947-70E740481C1C}">
                           <a14:useLocalDpi xmlns:a14="http://schemas.microsoft.com/office/drawing/2010/main" val="0"/>
@@ -6884,10 +8721,6 @@
         <w:t xml:space="preserve"> network settings</w:t>
       </w:r>
     </w:p>
-    <w:p/>
-    <w:p/>
-    <w:p/>
-    <w:p/>
     <w:p>
       <w:pPr>
         <w:pStyle w:val="ListParagraph"/>
@@ -6897,18 +8730,14 @@
         </w:numPr>
       </w:pPr>
       <w:r>
-        <w:rPr>
-          <w:noProof/>
-        </w:rPr>
-        <w:lastRenderedPageBreak/>
         <w:drawing>
-          <wp:anchor distT="0" distB="0" distL="114300" distR="114300" simplePos="0" relativeHeight="251748352" behindDoc="0" locked="0" layoutInCell="1" allowOverlap="1" wp14:anchorId="14A3220E" wp14:editId="69B2C6B5">
+          <wp:anchor distT="0" distB="0" distL="114300" distR="114300" simplePos="0" relativeHeight="251748352" behindDoc="0" locked="0" layoutInCell="1" allowOverlap="1" wp14:anchorId="14A3220E" wp14:editId="6244F6FC">
             <wp:simplePos x="0" y="0"/>
             <wp:positionH relativeFrom="margin">
               <wp:align>center</wp:align>
             </wp:positionH>
             <wp:positionV relativeFrom="paragraph">
-              <wp:posOffset>289560</wp:posOffset>
+              <wp:posOffset>3673475</wp:posOffset>
             </wp:positionV>
             <wp:extent cx="5731510" cy="2854325"/>
             <wp:effectExtent l="133350" t="114300" r="116840" b="136525"/>
@@ -6925,7 +8754,7 @@
                     <pic:cNvPicPr/>
                   </pic:nvPicPr>
                   <pic:blipFill>
-                    <a:blip r:embed="rId40">
+                    <a:blip r:embed="rId42">
                       <a:extLst>
                         <a:ext uri="{28A0092B-C50C-407E-A947-70E740481C1C}">
                           <a14:useLocalDpi xmlns:a14="http://schemas.microsoft.com/office/drawing/2010/main" val="0"/>
@@ -7632,130 +9461,17 @@
         </w:numPr>
       </w:pPr>
       <w:r>
-        <w:rPr>
-          <w:noProof/>
-        </w:rPr>
+        <w:lastRenderedPageBreak/>
         <mc:AlternateContent>
           <mc:Choice Requires="wps">
             <w:drawing>
-              <wp:anchor distT="45720" distB="45720" distL="114300" distR="114300" simplePos="0" relativeHeight="251756544" behindDoc="0" locked="0" layoutInCell="1" allowOverlap="1" wp14:anchorId="1BF823EA" wp14:editId="495E580E">
-                <wp:simplePos x="0" y="0"/>
-                <wp:positionH relativeFrom="column">
-                  <wp:posOffset>480060</wp:posOffset>
-                </wp:positionH>
-                <wp:positionV relativeFrom="paragraph">
-                  <wp:posOffset>223520</wp:posOffset>
-                </wp:positionV>
-                <wp:extent cx="2360930" cy="289560"/>
-                <wp:effectExtent l="0" t="0" r="12700" b="15240"/>
-                <wp:wrapTopAndBottom/>
-                <wp:docPr id="1487360658" name="Text Box 2"/>
-                <wp:cNvGraphicFramePr>
-                  <a:graphicFrameLocks xmlns:a="http://schemas.openxmlformats.org/drawingml/2006/main"/>
-                </wp:cNvGraphicFramePr>
-                <a:graphic xmlns:a="http://schemas.openxmlformats.org/drawingml/2006/main">
-                  <a:graphicData uri="http://schemas.microsoft.com/office/word/2010/wordprocessingShape">
-                    <wps:wsp>
-                      <wps:cNvSpPr txBox="1">
-                        <a:spLocks noChangeArrowheads="1"/>
-                      </wps:cNvSpPr>
-                      <wps:spPr bwMode="auto">
-                        <a:xfrm>
-                          <a:off x="0" y="0"/>
-                          <a:ext cx="2360930" cy="289560"/>
-                        </a:xfrm>
-                        <a:prstGeom prst="rect">
-                          <a:avLst/>
-                        </a:prstGeom>
-                        <a:solidFill>
-                          <a:srgbClr val="FFFFFF"/>
-                        </a:solidFill>
-                        <a:ln w="9525">
-                          <a:solidFill>
-                            <a:srgbClr val="000000"/>
-                          </a:solidFill>
-                          <a:miter lim="800000"/>
-                          <a:headEnd/>
-                          <a:tailEnd/>
-                        </a:ln>
-                      </wps:spPr>
-                      <wps:txbx>
-                        <w:txbxContent>
-                          <w:p>
-                            <w:pPr>
-                              <w:pStyle w:val="Code"/>
-                            </w:pPr>
-                            <w:r>
-                              <w:t>Ssh gebruikersnaam@ip-adres</w:t>
-                            </w:r>
-                          </w:p>
-                        </w:txbxContent>
-                      </wps:txbx>
-                      <wps:bodyPr rot="0" vert="horz" wrap="square" lIns="91440" tIns="45720" rIns="91440" bIns="45720" anchor="t" anchorCtr="0">
-                        <a:noAutofit/>
-                      </wps:bodyPr>
-                    </wps:wsp>
-                  </a:graphicData>
-                </a:graphic>
-                <wp14:sizeRelH relativeFrom="margin">
-                  <wp14:pctWidth>40000</wp14:pctWidth>
-                </wp14:sizeRelH>
-                <wp14:sizeRelV relativeFrom="margin">
-                  <wp14:pctHeight>0</wp14:pctHeight>
-                </wp14:sizeRelV>
-              </wp:anchor>
-            </w:drawing>
-          </mc:Choice>
-          <mc:Fallback>
-            <w:pict>
-              <v:shape w14:anchorId="1BF823EA" id="Text Box 2" o:spid="_x0000_s1044" type="#_x0000_t202" style="position:absolute;left:0;text-align:left;margin-left:37.8pt;margin-top:17.6pt;width:185.9pt;height:22.8pt;z-index:251756544;visibility:visible;mso-wrap-style:square;mso-width-percent:400;mso-height-percent:0;mso-wrap-distance-left:9pt;mso-wrap-distance-top:3.6pt;mso-wrap-distance-right:9pt;mso-wrap-distance-bottom:3.6pt;mso-position-horizontal:absolute;mso-position-horizontal-relative:text;mso-position-vertical:absolute;mso-position-vertical-relative:text;mso-width-percent:400;mso-height-percent:0;mso-width-relative:margin;mso-height-relative:margin;v-text-anchor:top" o:gfxdata="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">
-                <v:textbox>
-                  <w:txbxContent>
-                    <w:p>
-                      <w:pPr>
-                        <w:pStyle w:val="Code"/>
-                      </w:pPr>
-                      <w:r>
-                        <w:t>Ssh gebruikersnaam@ip-adres</w:t>
-                      </w:r>
-                    </w:p>
-                  </w:txbxContent>
-                </v:textbox>
-                <w10:wrap type="topAndBottom"/>
-              </v:shape>
-            </w:pict>
-          </mc:Fallback>
-        </mc:AlternateContent>
-      </w:r>
-      <w:r>
-        <w:t>Login</w:t>
-      </w:r>
-      <w:r>
-        <w:t xml:space="preserve"> op de VM met SSH</w:t>
-      </w:r>
-    </w:p>
-    <w:p>
-      <w:pPr>
-        <w:pStyle w:val="ListParagraph"/>
-        <w:numPr>
-          <w:ilvl w:val="0"/>
-          <w:numId w:val="15"/>
-        </w:numPr>
-      </w:pPr>
-      <w:r>
-        <w:rPr>
-          <w:noProof/>
-        </w:rPr>
-        <mc:AlternateContent>
-          <mc:Choice Requires="wps">
-            <w:drawing>
-              <wp:anchor distT="45720" distB="45720" distL="114300" distR="114300" simplePos="0" relativeHeight="251704320" behindDoc="0" locked="0" layoutInCell="1" allowOverlap="1" wp14:anchorId="1A4AD537" wp14:editId="462E7F2C">
+              <wp:anchor distT="45720" distB="45720" distL="114300" distR="114300" simplePos="0" relativeHeight="251704320" behindDoc="0" locked="0" layoutInCell="1" allowOverlap="1" wp14:anchorId="1A4AD537" wp14:editId="50310DFD">
                 <wp:simplePos x="0" y="0"/>
                 <wp:positionH relativeFrom="column">
                   <wp:posOffset>495300</wp:posOffset>
                 </wp:positionH>
                 <wp:positionV relativeFrom="paragraph">
-                  <wp:posOffset>574040</wp:posOffset>
+                  <wp:posOffset>783590</wp:posOffset>
                 </wp:positionV>
                 <wp:extent cx="2360930" cy="1074420"/>
                 <wp:effectExtent l="0" t="0" r="12700" b="11430"/>
@@ -7795,34 +9511,64 @@
                           <w:p>
                             <w:pPr>
                               <w:pStyle w:val="Code"/>
+                              <w:rPr>
+                                <w:lang w:val="nl-NL"/>
+                              </w:rPr>
                             </w:pPr>
                             <w:r>
+                              <w:rPr>
+                                <w:lang w:val="nl-NL"/>
+                              </w:rPr>
                               <w:t>s</w:t>
                             </w:r>
                             <w:r>
+                              <w:rPr>
+                                <w:lang w:val="nl-NL"/>
+                              </w:rPr>
                               <w:t>udo</w:t>
                             </w:r>
                             <w:r>
+                              <w:rPr>
+                                <w:lang w:val="nl-NL"/>
+                              </w:rPr>
                               <w:t xml:space="preserve"> ufw</w:t>
                             </w:r>
                             <w:r>
+                              <w:rPr>
+                                <w:lang w:val="nl-NL"/>
+                              </w:rPr>
                               <w:t xml:space="preserve"> allow ssh</w:t>
                             </w:r>
                           </w:p>
                           <w:p>
                             <w:pPr>
                               <w:pStyle w:val="Code"/>
+                              <w:rPr>
+                                <w:lang w:val="nl-NL"/>
+                              </w:rPr>
                             </w:pPr>
                             <w:r>
+                              <w:rPr>
+                                <w:lang w:val="nl-NL"/>
+                              </w:rPr>
                               <w:t>s</w:t>
                             </w:r>
                             <w:r>
+                              <w:rPr>
+                                <w:lang w:val="nl-NL"/>
+                              </w:rPr>
                               <w:t>udo</w:t>
                             </w:r>
                             <w:r>
+                              <w:rPr>
+                                <w:lang w:val="nl-NL"/>
+                              </w:rPr>
                               <w:t xml:space="preserve"> ufw</w:t>
                             </w:r>
                             <w:r>
+                              <w:rPr>
+                                <w:lang w:val="nl-NL"/>
+                              </w:rPr>
                               <w:t xml:space="preserve"> allow http</w:t>
                             </w:r>
                           </w:p>
@@ -7945,40 +9691,70 @@
           </mc:Choice>
           <mc:Fallback>
             <w:pict>
-              <v:shape w14:anchorId="1A4AD537" id="_x0000_s1045" type="#_x0000_t202" style="position:absolute;left:0;text-align:left;margin-left:39pt;margin-top:45.2pt;width:185.9pt;height:84.6pt;z-index:251704320;visibility:visible;mso-wrap-style:square;mso-width-percent:400;mso-height-percent:0;mso-wrap-distance-left:9pt;mso-wrap-distance-top:3.6pt;mso-wrap-distance-right:9pt;mso-wrap-distance-bottom:3.6pt;mso-position-horizontal:absolute;mso-position-horizontal-relative:text;mso-position-vertical:absolute;mso-position-vertical-relative:text;mso-width-percent:400;mso-height-percent:0;mso-width-relative:margin;mso-height-relative:margin;v-text-anchor:top" o:gfxdata="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">
+              <v:shape w14:anchorId="1A4AD537" id="Text Box 2" o:spid="_x0000_s1044" type="#_x0000_t202" style="position:absolute;left:0;text-align:left;margin-left:39pt;margin-top:61.7pt;width:185.9pt;height:84.6pt;z-index:251704320;visibility:visible;mso-wrap-style:square;mso-width-percent:400;mso-height-percent:0;mso-wrap-distance-left:9pt;mso-wrap-distance-top:3.6pt;mso-wrap-distance-right:9pt;mso-wrap-distance-bottom:3.6pt;mso-position-horizontal:absolute;mso-position-horizontal-relative:text;mso-position-vertical:absolute;mso-position-vertical-relative:text;mso-width-percent:400;mso-height-percent:0;mso-width-relative:margin;mso-height-relative:margin;v-text-anchor:top" o:gfxdata="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">
                 <v:textbox>
                   <w:txbxContent>
                     <w:p>
                       <w:pPr>
                         <w:pStyle w:val="Code"/>
+                        <w:rPr>
+                          <w:lang w:val="nl-NL"/>
+                        </w:rPr>
                       </w:pPr>
                       <w:r>
+                        <w:rPr>
+                          <w:lang w:val="nl-NL"/>
+                        </w:rPr>
                         <w:t>s</w:t>
                       </w:r>
                       <w:r>
+                        <w:rPr>
+                          <w:lang w:val="nl-NL"/>
+                        </w:rPr>
                         <w:t>udo</w:t>
                       </w:r>
                       <w:r>
+                        <w:rPr>
+                          <w:lang w:val="nl-NL"/>
+                        </w:rPr>
                         <w:t xml:space="preserve"> ufw</w:t>
                       </w:r>
                       <w:r>
+                        <w:rPr>
+                          <w:lang w:val="nl-NL"/>
+                        </w:rPr>
                         <w:t xml:space="preserve"> allow ssh</w:t>
                       </w:r>
                     </w:p>
                     <w:p>
                       <w:pPr>
                         <w:pStyle w:val="Code"/>
+                        <w:rPr>
+                          <w:lang w:val="nl-NL"/>
+                        </w:rPr>
                       </w:pPr>
                       <w:r>
+                        <w:rPr>
+                          <w:lang w:val="nl-NL"/>
+                        </w:rPr>
                         <w:t>s</w:t>
                       </w:r>
                       <w:r>
+                        <w:rPr>
+                          <w:lang w:val="nl-NL"/>
+                        </w:rPr>
                         <w:t>udo</w:t>
                       </w:r>
                       <w:r>
+                        <w:rPr>
+                          <w:lang w:val="nl-NL"/>
+                        </w:rPr>
                         <w:t xml:space="preserve"> ufw</w:t>
                       </w:r>
                       <w:r>
+                        <w:rPr>
+                          <w:lang w:val="nl-NL"/>
+                        </w:rPr>
                         <w:t xml:space="preserve"> allow http</w:t>
                       </w:r>
                     </w:p>
@@ -8091,16 +9867,115 @@
         </mc:AlternateContent>
       </w:r>
       <w:r>
-        <w:t>Open de juiste poorten op de Ubuntu VM</w:t>
-      </w:r>
-      <w:r>
-        <w:t xml:space="preserve"> </w:t>
-      </w:r>
-      <w:r>
-        <w:t xml:space="preserve">en start de firewall </w:t>
-      </w:r>
-      <w:r>
-        <w:t>(nodig voor later)</w:t>
+        <mc:AlternateContent>
+          <mc:Choice Requires="wps">
+            <w:drawing>
+              <wp:anchor distT="45720" distB="45720" distL="114300" distR="114300" simplePos="0" relativeHeight="251756544" behindDoc="0" locked="0" layoutInCell="1" allowOverlap="1" wp14:anchorId="1BF823EA" wp14:editId="3AA46034">
+                <wp:simplePos x="0" y="0"/>
+                <wp:positionH relativeFrom="column">
+                  <wp:posOffset>480060</wp:posOffset>
+                </wp:positionH>
+                <wp:positionV relativeFrom="paragraph">
+                  <wp:posOffset>223520</wp:posOffset>
+                </wp:positionV>
+                <wp:extent cx="2360930" cy="289560"/>
+                <wp:effectExtent l="0" t="0" r="12700" b="15240"/>
+                <wp:wrapTopAndBottom/>
+                <wp:docPr id="1487360658" name="Text Box 2"/>
+                <wp:cNvGraphicFramePr>
+                  <a:graphicFrameLocks xmlns:a="http://schemas.openxmlformats.org/drawingml/2006/main"/>
+                </wp:cNvGraphicFramePr>
+                <a:graphic xmlns:a="http://schemas.openxmlformats.org/drawingml/2006/main">
+                  <a:graphicData uri="http://schemas.microsoft.com/office/word/2010/wordprocessingShape">
+                    <wps:wsp>
+                      <wps:cNvSpPr txBox="1">
+                        <a:spLocks noChangeArrowheads="1"/>
+                      </wps:cNvSpPr>
+                      <wps:spPr bwMode="auto">
+                        <a:xfrm>
+                          <a:off x="0" y="0"/>
+                          <a:ext cx="2360930" cy="289560"/>
+                        </a:xfrm>
+                        <a:prstGeom prst="rect">
+                          <a:avLst/>
+                        </a:prstGeom>
+                        <a:solidFill>
+                          <a:srgbClr val="FFFFFF"/>
+                        </a:solidFill>
+                        <a:ln w="9525">
+                          <a:solidFill>
+                            <a:srgbClr val="000000"/>
+                          </a:solidFill>
+                          <a:miter lim="800000"/>
+                          <a:headEnd/>
+                          <a:tailEnd/>
+                        </a:ln>
+                      </wps:spPr>
+                      <wps:txbx>
+                        <w:txbxContent>
+                          <w:p>
+                            <w:pPr>
+                              <w:pStyle w:val="Code"/>
+                              <w:rPr>
+                                <w:lang w:val="nl-NL"/>
+                              </w:rPr>
+                            </w:pPr>
+                            <w:r>
+                              <w:rPr>
+                                <w:lang w:val="nl-NL"/>
+                              </w:rPr>
+                              <w:t>Ssh gebruikersnaam@ip-adres</w:t>
+                            </w:r>
+                          </w:p>
+                        </w:txbxContent>
+                      </wps:txbx>
+                      <wps:bodyPr rot="0" vert="horz" wrap="square" lIns="91440" tIns="45720" rIns="91440" bIns="45720" anchor="t" anchorCtr="0">
+                        <a:noAutofit/>
+                      </wps:bodyPr>
+                    </wps:wsp>
+                  </a:graphicData>
+                </a:graphic>
+                <wp14:sizeRelH relativeFrom="margin">
+                  <wp14:pctWidth>40000</wp14:pctWidth>
+                </wp14:sizeRelH>
+                <wp14:sizeRelV relativeFrom="margin">
+                  <wp14:pctHeight>0</wp14:pctHeight>
+                </wp14:sizeRelV>
+              </wp:anchor>
+            </w:drawing>
+          </mc:Choice>
+          <mc:Fallback>
+            <w:pict>
+              <v:shape w14:anchorId="1BF823EA" id="_x0000_s1045" type="#_x0000_t202" style="position:absolute;left:0;text-align:left;margin-left:37.8pt;margin-top:17.6pt;width:185.9pt;height:22.8pt;z-index:251756544;visibility:visible;mso-wrap-style:square;mso-width-percent:400;mso-height-percent:0;mso-wrap-distance-left:9pt;mso-wrap-distance-top:3.6pt;mso-wrap-distance-right:9pt;mso-wrap-distance-bottom:3.6pt;mso-position-horizontal:absolute;mso-position-horizontal-relative:text;mso-position-vertical:absolute;mso-position-vertical-relative:text;mso-width-percent:400;mso-height-percent:0;mso-width-relative:margin;mso-height-relative:margin;v-text-anchor:top" o:gfxdata="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">
+                <v:textbox>
+                  <w:txbxContent>
+                    <w:p>
+                      <w:pPr>
+                        <w:pStyle w:val="Code"/>
+                        <w:rPr>
+                          <w:lang w:val="nl-NL"/>
+                        </w:rPr>
+                      </w:pPr>
+                      <w:r>
+                        <w:rPr>
+                          <w:lang w:val="nl-NL"/>
+                        </w:rPr>
+                        <w:t>Ssh gebruikersnaam@ip-adres</w:t>
+                      </w:r>
+                    </w:p>
+                  </w:txbxContent>
+                </v:textbox>
+                <w10:wrap type="topAndBottom"/>
+              </v:shape>
+            </w:pict>
+          </mc:Fallback>
+        </mc:AlternateContent>
+      </w:r>
+      <w:r>
+        <w:t>Login</w:t>
+      </w:r>
+      <w:r>
+        <w:t xml:space="preserve"> op de VM met SSH</w:t>
       </w:r>
     </w:p>
     <w:p>
@@ -8112,50 +9987,44 @@
         </w:numPr>
       </w:pPr>
       <w:r>
-        <w:t>(</w:t>
-      </w:r>
-      <w:proofErr w:type="spellStart"/>
-      <w:r>
-        <w:t>Optioneel</w:t>
-      </w:r>
-      <w:proofErr w:type="spellEnd"/>
-      <w:r>
-        <w:t xml:space="preserve">) </w:t>
-      </w:r>
-      <w:proofErr w:type="spellStart"/>
-      <w:r>
-        <w:t>Gebruik</w:t>
-      </w:r>
-      <w:proofErr w:type="spellEnd"/>
-      <w:r>
-        <w:t xml:space="preserve"> Nginx </w:t>
-      </w:r>
-      <w:proofErr w:type="spellStart"/>
-      <w:r>
-        <w:t>en</w:t>
-      </w:r>
-      <w:proofErr w:type="spellEnd"/>
-      <w:r>
-        <w:t xml:space="preserve"> Let</w:t>
-      </w:r>
-      <w:r>
-        <w:t>’</w:t>
-      </w:r>
-      <w:r>
-        <w:t>s Encrypt</w:t>
-      </w:r>
-      <w:r>
-        <w:t xml:space="preserve"> voor het aanmaken van SSL certificaten voor gebruik met HTTPS en een DuckDNS Domain Name</w:t>
+        <w:t>Open de juiste poorten op de Ubuntu VM</w:t>
+      </w:r>
+      <w:r>
+        <w:t xml:space="preserve"> </w:t>
+      </w:r>
+      <w:r>
+        <w:t xml:space="preserve">en start de firewall </w:t>
+      </w:r>
+      <w:r>
+        <w:t>(nodig voor later)</w:t>
       </w:r>
     </w:p>
     <w:p>
       <w:pPr>
         <w:pStyle w:val="ListParagraph"/>
-      </w:pPr>
-      <w:r>
-        <w:rPr>
-          <w:noProof/>
-        </w:rPr>
+        <w:numPr>
+          <w:ilvl w:val="0"/>
+          <w:numId w:val="15"/>
+        </w:numPr>
+      </w:pPr>
+      <w:r>
+        <w:t>(Optioneel) Gebruik Nginx en Let</w:t>
+      </w:r>
+      <w:r>
+        <w:t>’</w:t>
+      </w:r>
+      <w:r>
+        <w:t>s Encrypt</w:t>
+      </w:r>
+      <w:r>
+        <w:t xml:space="preserve"> voor het aanmaken van SSL certificaten voor gebruik met HTTPS en een DuckDNS Domain Name</w:t>
+      </w:r>
+    </w:p>
+    <w:p>
+      <w:pPr>
+        <w:pStyle w:val="ListParagraph"/>
+      </w:pPr>
+      <w:r>
         <mc:AlternateContent>
           <mc:Choice Requires="wps">
             <w:drawing>
@@ -8304,7 +10173,7 @@
           </mc:Fallback>
         </mc:AlternateContent>
       </w:r>
-      <w:hyperlink r:id="rId41" w:history="1">
+      <w:hyperlink r:id="rId43" w:history="1">
         <w:r>
           <w:rPr>
             <w:rStyle w:val="Hyperlink"/>
@@ -8320,16 +10189,10 @@
     </w:p>
     <w:p>
       <w:pPr>
-        <w:pStyle w:val="ListParagraph"/>
-      </w:pPr>
-    </w:p>
-    <w:p>
-      <w:pPr>
         <w:pStyle w:val="Heading2"/>
       </w:pPr>
       <w:bookmarkStart w:id="17" w:name="_Toc199317605"/>
       <w:r>
-        <w:lastRenderedPageBreak/>
         <w:t>MariaDB</w:t>
       </w:r>
       <w:bookmarkEnd w:id="17"/>
@@ -8343,9 +10206,6 @@
         </w:numPr>
       </w:pPr>
       <w:r>
-        <w:rPr>
-          <w:noProof/>
-        </w:rPr>
         <mc:AlternateContent>
           <mc:Choice Requires="wps">
             <w:drawing>
@@ -8450,13 +10310,8 @@
           </mc:Fallback>
         </mc:AlternateContent>
       </w:r>
-      <w:proofErr w:type="spellStart"/>
-      <w:r>
-        <w:t>Verbind</w:t>
-      </w:r>
-      <w:proofErr w:type="spellEnd"/>
-      <w:r>
-        <w:t xml:space="preserve"> met de Ubuntu VM via SSH</w:t>
+      <w:r>
+        <w:t>Verbind met de Ubuntu VM via SSH</w:t>
       </w:r>
     </w:p>
     <w:p>
@@ -8468,9 +10323,6 @@
         </w:numPr>
       </w:pPr>
       <w:r>
-        <w:rPr>
-          <w:noProof/>
-        </w:rPr>
         <mc:AlternateContent>
           <mc:Choice Requires="wps">
             <w:drawing>
@@ -8604,13 +10456,8 @@
         </mc:AlternateContent>
       </w:r>
       <w:r>
-        <w:t xml:space="preserve">Update het </w:t>
-      </w:r>
-      <w:proofErr w:type="spellStart"/>
-      <w:r>
-        <w:t>systeem</w:t>
-      </w:r>
-      <w:proofErr w:type="spellEnd"/>
+        <w:t>Update het systeem</w:t>
+      </w:r>
     </w:p>
     <w:p>
       <w:pPr>
@@ -8621,9 +10468,6 @@
         </w:numPr>
       </w:pPr>
       <w:r>
-        <w:rPr>
-          <w:noProof/>
-        </w:rPr>
         <mc:AlternateContent>
           <mc:Choice Requires="wps">
             <w:drawing>
@@ -8740,13 +10584,8 @@
           </mc:Fallback>
         </mc:AlternateContent>
       </w:r>
-      <w:proofErr w:type="spellStart"/>
-      <w:r>
-        <w:t>Installeer</w:t>
-      </w:r>
-      <w:proofErr w:type="spellEnd"/>
-      <w:r>
-        <w:t xml:space="preserve"> MariaDB Server</w:t>
+      <w:r>
+        <w:t>Installeer MariaDB Server</w:t>
       </w:r>
     </w:p>
     <w:p>
@@ -8758,9 +10597,6 @@
         </w:numPr>
       </w:pPr>
       <w:r>
-        <w:rPr>
-          <w:noProof/>
-        </w:rPr>
         <mc:AlternateContent>
           <mc:Choice Requires="wps">
             <w:drawing>
@@ -8922,23 +10758,7 @@
         </mc:AlternateContent>
       </w:r>
       <w:r>
-        <w:t xml:space="preserve">Start </w:t>
-      </w:r>
-      <w:proofErr w:type="spellStart"/>
-      <w:r>
-        <w:t>en</w:t>
-      </w:r>
-      <w:proofErr w:type="spellEnd"/>
-      <w:r>
-        <w:t xml:space="preserve"> </w:t>
-      </w:r>
-      <w:proofErr w:type="spellStart"/>
-      <w:r>
-        <w:t>controleer</w:t>
-      </w:r>
-      <w:proofErr w:type="spellEnd"/>
-      <w:r>
-        <w:t xml:space="preserve"> de MariaDB-service</w:t>
+        <w:t>Start en controleer de MariaDB-service</w:t>
       </w:r>
     </w:p>
     <w:p>
@@ -8950,9 +10770,6 @@
         </w:numPr>
       </w:pPr>
       <w:r>
-        <w:rPr>
-          <w:noProof/>
-        </w:rPr>
         <mc:AlternateContent>
           <mc:Choice Requires="wps">
             <w:drawing>
@@ -9057,19 +10874,9 @@
           </mc:Fallback>
         </mc:AlternateContent>
       </w:r>
-      <w:proofErr w:type="spellStart"/>
-      <w:r>
-        <w:t>Beveilig</w:t>
-      </w:r>
-      <w:proofErr w:type="spellEnd"/>
-      <w:r>
-        <w:t xml:space="preserve"> de </w:t>
-      </w:r>
-      <w:proofErr w:type="spellStart"/>
-      <w:r>
-        <w:t>installatie</w:t>
-      </w:r>
-      <w:proofErr w:type="spellEnd"/>
+      <w:r>
+        <w:t>Beveilig de installatie</w:t>
+      </w:r>
     </w:p>
     <w:p>
       <w:pPr>
@@ -9143,9 +10950,6 @@
         </w:numPr>
       </w:pPr>
       <w:r>
-        <w:rPr>
-          <w:noProof/>
-        </w:rPr>
         <mc:AlternateContent>
           <mc:Choice Requires="wps">
             <w:drawing>
@@ -9250,13 +11054,8 @@
           </mc:Fallback>
         </mc:AlternateContent>
       </w:r>
-      <w:proofErr w:type="spellStart"/>
-      <w:r>
-        <w:t>Toegang</w:t>
-      </w:r>
-      <w:proofErr w:type="spellEnd"/>
-      <w:r>
-        <w:t xml:space="preserve"> tot MariaD</w:t>
+      <w:r>
+        <w:t>Toegang tot MariaD</w:t>
       </w:r>
       <w:r>
         <w:t>B</w:t>
@@ -9271,19 +11070,17 @@
         </w:numPr>
       </w:pPr>
       <w:r>
-        <w:rPr>
-          <w:noProof/>
-        </w:rPr>
+        <w:lastRenderedPageBreak/>
         <mc:AlternateContent>
           <mc:Choice Requires="wps">
             <w:drawing>
-              <wp:anchor distT="45720" distB="45720" distL="114300" distR="114300" simplePos="0" relativeHeight="251708416" behindDoc="0" locked="0" layoutInCell="1" allowOverlap="1" wp14:anchorId="6A5FEBDB" wp14:editId="17E7B4B3">
+              <wp:anchor distT="45720" distB="45720" distL="114300" distR="114300" simplePos="0" relativeHeight="251708416" behindDoc="0" locked="0" layoutInCell="1" allowOverlap="1" wp14:anchorId="6A5FEBDB" wp14:editId="20A8CFC7">
                 <wp:simplePos x="0" y="0"/>
-                <wp:positionH relativeFrom="column">
-                  <wp:posOffset>472440</wp:posOffset>
+                <wp:positionH relativeFrom="margin">
+                  <wp:align>center</wp:align>
                 </wp:positionH>
                 <wp:positionV relativeFrom="paragraph">
-                  <wp:posOffset>677545</wp:posOffset>
+                  <wp:posOffset>227965</wp:posOffset>
                 </wp:positionV>
                 <wp:extent cx="5486400" cy="1089660"/>
                 <wp:effectExtent l="0" t="0" r="19050" b="15240"/>
@@ -9429,7 +11226,7 @@
           </mc:Choice>
           <mc:Fallback>
             <w:pict>
-              <v:shape w14:anchorId="6A5FEBDB" id="_x0000_s1053" type="#_x0000_t202" style="position:absolute;left:0;text-align:left;margin-left:37.2pt;margin-top:53.35pt;width:6in;height:85.8pt;z-index:251708416;visibility:visible;mso-wrap-style:square;mso-width-percent:0;mso-height-percent:0;mso-wrap-distance-left:9pt;mso-wrap-distance-top:3.6pt;mso-wrap-distance-right:9pt;mso-wrap-distance-bottom:3.6pt;mso-position-horizontal:absolute;mso-position-horizontal-relative:text;mso-position-vertical:absolute;mso-position-vertical-relative:text;mso-width-percent:0;mso-height-percent:0;mso-width-relative:margin;mso-height-relative:margin;v-text-anchor:top" o:gfxdata="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">
+              <v:shape w14:anchorId="6A5FEBDB" id="_x0000_s1053" type="#_x0000_t202" style="position:absolute;left:0;text-align:left;margin-left:0;margin-top:17.95pt;width:6in;height:85.8pt;z-index:251708416;visibility:visible;mso-wrap-style:square;mso-width-percent:0;mso-height-percent:0;mso-wrap-distance-left:9pt;mso-wrap-distance-top:3.6pt;mso-wrap-distance-right:9pt;mso-wrap-distance-bottom:3.6pt;mso-position-horizontal:center;mso-position-horizontal-relative:margin;mso-position-vertical:absolute;mso-position-vertical-relative:text;mso-width-percent:0;mso-height-percent:0;mso-width-relative:margin;mso-height-relative:margin;v-text-anchor:top" o:gfxdata="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">
                 <v:textbox>
                   <w:txbxContent>
                     <w:p>
@@ -9524,27 +11321,14 @@
                     </w:p>
                   </w:txbxContent>
                 </v:textbox>
-                <w10:wrap type="topAndBottom"/>
+                <w10:wrap type="topAndBottom" anchorx="margin"/>
               </v:shape>
             </w:pict>
           </mc:Fallback>
         </mc:AlternateContent>
       </w:r>
-      <w:proofErr w:type="spellStart"/>
-      <w:r>
-        <w:t>Voeg</w:t>
-      </w:r>
-      <w:proofErr w:type="spellEnd"/>
-      <w:r>
-        <w:t xml:space="preserve"> </w:t>
-      </w:r>
-      <w:proofErr w:type="spellStart"/>
-      <w:r>
-        <w:t>volgende</w:t>
-      </w:r>
-      <w:proofErr w:type="spellEnd"/>
-      <w:r>
-        <w:t xml:space="preserve"> database toe</w:t>
+      <w:r>
+        <w:t>Voeg volgende database toe</w:t>
       </w:r>
       <w:r>
         <w:t xml:space="preserve"> (database_structure.sql</w:t>
@@ -9562,19 +11346,16 @@
         </w:numPr>
       </w:pPr>
       <w:r>
-        <w:rPr>
-          <w:noProof/>
-        </w:rPr>
         <mc:AlternateContent>
           <mc:Choice Requires="wps">
             <w:drawing>
-              <wp:anchor distT="45720" distB="45720" distL="114300" distR="114300" simplePos="0" relativeHeight="251712512" behindDoc="0" locked="0" layoutInCell="1" allowOverlap="1" wp14:anchorId="3C700E10" wp14:editId="586326D4">
+              <wp:anchor distT="45720" distB="45720" distL="114300" distR="114300" simplePos="0" relativeHeight="251712512" behindDoc="0" locked="0" layoutInCell="1" allowOverlap="1" wp14:anchorId="3C700E10" wp14:editId="55B8D4B7">
                 <wp:simplePos x="0" y="0"/>
                 <wp:positionH relativeFrom="margin">
-                  <wp:align>right</wp:align>
+                  <wp:align>center</wp:align>
                 </wp:positionH>
                 <wp:positionV relativeFrom="paragraph">
-                  <wp:posOffset>1475105</wp:posOffset>
+                  <wp:posOffset>1429385</wp:posOffset>
                 </wp:positionV>
                 <wp:extent cx="5234940" cy="807720"/>
                 <wp:effectExtent l="0" t="0" r="22860" b="11430"/>
@@ -9714,7 +11495,7 @@
           </mc:Choice>
           <mc:Fallback>
             <w:pict>
-              <v:shape w14:anchorId="3C700E10" id="_x0000_s1054" type="#_x0000_t202" style="position:absolute;left:0;text-align:left;margin-left:361pt;margin-top:116.15pt;width:412.2pt;height:63.6pt;z-index:251712512;visibility:visible;mso-wrap-style:square;mso-width-percent:0;mso-height-percent:0;mso-wrap-distance-left:9pt;mso-wrap-distance-top:3.6pt;mso-wrap-distance-right:9pt;mso-wrap-distance-bottom:3.6pt;mso-position-horizontal:right;mso-position-horizontal-relative:margin;mso-position-vertical:absolute;mso-position-vertical-relative:text;mso-width-percent:0;mso-height-percent:0;mso-width-relative:margin;mso-height-relative:margin;v-text-anchor:top" o:gfxdata="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">
+              <v:shape w14:anchorId="3C700E10" id="_x0000_s1054" type="#_x0000_t202" style="position:absolute;left:0;text-align:left;margin-left:0;margin-top:112.55pt;width:412.2pt;height:63.6pt;z-index:251712512;visibility:visible;mso-wrap-style:square;mso-width-percent:0;mso-height-percent:0;mso-wrap-distance-left:9pt;mso-wrap-distance-top:3.6pt;mso-wrap-distance-right:9pt;mso-wrap-distance-bottom:3.6pt;mso-position-horizontal:center;mso-position-horizontal-relative:margin;mso-position-vertical:absolute;mso-position-vertical-relative:text;mso-width-percent:0;mso-height-percent:0;mso-width-relative:margin;mso-height-relative:margin;v-text-anchor:top" o:gfxdata="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">
                 <v:textbox>
                   <w:txbxContent>
                     <w:p>
@@ -9809,25 +11590,10 @@
           </mc:Fallback>
         </mc:AlternateContent>
       </w:r>
-      <w:proofErr w:type="spellStart"/>
-      <w:r>
-        <w:t>Creëer</w:t>
-      </w:r>
-      <w:proofErr w:type="spellEnd"/>
-      <w:r>
-        <w:t xml:space="preserve"> </w:t>
-      </w:r>
-      <w:proofErr w:type="spellStart"/>
-      <w:r>
-        <w:t>een</w:t>
-      </w:r>
-      <w:proofErr w:type="spellEnd"/>
-      <w:r>
-        <w:t xml:space="preserve"> database user met rechten op onze nieuw gecreëerde database</w:t>
+      <w:r>
+        <w:t>Creëer een database user met rechten op onze nieuw gecreëerde database</w:t>
       </w:r>
     </w:p>
-    <w:p/>
-    <w:p/>
     <w:p/>
     <w:p>
       <w:pPr>
@@ -9838,7 +11604,6 @@
       </w:pPr>
       <w:bookmarkStart w:id="18" w:name="_Toc199317606"/>
       <w:r>
-        <w:lastRenderedPageBreak/>
         <w:t>Mosquitto</w:t>
       </w:r>
       <w:bookmarkEnd w:id="18"/>
@@ -9852,9 +11617,6 @@
         </w:numPr>
       </w:pPr>
       <w:r>
-        <w:rPr>
-          <w:noProof/>
-        </w:rPr>
         <mc:AlternateContent>
           <mc:Choice Requires="wps">
             <w:drawing>
@@ -9972,9 +11734,6 @@
         </w:numPr>
       </w:pPr>
       <w:r>
-        <w:rPr>
-          <w:noProof/>
-        </w:rPr>
         <mc:AlternateContent>
           <mc:Choice Requires="wps">
             <w:drawing>
@@ -10132,9 +11891,6 @@
         </w:numPr>
       </w:pPr>
       <w:r>
-        <w:rPr>
-          <w:noProof/>
-        </w:rPr>
         <mc:AlternateContent>
           <mc:Choice Requires="wps">
             <w:drawing>
@@ -10184,42 +11940,24 @@
                           <w:p>
                             <w:pPr>
                               <w:pStyle w:val="Code"/>
+                              <w:rPr>
+                                <w:lang w:val="nl-NL"/>
+                              </w:rPr>
                             </w:pPr>
                             <w:r>
+                              <w:rPr>
+                                <w:lang w:val="nl-NL"/>
+                              </w:rPr>
                               <w:t xml:space="preserve">sudo mosquitto_passwd -c /etc/mosquitto/passwd </w:t>
-                            </w:r>
-                            <w:proofErr w:type="spellStart"/>
-                            <w:r>
-                              <w:rPr>
-                                <w:i/>
-                                <w:iCs/>
-                              </w:rPr>
-                              <w:t>g</w:t>
                             </w:r>
                             <w:r>
                               <w:rPr>
                                 <w:i/>
                                 <w:iCs/>
+                                <w:lang w:val="nl-NL"/>
                               </w:rPr>
-                              <w:t>ebruikersnaam</w:t>
+                              <w:t>gebruikersnaam hier</w:t>
                             </w:r>
-                            <w:proofErr w:type="spellEnd"/>
-                            <w:r>
-                              <w:rPr>
-                                <w:i/>
-                                <w:iCs/>
-                              </w:rPr>
-                              <w:t xml:space="preserve"> </w:t>
-                            </w:r>
-                            <w:proofErr w:type="spellStart"/>
-                            <w:r>
-                              <w:rPr>
-                                <w:i/>
-                                <w:iCs/>
-                              </w:rPr>
-                              <w:t>hier</w:t>
-                            </w:r>
-                            <w:proofErr w:type="spellEnd"/>
                           </w:p>
                         </w:txbxContent>
                       </wps:txbx>
@@ -10246,42 +11984,24 @@
                     <w:p>
                       <w:pPr>
                         <w:pStyle w:val="Code"/>
+                        <w:rPr>
+                          <w:lang w:val="nl-NL"/>
+                        </w:rPr>
                       </w:pPr>
                       <w:r>
+                        <w:rPr>
+                          <w:lang w:val="nl-NL"/>
+                        </w:rPr>
                         <w:t xml:space="preserve">sudo mosquitto_passwd -c /etc/mosquitto/passwd </w:t>
-                      </w:r>
-                      <w:proofErr w:type="spellStart"/>
-                      <w:r>
-                        <w:rPr>
-                          <w:i/>
-                          <w:iCs/>
-                        </w:rPr>
-                        <w:t>g</w:t>
                       </w:r>
                       <w:r>
                         <w:rPr>
                           <w:i/>
                           <w:iCs/>
+                          <w:lang w:val="nl-NL"/>
                         </w:rPr>
-                        <w:t>ebruikersnaam</w:t>
+                        <w:t>gebruikersnaam hier</w:t>
                       </w:r>
-                      <w:proofErr w:type="spellEnd"/>
-                      <w:r>
-                        <w:rPr>
-                          <w:i/>
-                          <w:iCs/>
-                        </w:rPr>
-                        <w:t xml:space="preserve"> </w:t>
-                      </w:r>
-                      <w:proofErr w:type="spellStart"/>
-                      <w:r>
-                        <w:rPr>
-                          <w:i/>
-                          <w:iCs/>
-                        </w:rPr>
-                        <w:t>hier</w:t>
-                      </w:r>
-                      <w:proofErr w:type="spellEnd"/>
                     </w:p>
                   </w:txbxContent>
                 </v:textbox>
@@ -10292,29 +12012,8 @@
         </mc:AlternateContent>
       </w:r>
       <w:r>
-        <w:t xml:space="preserve">Maak </w:t>
-      </w:r>
-      <w:proofErr w:type="spellStart"/>
-      <w:r>
-        <w:t>een</w:t>
-      </w:r>
-      <w:proofErr w:type="spellEnd"/>
-      <w:r>
-        <w:t xml:space="preserve"> </w:t>
-      </w:r>
-      <w:proofErr w:type="spellStart"/>
-      <w:r>
-        <w:t>wachtwoordbestand</w:t>
-      </w:r>
-      <w:proofErr w:type="spellEnd"/>
-      <w:r>
-        <w:t xml:space="preserve"> </w:t>
-      </w:r>
-      <w:proofErr w:type="spellStart"/>
-      <w:r>
-        <w:t>aan</w:t>
-      </w:r>
-      <w:proofErr w:type="spellEnd"/>
+        <w:t>Maak een wachtwoordbestand aan</w:t>
+      </w:r>
     </w:p>
     <w:p>
       <w:pPr>
@@ -10325,9 +12024,6 @@
         </w:numPr>
       </w:pPr>
       <w:r>
-        <w:rPr>
-          <w:noProof/>
-        </w:rPr>
         <mc:AlternateContent>
           <mc:Choice Requires="wps">
             <w:drawing>
@@ -10435,7 +12131,7 @@
           </mc:Choice>
           <mc:Fallback>
             <w:pict>
-              <v:shape w14:anchorId="574ABF9B" id="_x0000_s1058" type="#_x0000_t202" style="position:absolute;left:0;text-align:left;margin-left:73.95pt;margin-top:87.55pt;width:266.4pt;height:47.4pt;z-index:251683840;visibility:visible;mso-wrap-style:square;mso-width-percent:0;mso-height-percent:0;mso-wrap-distance-left:9pt;mso-wrap-distance-top:3.6pt;mso-wrap-distance-right:9pt;mso-wrap-distance-bottom:3.6pt;mso-position-horizontal:absolute;mso-position-horizontal-relative:text;mso-position-vertical:absolute;mso-position-vertical-relative:text;mso-width-percent:0;mso-height-percent:0;mso-width-relative:margin;mso-height-relative:margin;v-text-anchor:top" o:gfxdata="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">
+              <v:shape w14:anchorId="574ABF9B" id="_x0000_s1058" type="#_x0000_t202" style="position:absolute;left:0;text-align:left;margin-left:73.95pt;margin-top:87.55pt;width:266.4pt;height:47.4pt;z-index:251683840;visibility:visible;mso-wrap-style:square;mso-width-percent:0;mso-height-percent:0;mso-wrap-distance-left:9pt;mso-wrap-distance-top:3.6pt;mso-wrap-distance-right:9pt;mso-wrap-distance-bottom:3.6pt;mso-position-horizontal:absolute;mso-position-horizontal-relative:text;mso-position-vertical:absolute;mso-position-vertical-relative:text;mso-width-percent:0;mso-height-percent:0;mso-width-relative:margin;mso-height-relative:margin;v-text-anchor:top" o:gfxdata="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">
                 <v:textbox>
                   <w:txbxContent>
                     <w:p>
@@ -10489,9 +12185,6 @@
         </mc:AlternateContent>
       </w:r>
       <w:r>
-        <w:rPr>
-          <w:noProof/>
-        </w:rPr>
         <mc:AlternateContent>
           <mc:Choice Requires="wps">
             <w:drawing>
@@ -10583,7 +12276,7 @@
           </mc:Choice>
           <mc:Fallback>
             <w:pict>
-              <v:shape w14:anchorId="5E086E7E" id="_x0000_s1059" type="#_x0000_t202" style="position:absolute;left:0;text-align:left;margin-left:74.55pt;margin-top:57.1pt;width:265.2pt;height:23.4pt;z-index:251679744;visibility:visible;mso-wrap-style:square;mso-width-percent:0;mso-height-percent:0;mso-wrap-distance-left:9pt;mso-wrap-distance-top:3.6pt;mso-wrap-distance-right:9pt;mso-wrap-distance-bottom:3.6pt;mso-position-horizontal:absolute;mso-position-horizontal-relative:text;mso-position-vertical:absolute;mso-position-vertical-relative:text;mso-width-percent:0;mso-height-percent:0;mso-width-relative:margin;mso-height-relative:margin;v-text-anchor:top" o:gfxdata="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">
+              <v:shape w14:anchorId="5E086E7E" id="_x0000_s1059" type="#_x0000_t202" style="position:absolute;left:0;text-align:left;margin-left:74.55pt;margin-top:57.1pt;width:265.2pt;height:23.4pt;z-index:251679744;visibility:visible;mso-wrap-style:square;mso-width-percent:0;mso-height-percent:0;mso-wrap-distance-left:9pt;mso-wrap-distance-top:3.6pt;mso-wrap-distance-right:9pt;mso-wrap-distance-bottom:3.6pt;mso-position-horizontal:absolute;mso-position-horizontal-relative:text;mso-position-vertical:absolute;mso-position-vertical-relative:text;mso-width-percent:0;mso-height-percent:0;mso-width-relative:margin;mso-height-relative:margin;v-text-anchor:top" o:gfxdata="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">
                 <v:textbox>
                   <w:txbxContent>
                     <w:p>
@@ -10620,29 +12313,14 @@
           </mc:Fallback>
         </mc:AlternateContent>
       </w:r>
-      <w:proofErr w:type="spellStart"/>
       <w:r>
         <w:t>Bewerk</w:t>
       </w:r>
-      <w:proofErr w:type="spellEnd"/>
-      <w:r>
-        <w:t xml:space="preserve"> het </w:t>
-      </w:r>
-      <w:proofErr w:type="spellStart"/>
-      <w:r>
-        <w:t>configuratiebestand</w:t>
-      </w:r>
-      <w:proofErr w:type="spellEnd"/>
-      <w:r>
-        <w:t xml:space="preserve"> </w:t>
-      </w:r>
-      <w:proofErr w:type="spellStart"/>
-      <w:r>
-        <w:t>en</w:t>
-      </w:r>
-      <w:proofErr w:type="spellEnd"/>
-      <w:r>
-        <w:t xml:space="preserve"> </w:t>
+      <w:r>
+        <w:t xml:space="preserve"> het configuratiebestand</w:t>
+      </w:r>
+      <w:r>
+        <w:t xml:space="preserve"> en </w:t>
       </w:r>
       <w:r>
         <w:t>voeg volgende lijnen toe</w:t>
@@ -10657,9 +12335,6 @@
         </w:numPr>
       </w:pPr>
       <w:r>
-        <w:rPr>
-          <w:noProof/>
-        </w:rPr>
         <mc:AlternateContent>
           <mc:Choice Requires="wps">
             <w:drawing>
@@ -10764,21 +12439,21 @@
           </mc:Fallback>
         </mc:AlternateContent>
       </w:r>
-      <w:proofErr w:type="spellStart"/>
-      <w:r>
-        <w:t>Herstart</w:t>
-      </w:r>
-      <w:proofErr w:type="spellEnd"/>
-      <w:r>
-        <w:t xml:space="preserve"> Mosquitto Service</w:t>
+      <w:r>
+        <w:t>Herstart Mosquitto Service</w:t>
       </w:r>
     </w:p>
+    <w:p/>
+    <w:p/>
+    <w:p/>
+    <w:p/>
     <w:p>
       <w:pPr>
         <w:pStyle w:val="Heading2"/>
       </w:pPr>
       <w:bookmarkStart w:id="19" w:name="_Toc199317607"/>
       <w:r>
+        <w:lastRenderedPageBreak/>
         <w:t>Node-RED</w:t>
       </w:r>
       <w:bookmarkEnd w:id="19"/>
@@ -10792,9 +12467,6 @@
         </w:numPr>
       </w:pPr>
       <w:r>
-        <w:rPr>
-          <w:noProof/>
-        </w:rPr>
         <mc:AlternateContent>
           <mc:Choice Requires="wps">
             <w:drawing>
@@ -10899,13 +12571,8 @@
           </mc:Fallback>
         </mc:AlternateContent>
       </w:r>
-      <w:proofErr w:type="spellStart"/>
-      <w:r>
-        <w:t>Installeer</w:t>
-      </w:r>
-      <w:proofErr w:type="spellEnd"/>
-      <w:r>
-        <w:t xml:space="preserve"> Node.js &amp; Node-RED</w:t>
+      <w:r>
+        <w:t>Installeer Node.js &amp; Node-RED</w:t>
       </w:r>
     </w:p>
     <w:p>
@@ -10917,121 +12584,10 @@
         </w:numPr>
       </w:pPr>
       <w:r>
-        <w:rPr>
-          <w:noProof/>
-        </w:rPr>
         <mc:AlternateContent>
           <mc:Choice Requires="wps">
             <w:drawing>
-              <wp:anchor distT="45720" distB="45720" distL="114300" distR="114300" simplePos="0" relativeHeight="251689984" behindDoc="0" locked="0" layoutInCell="1" allowOverlap="1" wp14:anchorId="00766AC3" wp14:editId="39FA995B">
-                <wp:simplePos x="0" y="0"/>
-                <wp:positionH relativeFrom="margin">
-                  <wp:posOffset>508635</wp:posOffset>
-                </wp:positionH>
-                <wp:positionV relativeFrom="paragraph">
-                  <wp:posOffset>1382395</wp:posOffset>
-                </wp:positionV>
-                <wp:extent cx="1844040" cy="304800"/>
-                <wp:effectExtent l="0" t="0" r="22860" b="19050"/>
-                <wp:wrapTopAndBottom/>
-                <wp:docPr id="1860973823" name="Text Box 2"/>
-                <wp:cNvGraphicFramePr>
-                  <a:graphicFrameLocks xmlns:a="http://schemas.openxmlformats.org/drawingml/2006/main"/>
-                </wp:cNvGraphicFramePr>
-                <a:graphic xmlns:a="http://schemas.openxmlformats.org/drawingml/2006/main">
-                  <a:graphicData uri="http://schemas.microsoft.com/office/word/2010/wordprocessingShape">
-                    <wps:wsp>
-                      <wps:cNvSpPr txBox="1">
-                        <a:spLocks noChangeArrowheads="1"/>
-                      </wps:cNvSpPr>
-                      <wps:spPr bwMode="auto">
-                        <a:xfrm>
-                          <a:off x="0" y="0"/>
-                          <a:ext cx="1844040" cy="304800"/>
-                        </a:xfrm>
-                        <a:prstGeom prst="rect">
-                          <a:avLst/>
-                        </a:prstGeom>
-                        <a:solidFill>
-                          <a:srgbClr val="FFFFFF"/>
-                        </a:solidFill>
-                        <a:ln w="9525">
-                          <a:solidFill>
-                            <a:srgbClr val="000000"/>
-                          </a:solidFill>
-                          <a:miter lim="800000"/>
-                          <a:headEnd/>
-                          <a:tailEnd/>
-                        </a:ln>
-                      </wps:spPr>
-                      <wps:txbx>
-                        <w:txbxContent>
-                          <w:p>
-                            <w:pPr>
-                              <w:pStyle w:val="Code"/>
-                              <w:rPr>
-                                <w:lang w:val="nl-NL"/>
-                              </w:rPr>
-                            </w:pPr>
-                            <w:r>
-                              <w:rPr>
-                                <w:lang w:val="nl-NL"/>
-                              </w:rPr>
-                              <w:t>Node-red-start</w:t>
-                            </w:r>
-                          </w:p>
-                        </w:txbxContent>
-                      </wps:txbx>
-                      <wps:bodyPr rot="0" vert="horz" wrap="square" lIns="91440" tIns="45720" rIns="91440" bIns="45720" anchor="t" anchorCtr="0">
-                        <a:noAutofit/>
-                      </wps:bodyPr>
-                    </wps:wsp>
-                  </a:graphicData>
-                </a:graphic>
-                <wp14:sizeRelH relativeFrom="margin">
-                  <wp14:pctWidth>0</wp14:pctWidth>
-                </wp14:sizeRelH>
-                <wp14:sizeRelV relativeFrom="margin">
-                  <wp14:pctHeight>0</wp14:pctHeight>
-                </wp14:sizeRelV>
-              </wp:anchor>
-            </w:drawing>
-          </mc:Choice>
-          <mc:Fallback>
-            <w:pict>
-              <v:shape w14:anchorId="00766AC3" id="_x0000_s1062" type="#_x0000_t202" style="position:absolute;left:0;text-align:left;margin-left:40.05pt;margin-top:108.85pt;width:145.2pt;height:24pt;z-index:251689984;visibility:visible;mso-wrap-style:square;mso-width-percent:0;mso-height-percent:0;mso-wrap-distance-left:9pt;mso-wrap-distance-top:3.6pt;mso-wrap-distance-right:9pt;mso-wrap-distance-bottom:3.6pt;mso-position-horizontal:absolute;mso-position-horizontal-relative:margin;mso-position-vertical:absolute;mso-position-vertical-relative:text;mso-width-percent:0;mso-height-percent:0;mso-width-relative:margin;mso-height-relative:margin;v-text-anchor:top" o:gfxdata="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">
-                <v:textbox>
-                  <w:txbxContent>
-                    <w:p>
-                      <w:pPr>
-                        <w:pStyle w:val="Code"/>
-                        <w:rPr>
-                          <w:lang w:val="nl-NL"/>
-                        </w:rPr>
-                      </w:pPr>
-                      <w:r>
-                        <w:rPr>
-                          <w:lang w:val="nl-NL"/>
-                        </w:rPr>
-                        <w:t>Node-red-start</w:t>
-                      </w:r>
-                    </w:p>
-                  </w:txbxContent>
-                </v:textbox>
-                <w10:wrap type="topAndBottom" anchorx="margin"/>
-              </v:shape>
-            </w:pict>
-          </mc:Fallback>
-        </mc:AlternateContent>
-      </w:r>
-      <w:r>
-        <w:rPr>
-          <w:noProof/>
-        </w:rPr>
-        <mc:AlternateContent>
-          <mc:Choice Requires="wps">
-            <w:drawing>
-              <wp:anchor distT="45720" distB="45720" distL="114300" distR="114300" simplePos="0" relativeHeight="251687936" behindDoc="0" locked="0" layoutInCell="1" allowOverlap="1" wp14:anchorId="176F8F01" wp14:editId="6C9E7E27">
+              <wp:anchor distT="45720" distB="45720" distL="114300" distR="114300" simplePos="0" relativeHeight="251687936" behindDoc="0" locked="0" layoutInCell="1" allowOverlap="1" wp14:anchorId="176F8F01" wp14:editId="15C263C2">
                 <wp:simplePos x="0" y="0"/>
                 <wp:positionH relativeFrom="margin">
                   <wp:posOffset>468630</wp:posOffset>
@@ -11107,7 +12663,7 @@
           </mc:Choice>
           <mc:Fallback>
             <w:pict>
-              <v:shape w14:anchorId="176F8F01" id="_x0000_s1063" type="#_x0000_t202" style="position:absolute;left:0;text-align:left;margin-left:36.9pt;margin-top:63.55pt;width:246pt;height:24pt;z-index:251687936;visibility:visible;mso-wrap-style:square;mso-width-percent:0;mso-height-percent:0;mso-wrap-distance-left:9pt;mso-wrap-distance-top:3.6pt;mso-wrap-distance-right:9pt;mso-wrap-distance-bottom:3.6pt;mso-position-horizontal:absolute;mso-position-horizontal-relative:margin;mso-position-vertical:absolute;mso-position-vertical-relative:text;mso-width-percent:0;mso-height-percent:0;mso-width-relative:margin;mso-height-relative:margin;v-text-anchor:top" o:gfxdata="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">
+              <v:shape w14:anchorId="176F8F01" id="_x0000_s1062" type="#_x0000_t202" style="position:absolute;left:0;text-align:left;margin-left:36.9pt;margin-top:63.55pt;width:246pt;height:24pt;z-index:251687936;visibility:visible;mso-wrap-style:square;mso-width-percent:0;mso-height-percent:0;mso-wrap-distance-left:9pt;mso-wrap-distance-top:3.6pt;mso-wrap-distance-right:9pt;mso-wrap-distance-bottom:3.6pt;mso-position-horizontal:absolute;mso-position-horizontal-relative:margin;mso-position-vertical:absolute;mso-position-vertical-relative:text;mso-width-percent:0;mso-height-percent:0;mso-width-relative:margin;mso-height-relative:margin;v-text-anchor:top" o:gfxdata="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">
                 <v:textbox>
                   <w:txbxContent>
                     <w:p>
@@ -11133,25 +12689,10 @@
         </mc:AlternateContent>
       </w:r>
       <w:r>
-        <w:t xml:space="preserve">Start Node-RED </w:t>
-      </w:r>
-      <w:proofErr w:type="spellStart"/>
-      <w:r>
-        <w:t>automatisch</w:t>
-      </w:r>
-      <w:proofErr w:type="spellEnd"/>
-      <w:r>
-        <w:t xml:space="preserve"> </w:t>
-      </w:r>
-      <w:proofErr w:type="spellStart"/>
-      <w:r>
-        <w:t>bij</w:t>
-      </w:r>
-      <w:proofErr w:type="spellEnd"/>
-      <w:r>
-        <w:t xml:space="preserve"> opstarten</w:t>
+        <w:t>Start Node-RED automatisch bij opstarten</w:t>
       </w:r>
     </w:p>
+    <w:p/>
     <w:p>
       <w:pPr>
         <w:pStyle w:val="ListParagraph"/>
@@ -11161,6 +12702,111 @@
         </w:numPr>
       </w:pPr>
       <w:r>
+        <mc:AlternateContent>
+          <mc:Choice Requires="wps">
+            <w:drawing>
+              <wp:anchor distT="45720" distB="45720" distL="114300" distR="114300" simplePos="0" relativeHeight="251689984" behindDoc="0" locked="0" layoutInCell="1" allowOverlap="1" wp14:anchorId="00766AC3" wp14:editId="23820EA6">
+                <wp:simplePos x="0" y="0"/>
+                <wp:positionH relativeFrom="margin">
+                  <wp:posOffset>478155</wp:posOffset>
+                </wp:positionH>
+                <wp:positionV relativeFrom="paragraph">
+                  <wp:posOffset>224790</wp:posOffset>
+                </wp:positionV>
+                <wp:extent cx="1844040" cy="304800"/>
+                <wp:effectExtent l="0" t="0" r="22860" b="19050"/>
+                <wp:wrapTopAndBottom/>
+                <wp:docPr id="1860973823" name="Text Box 2"/>
+                <wp:cNvGraphicFramePr>
+                  <a:graphicFrameLocks xmlns:a="http://schemas.openxmlformats.org/drawingml/2006/main"/>
+                </wp:cNvGraphicFramePr>
+                <a:graphic xmlns:a="http://schemas.openxmlformats.org/drawingml/2006/main">
+                  <a:graphicData uri="http://schemas.microsoft.com/office/word/2010/wordprocessingShape">
+                    <wps:wsp>
+                      <wps:cNvSpPr txBox="1">
+                        <a:spLocks noChangeArrowheads="1"/>
+                      </wps:cNvSpPr>
+                      <wps:spPr bwMode="auto">
+                        <a:xfrm>
+                          <a:off x="0" y="0"/>
+                          <a:ext cx="1844040" cy="304800"/>
+                        </a:xfrm>
+                        <a:prstGeom prst="rect">
+                          <a:avLst/>
+                        </a:prstGeom>
+                        <a:solidFill>
+                          <a:srgbClr val="FFFFFF"/>
+                        </a:solidFill>
+                        <a:ln w="9525">
+                          <a:solidFill>
+                            <a:srgbClr val="000000"/>
+                          </a:solidFill>
+                          <a:miter lim="800000"/>
+                          <a:headEnd/>
+                          <a:tailEnd/>
+                        </a:ln>
+                      </wps:spPr>
+                      <wps:txbx>
+                        <w:txbxContent>
+                          <w:p>
+                            <w:pPr>
+                              <w:pStyle w:val="Code"/>
+                              <w:rPr>
+                                <w:lang w:val="nl-NL"/>
+                              </w:rPr>
+                            </w:pPr>
+                            <w:r>
+                              <w:rPr>
+                                <w:lang w:val="nl-NL"/>
+                              </w:rPr>
+                              <w:t>Node-red-start</w:t>
+                            </w:r>
+                          </w:p>
+                        </w:txbxContent>
+                      </wps:txbx>
+                      <wps:bodyPr rot="0" vert="horz" wrap="square" lIns="91440" tIns="45720" rIns="91440" bIns="45720" anchor="t" anchorCtr="0">
+                        <a:noAutofit/>
+                      </wps:bodyPr>
+                    </wps:wsp>
+                  </a:graphicData>
+                </a:graphic>
+                <wp14:sizeRelH relativeFrom="margin">
+                  <wp14:pctWidth>0</wp14:pctWidth>
+                </wp14:sizeRelH>
+                <wp14:sizeRelV relativeFrom="margin">
+                  <wp14:pctHeight>0</wp14:pctHeight>
+                </wp14:sizeRelV>
+              </wp:anchor>
+            </w:drawing>
+          </mc:Choice>
+          <mc:Fallback>
+            <w:pict>
+              <v:shape w14:anchorId="00766AC3" id="_x0000_s1063" type="#_x0000_t202" style="position:absolute;left:0;text-align:left;margin-left:37.65pt;margin-top:17.7pt;width:145.2pt;height:24pt;z-index:251689984;visibility:visible;mso-wrap-style:square;mso-width-percent:0;mso-height-percent:0;mso-wrap-distance-left:9pt;mso-wrap-distance-top:3.6pt;mso-wrap-distance-right:9pt;mso-wrap-distance-bottom:3.6pt;mso-position-horizontal:absolute;mso-position-horizontal-relative:margin;mso-position-vertical:absolute;mso-position-vertical-relative:text;mso-width-percent:0;mso-height-percent:0;mso-width-relative:margin;mso-height-relative:margin;v-text-anchor:top" o:gfxdata="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">
+                <v:textbox>
+                  <w:txbxContent>
+                    <w:p>
+                      <w:pPr>
+                        <w:pStyle w:val="Code"/>
+                        <w:rPr>
+                          <w:lang w:val="nl-NL"/>
+                        </w:rPr>
+                      </w:pPr>
+                      <w:r>
+                        <w:rPr>
+                          <w:lang w:val="nl-NL"/>
+                        </w:rPr>
+                        <w:t>Node-red-start</w:t>
+                      </w:r>
+                    </w:p>
+                  </w:txbxContent>
+                </v:textbox>
+                <w10:wrap type="topAndBottom" anchorx="margin"/>
+              </v:shape>
+            </w:pict>
+          </mc:Fallback>
+        </mc:AlternateContent>
+      </w:r>
+      <w:r>
         <w:t>Start Node-RED</w:t>
       </w:r>
     </w:p>
@@ -11173,19 +12819,16 @@
         </w:numPr>
       </w:pPr>
       <w:r>
-        <w:rPr>
-          <w:noProof/>
-        </w:rPr>
         <w:drawing>
-          <wp:anchor distT="0" distB="0" distL="114300" distR="114300" simplePos="0" relativeHeight="251737088" behindDoc="0" locked="0" layoutInCell="1" allowOverlap="1" wp14:anchorId="188BCF8D" wp14:editId="1B457FFD">
+          <wp:anchor distT="0" distB="0" distL="114300" distR="114300" simplePos="0" relativeHeight="251737088" behindDoc="0" locked="0" layoutInCell="1" allowOverlap="1" wp14:anchorId="188BCF8D" wp14:editId="0029F25C">
             <wp:simplePos x="0" y="0"/>
             <wp:positionH relativeFrom="margin">
               <wp:align>right</wp:align>
             </wp:positionH>
             <wp:positionV relativeFrom="paragraph">
-              <wp:posOffset>79375</wp:posOffset>
+              <wp:posOffset>541655</wp:posOffset>
             </wp:positionV>
-            <wp:extent cx="2275840" cy="2468658"/>
+            <wp:extent cx="2275840" cy="2468245"/>
             <wp:effectExtent l="133350" t="114300" r="124460" b="160655"/>
             <wp:wrapSquare wrapText="bothSides"/>
             <wp:docPr id="1379732609" name="Picture 1" descr="A screenshot of a computer&#10;&#10;AI-generated content may be incorrect."/>
@@ -11200,7 +12843,7 @@
                     <pic:cNvPicPr/>
                   </pic:nvPicPr>
                   <pic:blipFill>
-                    <a:blip r:embed="rId42">
+                    <a:blip r:embed="rId44">
                       <a:extLst>
                         <a:ext uri="{28A0092B-C50C-407E-A947-70E740481C1C}">
                           <a14:useLocalDpi xmlns:a14="http://schemas.microsoft.com/office/drawing/2010/main" val="0"/>
@@ -11214,7 +12857,7 @@
                   <pic:spPr>
                     <a:xfrm>
                       <a:off x="0" y="0"/>
-                      <a:ext cx="2275840" cy="2468658"/>
+                      <a:ext cx="2275840" cy="2468245"/>
                     </a:xfrm>
                     <a:prstGeom prst="rect">
                       <a:avLst/>
@@ -11299,6 +12942,15 @@
         <w:t>node-red-node-mysql</w:t>
       </w:r>
     </w:p>
+    <w:p/>
+    <w:p/>
+    <w:p/>
+    <w:p/>
+    <w:p/>
+    <w:p/>
+    <w:p/>
+    <w:p/>
+    <w:p/>
     <w:p>
       <w:pPr>
         <w:pStyle w:val="ListParagraph"/>
@@ -11308,18 +12960,14 @@
         </w:numPr>
       </w:pPr>
       <w:r>
-        <w:rPr>
-          <w:noProof/>
-        </w:rPr>
-        <w:lastRenderedPageBreak/>
         <w:drawing>
-          <wp:anchor distT="0" distB="0" distL="114300" distR="114300" simplePos="0" relativeHeight="251709440" behindDoc="0" locked="0" layoutInCell="1" allowOverlap="1" wp14:anchorId="08801812" wp14:editId="0B66C607">
+          <wp:anchor distT="0" distB="0" distL="114300" distR="114300" simplePos="0" relativeHeight="251709440" behindDoc="0" locked="0" layoutInCell="1" allowOverlap="1" wp14:anchorId="08801812" wp14:editId="335D4D2C">
             <wp:simplePos x="0" y="0"/>
             <wp:positionH relativeFrom="margin">
               <wp:align>center</wp:align>
             </wp:positionH>
             <wp:positionV relativeFrom="paragraph">
-              <wp:posOffset>278130</wp:posOffset>
+              <wp:posOffset>282152</wp:posOffset>
             </wp:positionV>
             <wp:extent cx="5012055" cy="1858645"/>
             <wp:effectExtent l="133350" t="114300" r="150495" b="160655"/>
@@ -11336,7 +12984,7 @@
                     <pic:cNvPicPr/>
                   </pic:nvPicPr>
                   <pic:blipFill>
-                    <a:blip r:embed="rId43">
+                    <a:blip r:embed="rId45">
                       <a:extLst>
                         <a:ext uri="{28A0092B-C50C-407E-A947-70E740481C1C}">
                           <a14:useLocalDpi xmlns:a14="http://schemas.microsoft.com/office/drawing/2010/main" val="0"/>
@@ -11411,20 +13059,18 @@
         </w:numPr>
       </w:pPr>
       <w:r>
-        <w:rPr>
-          <w:noProof/>
-        </w:rPr>
+        <w:lastRenderedPageBreak/>
         <w:drawing>
-          <wp:anchor distT="0" distB="0" distL="114300" distR="114300" simplePos="0" relativeHeight="251738112" behindDoc="0" locked="0" layoutInCell="1" allowOverlap="1" wp14:anchorId="39BC8E3F" wp14:editId="562C2320">
+          <wp:anchor distT="0" distB="0" distL="114300" distR="114300" simplePos="0" relativeHeight="251738112" behindDoc="0" locked="0" layoutInCell="1" allowOverlap="1" wp14:anchorId="39BC8E3F" wp14:editId="2B767500">
             <wp:simplePos x="0" y="0"/>
             <wp:positionH relativeFrom="margin">
               <wp:align>center</wp:align>
             </wp:positionH>
             <wp:positionV relativeFrom="paragraph">
-              <wp:posOffset>2600325</wp:posOffset>
+              <wp:posOffset>471805</wp:posOffset>
             </wp:positionV>
-            <wp:extent cx="3469640" cy="2952750"/>
-            <wp:effectExtent l="152400" t="114300" r="149860" b="171450"/>
+            <wp:extent cx="3046095" cy="2592070"/>
+            <wp:effectExtent l="152400" t="114300" r="135255" b="170180"/>
             <wp:wrapTopAndBottom/>
             <wp:docPr id="1463470067" name="Picture 1" descr="A screenshot of a computer&#10;&#10;AI-generated content may be incorrect."/>
             <wp:cNvGraphicFramePr>
@@ -11438,7 +13084,7 @@
                     <pic:cNvPicPr/>
                   </pic:nvPicPr>
                   <pic:blipFill>
-                    <a:blip r:embed="rId44">
+                    <a:blip r:embed="rId46">
                       <a:extLst>
                         <a:ext uri="{28A0092B-C50C-407E-A947-70E740481C1C}">
                           <a14:useLocalDpi xmlns:a14="http://schemas.microsoft.com/office/drawing/2010/main" val="0"/>
@@ -11452,7 +13098,7 @@
                   <pic:spPr>
                     <a:xfrm>
                       <a:off x="0" y="0"/>
-                      <a:ext cx="3469640" cy="2952750"/>
+                      <a:ext cx="3046095" cy="2592070"/>
                     </a:xfrm>
                     <a:prstGeom prst="rect">
                       <a:avLst/>
@@ -11522,17 +13168,43 @@
         </w:numPr>
       </w:pPr>
       <w:r>
-        <w:rPr>
-          <w:noProof/>
-        </w:rPr>
+        <w:t>Voeg de Telegram bot token en chat id</w:t>
+      </w:r>
+      <w:r>
+        <w:t>’s</w:t>
+      </w:r>
+      <w:r>
+        <w:t xml:space="preserve"> toe van de volgende stap (</w:t>
+      </w:r>
+      <w:r>
+        <w:fldChar w:fldCharType="begin"/>
+      </w:r>
+      <w:r>
+        <w:instrText xml:space="preserve"> REF _Ref199322619 \h </w:instrText>
+      </w:r>
+      <w:r>
+        <w:fldChar w:fldCharType="separate"/>
+      </w:r>
+      <w:r>
+        <w:t>Telegram</w:t>
+      </w:r>
+      <w:r>
+        <w:fldChar w:fldCharType="end"/>
+      </w:r>
+      <w:r>
+        <w:t>)</w:t>
+      </w:r>
+    </w:p>
+    <w:p>
+      <w:r>
         <w:drawing>
-          <wp:anchor distT="0" distB="0" distL="114300" distR="114300" simplePos="0" relativeHeight="251754496" behindDoc="0" locked="0" layoutInCell="1" allowOverlap="1" wp14:anchorId="1BB278CC" wp14:editId="09E768FE">
+          <wp:anchor distT="0" distB="0" distL="114300" distR="114300" simplePos="0" relativeHeight="251754496" behindDoc="0" locked="0" layoutInCell="1" allowOverlap="1" wp14:anchorId="1BB278CC" wp14:editId="45B93253">
             <wp:simplePos x="0" y="0"/>
             <wp:positionH relativeFrom="margin">
               <wp:align>center</wp:align>
             </wp:positionH>
             <wp:positionV relativeFrom="paragraph">
-              <wp:posOffset>3451860</wp:posOffset>
+              <wp:posOffset>24553</wp:posOffset>
             </wp:positionV>
             <wp:extent cx="4223888" cy="2677250"/>
             <wp:effectExtent l="0" t="0" r="5715" b="8890"/>
@@ -11549,7 +13221,7 @@
                     <pic:cNvPicPr/>
                   </pic:nvPicPr>
                   <pic:blipFill>
-                    <a:blip r:embed="rId45">
+                    <a:blip r:embed="rId47">
                       <a:extLst>
                         <a:ext uri="{28A0092B-C50C-407E-A947-70E740481C1C}">
                           <a14:useLocalDpi xmlns:a14="http://schemas.microsoft.com/office/drawing/2010/main" val="0"/>
@@ -11581,33 +13253,6 @@
           </wp:anchor>
         </w:drawing>
       </w:r>
-      <w:r>
-        <w:t>Voeg de Telegram bot token en chat id</w:t>
-      </w:r>
-      <w:r>
-        <w:t>’s</w:t>
-      </w:r>
-      <w:r>
-        <w:t xml:space="preserve"> toe van de volgende stap (</w:t>
-      </w:r>
-      <w:r>
-        <w:fldChar w:fldCharType="begin"/>
-      </w:r>
-      <w:r>
-        <w:instrText xml:space="preserve"> REF _Ref199322619 \h </w:instrText>
-      </w:r>
-      <w:r>
-        <w:fldChar w:fldCharType="separate"/>
-      </w:r>
-      <w:r>
-        <w:t>Telegram</w:t>
-      </w:r>
-      <w:r>
-        <w:fldChar w:fldCharType="end"/>
-      </w:r>
-      <w:r>
-        <w:t>)</w:t>
-      </w:r>
     </w:p>
     <w:p/>
     <w:p/>
@@ -11624,9 +13269,6 @@
       <w:bookmarkStart w:id="20" w:name="_Toc199317608"/>
       <w:bookmarkStart w:id="21" w:name="_Ref199322619"/>
       <w:r>
-        <w:rPr>
-          <w:noProof/>
-        </w:rPr>
         <w:lastRenderedPageBreak/>
         <w:drawing>
           <wp:anchor distT="0" distB="0" distL="114300" distR="114300" simplePos="0" relativeHeight="251741184" behindDoc="1" locked="0" layoutInCell="1" allowOverlap="1" wp14:anchorId="23C9E24A" wp14:editId="157B4576">
@@ -11652,7 +13294,7 @@
                     <pic:cNvPicPr/>
                   </pic:nvPicPr>
                   <pic:blipFill>
-                    <a:blip r:embed="rId46">
+                    <a:blip r:embed="rId48">
                       <a:extLst>
                         <a:ext uri="{28A0092B-C50C-407E-A947-70E740481C1C}">
                           <a14:useLocalDpi xmlns:a14="http://schemas.microsoft.com/office/drawing/2010/main" val="0"/>
@@ -11799,9 +13441,6 @@
       </w:pPr>
       <w:bookmarkStart w:id="22" w:name="_Toc199317609"/>
       <w:r>
-        <w:rPr>
-          <w:noProof/>
-        </w:rPr>
         <w:drawing>
           <wp:anchor distT="0" distB="0" distL="114300" distR="114300" simplePos="0" relativeHeight="251732992" behindDoc="0" locked="0" layoutInCell="1" allowOverlap="1" wp14:anchorId="42719814" wp14:editId="55ED5953">
             <wp:simplePos x="0" y="0"/>
@@ -11828,7 +13467,7 @@
                     </pic:cNvPicPr>
                   </pic:nvPicPr>
                   <pic:blipFill>
-                    <a:blip r:embed="rId47">
+                    <a:blip r:embed="rId49">
                       <a:extLst>
                         <a:ext uri="{28A0092B-C50C-407E-A947-70E740481C1C}">
                           <a14:useLocalDpi xmlns:a14="http://schemas.microsoft.com/office/drawing/2010/main" val="0"/>
@@ -12001,9 +13640,6 @@
         </w:numPr>
       </w:pPr>
       <w:r>
-        <w:rPr>
-          <w:noProof/>
-        </w:rPr>
         <w:drawing>
           <wp:anchor distT="0" distB="0" distL="114300" distR="114300" simplePos="0" relativeHeight="251734016" behindDoc="0" locked="0" layoutInCell="1" allowOverlap="1" wp14:anchorId="1CDA12FD" wp14:editId="56F6741B">
             <wp:simplePos x="0" y="0"/>
@@ -12028,7 +13664,7 @@
                     <pic:cNvPicPr/>
                   </pic:nvPicPr>
                   <pic:blipFill>
-                    <a:blip r:embed="rId48">
+                    <a:blip r:embed="rId50">
                       <a:extLst>
                         <a:ext uri="{28A0092B-C50C-407E-A947-70E740481C1C}">
                           <a14:useLocalDpi xmlns:a14="http://schemas.microsoft.com/office/drawing/2010/main" val="0"/>
@@ -12094,15 +13730,7 @@
         <w:t xml:space="preserve">Upload de </w:t>
       </w:r>
       <w:r>
-        <w:t xml:space="preserve">code </w:t>
-      </w:r>
-      <w:proofErr w:type="spellStart"/>
-      <w:r>
-        <w:t>naar</w:t>
-      </w:r>
-      <w:proofErr w:type="spellEnd"/>
-      <w:r>
-        <w:t xml:space="preserve"> de microcontroller</w:t>
+        <w:t>code naar de microcontroller</w:t>
       </w:r>
     </w:p>
     <w:p/>
@@ -12111,9 +13739,6 @@
     <w:p/>
     <w:p>
       <w:r>
-        <w:rPr>
-          <w:noProof/>
-        </w:rPr>
         <mc:AlternateContent>
           <mc:Choice Requires="wpi">
             <w:drawing>
@@ -12132,7 +13757,7 @@
                 <wp:cNvGraphicFramePr/>
                 <a:graphic xmlns:a="http://schemas.openxmlformats.org/drawingml/2006/main">
                   <a:graphicData uri="http://schemas.microsoft.com/office/word/2010/wordprocessingInk">
-                    <w14:contentPart bwMode="auto" r:id="rId49">
+                    <w14:contentPart bwMode="auto" r:id="rId51">
                       <w14:nvContentPartPr>
                         <w14:cNvContentPartPr/>
                       </w14:nvContentPartPr>
@@ -12171,7 +13796,7 @@
                 <o:lock v:ext="edit" aspectratio="t"/>
               </v:shapetype>
               <v:shape id="Ink 8" o:spid="_x0000_s1026" type="#_x0000_t75" style="position:absolute;margin-left:282.8pt;margin-top:9.35pt;width:55.35pt;height:10pt;z-index:251758592;visibility:visible;mso-wrap-style:square;mso-width-percent:0;mso-wrap-distance-left:9pt;mso-wrap-distance-top:0;mso-wrap-distance-right:9pt;mso-wrap-distance-bottom:0;mso-position-horizontal:absolute;mso-position-horizontal-relative:text;mso-position-vertical:absolute;mso-position-vertical-relative:text;mso-width-percent:0;mso-width-relative:margin" o:gfxdata="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">
-                <v:imagedata r:id="rId50" o:title=""/>
+                <v:imagedata r:id="rId52" o:title=""/>
               </v:shape>
             </w:pict>
           </mc:Fallback>
@@ -12265,9 +13890,6 @@
     </w:p>
     <w:p>
       <w:r>
-        <w:rPr>
-          <w:noProof/>
-        </w:rPr>
         <w:drawing>
           <wp:anchor distT="0" distB="0" distL="114300" distR="114300" simplePos="0" relativeHeight="251736064" behindDoc="0" locked="0" layoutInCell="1" allowOverlap="1" wp14:anchorId="0D28C42A" wp14:editId="1F71CA2C">
             <wp:simplePos x="0" y="0"/>
@@ -12292,7 +13914,7 @@
                     <pic:cNvPicPr/>
                   </pic:nvPicPr>
                   <pic:blipFill rotWithShape="1">
-                    <a:blip r:embed="rId51">
+                    <a:blip r:embed="rId53">
                       <a:extLst>
                         <a:ext uri="{28A0092B-C50C-407E-A947-70E740481C1C}">
                           <a14:useLocalDpi xmlns:a14="http://schemas.microsoft.com/office/drawing/2010/main" val="0"/>
@@ -12356,30 +13978,14 @@
         <w:t>De</w:t>
       </w:r>
       <w:r>
+        <w:t xml:space="preserve"> formulieren maken het eenvoudig </w:t>
+      </w:r>
+      <w:r>
+        <w:t>om</w:t>
+      </w:r>
+      <w:r>
         <w:t xml:space="preserve"> </w:t>
       </w:r>
-      <w:proofErr w:type="spellStart"/>
-      <w:r>
-        <w:t>formulieren</w:t>
-      </w:r>
-      <w:proofErr w:type="spellEnd"/>
-      <w:r>
-        <w:t xml:space="preserve"> </w:t>
-      </w:r>
-      <w:proofErr w:type="spellStart"/>
-      <w:r>
-        <w:t>maken</w:t>
-      </w:r>
-      <w:proofErr w:type="spellEnd"/>
-      <w:r>
-        <w:t xml:space="preserve"> het eenvoudig </w:t>
-      </w:r>
-      <w:r>
-        <w:t>om</w:t>
-      </w:r>
-      <w:r>
-        <w:t xml:space="preserve"> </w:t>
-      </w:r>
       <w:r>
         <w:t>gebruikers, deure</w:t>
       </w:r>
@@ -12390,21 +13996,8 @@
         <w:t>maken het h</w:t>
       </w:r>
       <w:r>
-        <w:t xml:space="preserve">ele </w:t>
-      </w:r>
-      <w:proofErr w:type="spellStart"/>
-      <w:r>
-        <w:t>proces</w:t>
-      </w:r>
-      <w:proofErr w:type="spellEnd"/>
-      <w:r>
-        <w:t xml:space="preserve"> heel </w:t>
-      </w:r>
-      <w:proofErr w:type="spellStart"/>
-      <w:r>
-        <w:t>gebruiksvriendelijk</w:t>
-      </w:r>
-      <w:proofErr w:type="spellEnd"/>
+        <w:t>ele proces heel gebruiksvriendelijk</w:t>
+      </w:r>
       <w:r>
         <w:t>.</w:t>
       </w:r>
@@ -12413,9 +14006,6 @@
     <w:p/>
     <w:p>
       <w:r>
-        <w:rPr>
-          <w:noProof/>
-        </w:rPr>
         <w:lastRenderedPageBreak/>
         <w:drawing>
           <wp:anchor distT="0" distB="0" distL="114300" distR="114300" simplePos="0" relativeHeight="251749376" behindDoc="0" locked="0" layoutInCell="1" allowOverlap="1" wp14:anchorId="693F21AE" wp14:editId="68A937E4">
@@ -12441,7 +14031,7 @@
                     <pic:cNvPicPr/>
                   </pic:nvPicPr>
                   <pic:blipFill>
-                    <a:blip r:embed="rId52">
+                    <a:blip r:embed="rId54">
                       <a:extLst>
                         <a:ext uri="{28A0092B-C50C-407E-A947-70E740481C1C}">
                           <a14:useLocalDpi xmlns:a14="http://schemas.microsoft.com/office/drawing/2010/main" val="0"/>
@@ -12501,23 +14091,7 @@
         <w:t>De</w:t>
       </w:r>
       <w:r>
-        <w:t xml:space="preserve"> </w:t>
-      </w:r>
-      <w:proofErr w:type="spellStart"/>
-      <w:r>
-        <w:t>toegangstabel</w:t>
-      </w:r>
-      <w:proofErr w:type="spellEnd"/>
-      <w:r>
-        <w:t xml:space="preserve"> </w:t>
-      </w:r>
-      <w:proofErr w:type="spellStart"/>
-      <w:r>
-        <w:t>maakt</w:t>
-      </w:r>
-      <w:proofErr w:type="spellEnd"/>
-      <w:r>
-        <w:t xml:space="preserve"> het eenvoudig om gebruikers </w:t>
+        <w:t xml:space="preserve"> toegangstabel maakt het eenvoudig om gebruikers </w:t>
       </w:r>
       <w:r>
         <w:t xml:space="preserve">toegang te verlenen </w:t>
@@ -12560,13 +14134,7 @@
         <w:t xml:space="preserve">De Node-RED Editor is waar alle </w:t>
       </w:r>
       <w:r>
-        <w:t xml:space="preserve">logica </w:t>
-      </w:r>
-      <w:r>
-        <w:t xml:space="preserve">van </w:t>
-      </w:r>
-      <w:r>
-        <w:t>de</w:t>
+        <w:t>logica van de</w:t>
       </w:r>
       <w:r>
         <w:t xml:space="preserve"> microcontroller(s) </w:t>
@@ -12598,9 +14166,6 @@
         </w:rPr>
       </w:pPr>
       <w:r>
-        <w:rPr>
-          <w:noProof/>
-        </w:rPr>
         <w:drawing>
           <wp:anchor distT="0" distB="0" distL="114300" distR="114300" simplePos="0" relativeHeight="251731968" behindDoc="0" locked="0" layoutInCell="1" allowOverlap="1" wp14:anchorId="15A1ED7B" wp14:editId="71E4A32B">
             <wp:simplePos x="0" y="0"/>
@@ -12625,7 +14190,7 @@
                     <pic:cNvPicPr/>
                   </pic:nvPicPr>
                   <pic:blipFill>
-                    <a:blip r:embed="rId53">
+                    <a:blip r:embed="rId55">
                       <a:extLst>
                         <a:ext uri="{28A0092B-C50C-407E-A947-70E740481C1C}">
                           <a14:useLocalDpi xmlns:a14="http://schemas.microsoft.com/office/drawing/2010/main" val="0"/>
@@ -12697,9 +14262,6 @@
     </w:p>
     <w:p>
       <w:r>
-        <w:rPr>
-          <w:noProof/>
-        </w:rPr>
         <mc:AlternateContent>
           <mc:Choice Requires="wpi">
             <w:drawing>
@@ -12718,7 +14280,7 @@
                 <wp:cNvGraphicFramePr/>
                 <a:graphic xmlns:a="http://schemas.openxmlformats.org/drawingml/2006/main">
                   <a:graphicData uri="http://schemas.microsoft.com/office/word/2010/wordprocessingInk">
-                    <w14:contentPart bwMode="auto" r:id="rId54">
+                    <w14:contentPart bwMode="auto" r:id="rId56">
                       <w14:nvContentPartPr>
                         <w14:cNvContentPartPr/>
                       </w14:nvContentPartPr>
@@ -12738,16 +14300,13 @@
           <mc:Fallback>
             <w:pict>
               <v:shape w14:anchorId="67D6022B" id="Ink 2" o:spid="_x0000_s1026" type="#_x0000_t75" style="position:absolute;margin-left:241.95pt;margin-top:85.5pt;width:161.2pt;height:10pt;z-index:251753472;visibility:visible;mso-wrap-style:square;mso-width-percent:0;mso-wrap-distance-left:9pt;mso-wrap-distance-top:0;mso-wrap-distance-right:9pt;mso-wrap-distance-bottom:0;mso-position-horizontal:absolute;mso-position-horizontal-relative:text;mso-position-vertical:absolute;mso-position-vertical-relative:text;mso-width-percent:0;mso-width-relative:margin" o:gfxdata="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">
-                <v:imagedata r:id="rId55" o:title=""/>
+                <v:imagedata r:id="rId57" o:title=""/>
               </v:shape>
             </w:pict>
           </mc:Fallback>
         </mc:AlternateContent>
       </w:r>
       <w:r>
-        <w:rPr>
-          <w:noProof/>
-        </w:rPr>
         <mc:AlternateContent>
           <mc:Choice Requires="wpi">
             <w:drawing>
@@ -12766,7 +14325,7 @@
                 <wp:cNvGraphicFramePr/>
                 <a:graphic xmlns:a="http://schemas.openxmlformats.org/drawingml/2006/main">
                   <a:graphicData uri="http://schemas.microsoft.com/office/word/2010/wordprocessingInk">
-                    <w14:contentPart bwMode="auto" r:id="rId56">
+                    <w14:contentPart bwMode="auto" r:id="rId58">
                       <w14:nvContentPartPr>
                         <w14:cNvContentPartPr/>
                       </w14:nvContentPartPr>
@@ -12786,7 +14345,7 @@
           <mc:Fallback>
             <w:pict>
               <v:shape w14:anchorId="411F9EDE" id="Ink 2" o:spid="_x0000_s1026" type="#_x0000_t75" style="position:absolute;margin-left:205.9pt;margin-top:119.45pt;width:34.05pt;height:10pt;z-index:251751424;visibility:visible;mso-wrap-style:square;mso-width-percent:0;mso-wrap-distance-left:9pt;mso-wrap-distance-top:0;mso-wrap-distance-right:9pt;mso-wrap-distance-bottom:0;mso-position-horizontal:absolute;mso-position-horizontal-relative:text;mso-position-vertical:absolute;mso-position-vertical-relative:text;mso-width-percent:0;mso-width-relative:margin" o:gfxdata="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">
-                <v:imagedata r:id="rId57" o:title=""/>
+                <v:imagedata r:id="rId59" o:title=""/>
               </v:shape>
             </w:pict>
           </mc:Fallback>
@@ -12844,7 +14403,7 @@
           <w:numId w:val="14"/>
         </w:numPr>
       </w:pPr>
-      <w:hyperlink r:id="rId58" w:history="1">
+      <w:hyperlink r:id="rId60" w:history="1">
         <w:r>
           <w:rPr>
             <w:rStyle w:val="Hyperlink"/>
@@ -12864,7 +14423,7 @@
           <w:numId w:val="14"/>
         </w:numPr>
       </w:pPr>
-      <w:hyperlink r:id="rId59" w:history="1">
+      <w:hyperlink r:id="rId61" w:history="1">
         <w:r>
           <w:rPr>
             <w:rStyle w:val="Hyperlink"/>
@@ -12884,7 +14443,7 @@
           <w:numId w:val="14"/>
         </w:numPr>
       </w:pPr>
-      <w:hyperlink r:id="rId60" w:history="1">
+      <w:hyperlink r:id="rId62" w:history="1">
         <w:r>
           <w:rPr>
             <w:rStyle w:val="Hyperlink"/>
@@ -12904,7 +14463,7 @@
           <w:numId w:val="14"/>
         </w:numPr>
       </w:pPr>
-      <w:hyperlink r:id="rId61" w:history="1">
+      <w:hyperlink r:id="rId63" w:history="1">
         <w:r>
           <w:rPr>
             <w:rStyle w:val="Hyperlink"/>
@@ -12924,7 +14483,7 @@
           <w:numId w:val="14"/>
         </w:numPr>
       </w:pPr>
-      <w:hyperlink r:id="rId62" w:history="1">
+      <w:hyperlink r:id="rId64" w:history="1">
         <w:r>
           <w:rPr>
             <w:rStyle w:val="Hyperlink"/>
@@ -12944,7 +14503,7 @@
           <w:numId w:val="14"/>
         </w:numPr>
       </w:pPr>
-      <w:hyperlink r:id="rId63" w:history="1">
+      <w:hyperlink r:id="rId65" w:history="1">
         <w:r>
           <w:rPr>
             <w:rStyle w:val="Hyperlink"/>
@@ -12964,7 +14523,7 @@
           <w:numId w:val="14"/>
         </w:numPr>
       </w:pPr>
-      <w:hyperlink r:id="rId64" w:history="1">
+      <w:hyperlink r:id="rId66" w:history="1">
         <w:r>
           <w:rPr>
             <w:rStyle w:val="Hyperlink"/>
@@ -12984,7 +14543,7 @@
           <w:numId w:val="14"/>
         </w:numPr>
       </w:pPr>
-      <w:hyperlink r:id="rId65" w:history="1">
+      <w:hyperlink r:id="rId67" w:history="1">
         <w:r>
           <w:rPr>
             <w:rStyle w:val="Hyperlink"/>
@@ -12999,7 +14558,7 @@
     <w:p/>
     <w:p/>
     <w:sectPr>
-      <w:footerReference w:type="default" r:id="rId66"/>
+      <w:footerReference w:type="default" r:id="rId68"/>
       <w:pgSz w:w="11906" w:h="16838"/>
       <w:pgMar w:top="1440" w:right="1440" w:bottom="1440" w:left="1440" w:header="708" w:footer="708" w:gutter="0"/>
       <w:pgNumType w:start="0"/>
@@ -16712,6 +18271,9 @@
     <w:name w:val="Normal"/>
     <w:qFormat/>
     <w:rsid w:val="00BE1B9B"/>
+    <w:rPr>
+      <w:lang w:val="nl-NL"/>
+    </w:rPr>
   </w:style>
   <w:style w:type="paragraph" w:styleId="Heading1">
     <w:name w:val="heading 1"/>
@@ -17767,6 +19329,78 @@
       </w:tcPr>
     </w:tblStylePr>
   </w:style>
+  <w:style w:type="table" w:styleId="GridTable6Colorful-Accent1">
+    <w:name w:val="Grid Table 6 Colorful Accent 1"/>
+    <w:basedOn w:val="TableNormal"/>
+    <w:uiPriority w:val="51"/>
+    <w:rsid w:val="006B2FF6"/>
+    <w:pPr>
+      <w:spacing w:after="0" w:line="240" w:lineRule="auto"/>
+    </w:pPr>
+    <w:rPr>
+      <w:color w:val="032348" w:themeColor="accent1" w:themeShade="BF"/>
+    </w:rPr>
+    <w:tblPr>
+      <w:tblStyleRowBandSize w:val="1"/>
+      <w:tblStyleColBandSize w:val="1"/>
+      <w:tblBorders>
+        <w:top w:val="single" w:sz="4" w:space="0" w:color="167AF3" w:themeColor="accent1" w:themeTint="99"/>
+        <w:left w:val="single" w:sz="4" w:space="0" w:color="167AF3" w:themeColor="accent1" w:themeTint="99"/>
+        <w:bottom w:val="single" w:sz="4" w:space="0" w:color="167AF3" w:themeColor="accent1" w:themeTint="99"/>
+        <w:right w:val="single" w:sz="4" w:space="0" w:color="167AF3" w:themeColor="accent1" w:themeTint="99"/>
+        <w:insideH w:val="single" w:sz="4" w:space="0" w:color="167AF3" w:themeColor="accent1" w:themeTint="99"/>
+        <w:insideV w:val="single" w:sz="4" w:space="0" w:color="167AF3" w:themeColor="accent1" w:themeTint="99"/>
+      </w:tblBorders>
+    </w:tblPr>
+    <w:tblStylePr w:type="firstRow">
+      <w:rPr>
+        <w:b/>
+        <w:bCs/>
+      </w:rPr>
+      <w:tblPr/>
+      <w:tcPr>
+        <w:tcBorders>
+          <w:bottom w:val="single" w:sz="12" w:space="0" w:color="167AF3" w:themeColor="accent1" w:themeTint="99"/>
+        </w:tcBorders>
+      </w:tcPr>
+    </w:tblStylePr>
+    <w:tblStylePr w:type="lastRow">
+      <w:rPr>
+        <w:b/>
+        <w:bCs/>
+      </w:rPr>
+      <w:tblPr/>
+      <w:tcPr>
+        <w:tcBorders>
+          <w:top w:val="double" w:sz="4" w:space="0" w:color="167AF3" w:themeColor="accent1" w:themeTint="99"/>
+        </w:tcBorders>
+      </w:tcPr>
+    </w:tblStylePr>
+    <w:tblStylePr w:type="firstCol">
+      <w:rPr>
+        <w:b/>
+        <w:bCs/>
+      </w:rPr>
+    </w:tblStylePr>
+    <w:tblStylePr w:type="lastCol">
+      <w:rPr>
+        <w:b/>
+        <w:bCs/>
+      </w:rPr>
+    </w:tblStylePr>
+    <w:tblStylePr w:type="band1Vert">
+      <w:tblPr/>
+      <w:tcPr>
+        <w:shd w:val="clear" w:color="auto" w:fill="B1D2FB" w:themeFill="accent1" w:themeFillTint="33"/>
+      </w:tcPr>
+    </w:tblStylePr>
+    <w:tblStylePr w:type="band1Horz">
+      <w:tblPr/>
+      <w:tcPr>
+        <w:shd w:val="clear" w:color="auto" w:fill="B1D2FB" w:themeFill="accent1" w:themeFillTint="33"/>
+      </w:tcPr>
+    </w:tblStylePr>
+  </w:style>
 </w:styles>
 </file>
 

</xml_diff>